<commit_message>
Remove Bitsafe payout integration
</commit_message>
<xml_diff>
--- a/docs/legal/MyDancr-Legal-Review-Packet.docx
+++ b/docs/legal/MyDancr-Legal-Review-Packet.docx
@@ -414,10 +414,10 @@
               <w:rPr>
                 <w:b/>
               </w:rPr>
-              <w:t>Bitsafe/Yoursafe</w:t>
+              <w:t>approved payout provider</w:t>
             </w:r>
             <w:r>
-              <w:t xml:space="preserve"> provides dancer and authorized-agent commission payout accounts and transfers. “Bitsafe/Yoursafe” means the Bitsafe-branded or successor Yoursafe payment-account service operated by Yoursafe B.V., as applicable to the contracted integration. Provider terms, privacy notices, geographic availability, and legal entity must be verified against the signed production contracts before publication.</w:t>
+              <w:t xml:space="preserve"> provides dancer and authorized-agent commission payout accounts and transfers. “approved payout provider” means the approved provider-branded or successor approved provider payment-account service operated by the selected provider's contracted legal entity, as applicable to the contracted integration. Provider terms, privacy notices, geographic availability, and legal entity must be verified against the signed production contracts before publication.</w:t>
             </w:r>
           </w:p>
         </w:tc>
@@ -798,7 +798,7 @@
         <w:t>Payouts:</w:t>
       </w:r>
       <w:r>
-        <w:t xml:space="preserve"> dancer and authorized-agent commission payouts are processed through Bitsafe/Yoursafe. Payees must open and maintain an eligible Bitsafe/Yoursafe account, pass the provider’s KYC and compliance checks, and ensure that MyDancr and provider records match.</w:t>
+        <w:t xml:space="preserve"> dancer and authorized-agent commission payouts are processed through approved payout provider. Payees must open and maintain an eligible approved payout provider account, pass the provider’s KYC and compliance checks, and ensure that MyDancr and provider records match.</w:t>
       </w:r>
     </w:p>
     <w:p>
@@ -882,7 +882,7 @@
         <w:pStyle w:val="ListNumber"/>
       </w:pPr>
       <w:r>
-        <w:t>Approve the Bitsafe/Yoursafe business and sponsor-management configuration, beneficiary onboarding, payout cadence, minimum threshold, reserves/holds, rejected-payment procedure, inactivity treatment, fees, supported countries/currencies, sanctions screening, tax-document workflow, complaints path, and unclaimed-property handling.</w:t>
+        <w:t>Approve the approved payout provider business and sponsor-management configuration, beneficiary onboarding, payout cadence, minimum threshold, reserves/holds, rejected-payment procedure, inactivity treatment, fees, supported countries/currencies, sanctions screening, tax-document workflow, complaints path, and unclaimed-property handling.</w:t>
       </w:r>
     </w:p>
     <w:p>
@@ -1260,7 +1260,7 @@
     </w:p>
     <w:p>
       <w:r>
-        <w:t>Payouts to dancers and, if launched, separately authorized agents are sent through Bitsafe/Yoursafe. MyDancr should store the Bitsafe/Yoursafe beneficiary or account identifier, onboarding state, eligibility state, last error, and transfer references, but not full payment-account credentials. Bitsafe/Yoursafe may collect identity, address, tax, sanctions, source-of-funds, payment-account, device, and transaction data under its own terms. Payees remain responsible for accurate matching information, maintaining an eligible account, and fees/taxes allocated to them in the applicable agreement.</w:t>
+        <w:t>Payouts to dancers and, if launched, separately authorized agents are sent through approved payout provider. MyDancr should store the approved payout provider beneficiary or account identifier, onboarding state, eligibility state, last error, and transfer references, but not full payment-account credentials. approved payout provider may collect identity, address, tax, sanctions, source-of-funds, payment-account, device, and transaction data under its own terms. Payees remain responsible for accurate matching information, maintaining an eligible account, and fees/taxes allocated to them in the applicable agreement.</w:t>
       </w:r>
     </w:p>
     <w:p>
@@ -1273,7 +1273,7 @@
     </w:p>
     <w:p>
       <w:r>
-        <w:t>No agent program should be inferred from a club team role or customer referral. If activated, the agent model should use: an administrator-approved agent record; a written agreement and commission order; Yoti verification appropriate to the agent; verified business, sanctions, and tax status; Bitsafe/Yoursafe payout readiness; a defined club or transaction attribution; a start/end date; a fixed rate or formula; and an immutable commission event created only after the qualifying verified event.</w:t>
+        <w:t>No agent program should be inferred from a club team role or customer referral. If activated, the agent model should use: an administrator-approved agent record; a written agreement and commission order; Yoti verification appropriate to the agent; verified business, sanctions, and tax status; approved payout provider payout readiness; a defined club or transaction attribution; a start/end date; a fixed rate or formula; and an immutable commission event created only after the qualifying verified event.</w:t>
       </w:r>
     </w:p>
     <w:p>
@@ -1477,7 +1477,7 @@
         <w:rPr>
           <w:b/>
         </w:rPr>
-        <w:t>Bitsafe/Yoursafe:</w:t>
+        <w:t>approved payout provider:</w:t>
       </w:r>
       <w:r>
         <w:t xml:space="preserve"> beneficiary payment-account onboarding, KYC/AML, account status, payout execution, fees, reserves/holds, failures, transaction history, and compliance. The contracted legal entity, sponsor-management flow, supported countries, and price schedule must match production.</w:t>
@@ -3133,7 +3133,7 @@
               <w:rPr>
                 <w:sz w:val="14"/>
               </w:rPr>
-              <w:t>Payee identity, Bitsafe/Yoursafe beneficiary ID, amount, tax/compliance state</w:t>
+              <w:t>Payee identity, approved payout provider beneficiary ID, amount, tax/compliance state</w:t>
             </w:r>
           </w:p>
         </w:tc>
@@ -3155,7 +3155,7 @@
               <w:rPr>
                 <w:sz w:val="14"/>
               </w:rPr>
-              <w:t>Bitsafe/Yoursafe executes, holds, or rejects transfer</w:t>
+              <w:t>approved payout provider executes, holds, or rejects transfer</w:t>
             </w:r>
           </w:p>
         </w:tc>
@@ -3942,7 +3942,7 @@
     </w:p>
     <w:p>
       <w:r>
-        <w:t>Customer use of a Club Deal does not authorize MyDancr to charge the customer unless a separate purchase flow clearly states a charge. Clubs may owe contractual referral fees and subscription or service charges. Under the current Dancer Commission Terms, a Profile-Originated Verified Redemption earns the attributed dancer 30%, 40%, or 50% of the applicable MyDancr gross referral fee according to whether it is the dancer’s 1st–9th, 10th–24th, or 25th-and-later qualifying event in the commission month; the detailed attribution, exclusions, correction, and payout rules control. Authorized agents may receive commissions only under a separate written order. Commission payouts use Bitsafe/Yoursafe and require a separate eligible payment account. Club billing may use a different payment processor. Each financial provider is subject to availability, eligibility, compliance review, and its own terms.</w:t>
+        <w:t>Customer use of a Club Deal does not authorize MyDancr to charge the customer unless a separate purchase flow clearly states a charge. Clubs may owe contractual referral fees and subscription or service charges. Under the current Dancer Commission Terms, a Profile-Originated Verified Redemption earns the attributed dancer 30%, 40%, or 50% of the applicable MyDancr gross referral fee according to whether it is the dancer’s 1st–9th, 10th–24th, or 25th-and-later qualifying event in the commission month; the detailed attribution, exclusions, correction, and payout rules control. Authorized agents may receive commissions only under a separate written order. Commission payouts use approved payout provider and require a separate eligible payment account. Club billing may use a different payment processor. Each financial provider is subject to availability, eligibility, compliance review, and its own terms.</w:t>
       </w:r>
     </w:p>
     <w:p>
@@ -3973,7 +3973,7 @@
     </w:p>
     <w:p>
       <w:r>
-        <w:t>Links and integrations may lead to clubs, social networks, maps, rideshare providers, authentication/email/push providers, Yoti, Bitsafe/Yoursafe, and the club billing processor. Third parties control their own services, terms, availability, and data practices. A link or technical integration does not imply endorsement or partnership. The User is responsible for reviewing third-party terms.</w:t>
+        <w:t>Links and integrations may lead to clubs, social networks, maps, rideshare providers, authentication/email/push providers, Yoti, approved payout provider, and the club billing processor. Third parties control their own services, terms, availability, and data practices. A link or technical integration does not imply endorsement or partnership. The User is responsible for reviewing third-party terms.</w:t>
       </w:r>
     </w:p>
     <w:p>
@@ -4230,7 +4230,7 @@
     </w:p>
     <w:p>
       <w:r>
-        <w:t>This Privacy Policy applies to personal information processed by MyDancr through the Service. Yoti processes identity-verification data for requested sessions under its product privacy notice and contract with MyDancr. Bitsafe/Yoursafe processes beneficiary and payment-account data under its own terms and privacy notice. This policy does not govern independent club practices, third-party social sites, maps, rideshare providers, or providers acting independently. The published version must identify the MyDancr controller/business legal entity and contact methods.</w:t>
+        <w:t>This Privacy Policy applies to personal information processed by MyDancr through the Service. Yoti processes identity-verification data for requested sessions under its product privacy notice and contract with MyDancr. approved payout provider processes beneficiary and payment-account data under its own terms and privacy notice. This policy does not govern independent club practices, third-party social sites, maps, rideshare providers, or providers acting independently. The published version must identify the MyDancr controller/business legal entity and contact methods.</w:t>
       </w:r>
     </w:p>
     <w:p>
@@ -4329,7 +4329,7 @@
     </w:p>
     <w:p>
       <w:r>
-        <w:t>Club fee terms, invoices, invoice items, payment status/references, verified redemption data, gross referral fee, dancer share, platform share, policy version, commission status, payout batches/items, Bitsafe/Yoursafe beneficiary or account identifier, onboarding/eligibility state, failure reason, transfer reference, tax classification/documents or status, and agent order/attribution if an agent program is active. Full Bitsafe/Yoursafe credentials, ID images collected solely for payment-account KYC, and external bank/card credentials should remain with the provider rather than being copied into MyDancr’s ordinary database.</w:t>
+        <w:t>Club fee terms, invoices, invoice items, payment status/references, verified redemption data, gross referral fee, dancer share, platform share, policy version, commission status, payout batches/items, approved payout provider beneficiary or account identifier, onboarding/eligibility state, failure reason, transfer reference, tax classification/documents or status, and agent order/attribution if an agent program is active. Full approved payout provider credentials, ID images collected solely for payment-account KYC, and external bank/card credentials should remain with the provider rather than being copied into MyDancr’s ordinary database.</w:t>
       </w:r>
     </w:p>
     <w:p>
@@ -4368,7 +4368,7 @@
     </w:p>
     <w:p>
       <w:r>
-        <w:t>Information comes from the User; clubs and authorized team members; dancers; agents under contract; automated device/browser events; NFC tags; content moderation; Yoti verification reports; Bitsafe/Yoursafe payout and beneficiary status; the club billing processor; authentication, hosting, email, push, map, and support vendors; public sources used for club verification; other Users’ reports; and authorities where lawful.</w:t>
+        <w:t>Information comes from the User; clubs and authorized team members; dancers; agents under contract; automated device/browser events; NFC tags; content moderation; Yoti verification reports; approved payout provider payout and beneficiary status; the club billing processor; authentication, hosting, email, push, map, and support vendors; public sources used for club verification; other Users’ reports; and authorities where lawful.</w:t>
       </w:r>
     </w:p>
     <w:p>
@@ -4526,17 +4526,17 @@
         <w:pStyle w:val="Heading2"/>
       </w:pPr>
       <w:r>
-        <w:t>7. Bitsafe/Yoursafe commission payouts</w:t>
-      </w:r>
-    </w:p>
-    <w:p>
-      <w:r>
-        <w:t>To receive a payout, a dancer or authorized agent must establish and maintain an eligible Bitsafe/Yoursafe payment account. Bitsafe/Yoursafe may collect legal name, date of birth, address, business information, tax information, government identification, selfie/biometric verification, sanctions/KYC information, source-of-funds information, external account details, device/security data, and transaction data under its own terms and privacy policy. Its current privacy notice describes converting a face image to a facial template for KYC, not retaining the original facial image, and retaining the template for up to five years after account closure or last use where required by financial-sector and fraud-prevention obligations. MyDancr may exchange payee identifier, contact information, amount, currency, payment purpose, statement/reference, status, and compliance or failure results needed to execute and reconcile commissions. Bitsafe/Yoursafe approval, restrictions, reserves, fees, account closure, and supported payment methods are independently controlled by the provider.</w:t>
-      </w:r>
-    </w:p>
-    <w:p>
-      <w:r>
-        <w:t>The published policy should identify Yoursafe B.V. as the operator where that is the contracted legal entity, explain that Bitsafe may be a legacy or product name, and link to the exact production privacy notice and terms. MyDancr must update the notice and contract/vendor record before changing provider or sending materially different data.</w:t>
+        <w:t>7. approved payout provider commission payouts</w:t>
+      </w:r>
+    </w:p>
+    <w:p>
+      <w:r>
+        <w:t>To receive a payout, a dancer or authorized agent must establish and maintain an eligible approved payout provider payment account. approved payout provider may collect legal name, date of birth, address, business information, tax information, government identification, selfie/biometric verification, sanctions/KYC information, source-of-funds information, external account details, device/security data, and transaction data under its own terms and privacy policy. Its current privacy notice describes converting a face image to a facial template for KYC, not retaining the original facial image, and retaining the template for up to five years after account closure or last use where required by financial-sector and fraud-prevention obligations. MyDancr may exchange payee identifier, contact information, amount, currency, payment purpose, statement/reference, status, and compliance or failure results needed to execute and reconcile commissions. approved payout provider approval, restrictions, reserves, fees, account closure, and supported payment methods are independently controlled by the provider.</w:t>
+      </w:r>
+    </w:p>
+    <w:p>
+      <w:r>
+        <w:t>The published policy should identify the selected provider's contracted legal entity as the operator where that is the contracted legal entity, explain that approved provider may be a legacy or product name, and link to the exact production privacy notice and terms. MyDancr must update the notice and contract/vendor record before changing provider or sending materially different data.</w:t>
       </w:r>
     </w:p>
     <w:p>
@@ -4663,7 +4663,7 @@
     </w:p>
     <w:p>
       <w:r>
-        <w:t>The dancer represents that the dancer is at least 18, is the person operating the account, has legal capacity, and may lawfully work and publish the submitted content. The dancer must provide accurate identity and city information, complete the required Yoti session, and must not use another person’s documents, likeness, stage identity, or account. A stage name may be public; legal identity remains private except as required for Yoti verification, tax, Bitsafe/Yoursafe payout, safety, or law.</w:t>
+        <w:t>The dancer represents that the dancer is at least 18, is the person operating the account, has legal capacity, and may lawfully work and publish the submitted content. The dancer must provide accurate identity and city information, complete the required Yoti session, and must not use another person’s documents, likeness, stage identity, or account. A stage name may be public; legal identity remains private except as required for Yoti verification, tax, approved payout provider payout, safety, or law.</w:t>
       </w:r>
     </w:p>
     <w:p>
@@ -4772,7 +4772,7 @@
     </w:p>
     <w:p>
       <w:r>
-        <w:t>The dancer must open and maintain an eligible Bitsafe/Yoursafe payment account, complete the provider’s KYC and tax/compliance checks, maintain information matching the MyDancr payee record, and remain eligible. The dancer authorizes MyDancr to send commission payout instructions and required transaction/payee data to Bitsafe/Yoursafe. Provider fees, foreign exchange, limits, supported countries, reserves, payment-method availability, compliance review, and holds may apply as disclosed. MyDancr does not control Bitsafe/Yoursafe’s independent approval or account decisions.</w:t>
+        <w:t>The dancer must open and maintain an eligible approved payout provider payment account, complete the provider’s KYC and tax/compliance checks, maintain information matching the MyDancr payee record, and remain eligible. The dancer authorizes MyDancr to send commission payout instructions and required transaction/payee data to approved payout provider. Provider fees, foreign exchange, limits, supported countries, reserves, payment-method availability, compliance review, and holds may apply as disclosed. MyDancr does not control approved payout provider’s independent approval or account decisions.</w:t>
       </w:r>
     </w:p>
     <w:p>
@@ -4874,7 +4874,7 @@
     </w:p>
     <w:p>
       <w:r>
-        <w:t>The dancer acknowledges the customer-facing limits of badges and status, the absence of guaranteed earnings, the role of club admission and independent club rules, Yoti’s verification role, Bitsafe/Yoursafe’s commission-payout role, the public nature of approved profile content, dynamic ranking signals, and the separate Content/Media, Acceptable Use, Verification, Commission, Moderation, Privacy, and Retention policies.</w:t>
+        <w:t>The dancer acknowledges the customer-facing limits of badges and status, the absence of guaranteed earnings, the role of club admission and independent club rules, Yoti’s verification role, approved payout provider’s commission-payout role, the public nature of approved profile content, dynamic ranking signals, and the separate Content/Media, Acceptable Use, Verification, Commission, Moderation, Privacy, and Retention policies.</w:t>
       </w:r>
     </w:p>
     <w:p>
@@ -5446,7 +5446,7 @@
     </w:p>
     <w:p>
       <w:r>
-        <w:t>Verification should be proportionate to role and action. Email confirmation is appropriate for basic account access but is not enough for a public dancer, club owner, authorized manager, payout recipient, or agent. High-risk roles require a configured Yoti check and/or other documented authority review. Bitsafe/Yoursafe separately controls payment-account KYC for payout recipients.</w:t>
+        <w:t>Verification should be proportionate to role and action. Email confirmation is appropriate for basic account access but is not enough for a public dancer, club owner, authorized manager, payout recipient, or agent. High-risk roles require a configured Yoti check and/or other documented authority review. approved payout provider separately controls payment-account KYC for payout recipients.</w:t>
       </w:r>
     </w:p>
     <w:p>
@@ -5529,7 +5529,7 @@
     </w:p>
     <w:p>
       <w:r>
-        <w:t>Payout recipients must complete Bitsafe/Yoursafe onboarding and any MyDancr tax, sanctions, identity, and account-matching checks. MyDancr may rely on Yoti for platform identity and on Bitsafe/Yoursafe for payment-account KYC, but must resolve mismatches before payout. An agent must also have a valid separate agreement and order. Bitsafe/Yoursafe approval does not itself authorize a MyDancr agent commission; MyDancr’s written authorization and qualifying events are still required.</w:t>
+        <w:t>Payout recipients must complete approved payout provider onboarding and any MyDancr tax, sanctions, identity, and account-matching checks. MyDancr may rely on Yoti for platform identity and on approved payout provider for payment-account KYC, but must resolve mismatches before payout. An agent must also have a valid separate agreement and order. approved payout provider approval does not itself authorize a MyDancr agent commission; MyDancr’s written authorization and qualifying events are still required.</w:t>
       </w:r>
     </w:p>
     <w:p>
@@ -5821,7 +5821,7 @@
     </w:p>
     <w:p>
       <w:r>
-        <w:t>These terms govern rewards for eligible dancers and, only if separately authorized, commissions for contracted agents. They do not govern club wages, tips, dancer services, customer purchases, or employment compensation. “Commission Event” means a server-created record that satisfies the applicable policy and attribution rules. “Profile-Originated Verified Redemption” means an allowed Club Deal redemption successfully confirmed by the correct club’s authorized cashier NFC tag where the immutable source captured before token issuance identifies an eligible dancer’s public profile—including a qualifying shift or deal surface presented within that profile—as the customer journey’s origin. “Bitsafe/Yoursafe” means the Bitsafe-branded or successor Yoursafe payment-account service operated by Yoursafe B.V., as applicable to MyDancr’s contracted payout integration.</w:t>
+        <w:t>These terms govern rewards for eligible dancers and, only if separately authorized, commissions for contracted agents. They do not govern club wages, tips, dancer services, customer purchases, or employment compensation. “Commission Event” means a server-created record that satisfies the applicable policy and attribution rules. “Profile-Originated Verified Redemption” means an allowed Club Deal redemption successfully confirmed by the correct club’s authorized cashier NFC tag where the immutable source captured before token issuance identifies an eligible dancer’s public profile—including a qualifying shift or deal surface presented within that profile—as the customer journey’s origin. “approved payout provider” means the approved provider-branded or successor approved provider payment-account service operated by the selected provider's contracted legal entity, as applicable to MyDancr’s contracted payout integration.</w:t>
       </w:r>
     </w:p>
     <w:p>
@@ -5956,17 +5956,17 @@
         <w:pStyle w:val="Heading2"/>
       </w:pPr>
       <w:r>
-        <w:t>7. Bitsafe/Yoursafe onboarding</w:t>
-      </w:r>
-    </w:p>
-    <w:p>
-      <w:r>
-        <w:t>A payee must establish an eligible Bitsafe/Yoursafe payment account, complete its identity/KYC, sanctions, tax, and account-matching checks, and authorize required data exchange. MyDancr may store the beneficiary/account identifier, onboarding status, payout eligibility, transfer reference, and error status but should not store full external account credentials. Bitsafe/Yoursafe terms, country availability, account restrictions, reserves, limits, fees, inactivity charges, foreign exchange, payment methods, and review apply independently.</w:t>
-      </w:r>
-    </w:p>
-    <w:p>
-      <w:r>
-        <w:t>MyDancr will use Bitsafe/Yoursafe for commission payouts under this version. If the integration or provider becomes unavailable or legally unsuitable, MyDancr may change providers with reasonable notice and a transition period, subject to accrued-payment duties and applicable law. The payee may need to complete new onboarding before further payout.</w:t>
+        <w:t>7. approved payout provider onboarding</w:t>
+      </w:r>
+    </w:p>
+    <w:p>
+      <w:r>
+        <w:t>A payee must establish an eligible approved payout provider payment account, complete its identity/KYC, sanctions, tax, and account-matching checks, and authorize required data exchange. MyDancr may store the beneficiary/account identifier, onboarding status, payout eligibility, transfer reference, and error status but should not store full external account credentials. approved payout provider terms, country availability, account restrictions, reserves, limits, fees, inactivity charges, foreign exchange, payment methods, and review apply independently.</w:t>
+      </w:r>
+    </w:p>
+    <w:p>
+      <w:r>
+        <w:t>MyDancr will use approved payout provider for commission payouts under this version. If the integration or provider becomes unavailable or legally unsuitable, MyDancr may change providers with reasonable notice and a transition period, subject to accrued-payment duties and applicable law. The payee may need to complete new onboarding before further payout.</w:t>
       </w:r>
     </w:p>
     <w:p>
@@ -6406,7 +6406,7 @@
         <w:rPr>
           <w:b/>
         </w:rPr>
-        <w:t>Bitsafe/Yoursafe references:</w:t>
+        <w:t>approved payout provider references:</w:t>
       </w:r>
       <w:r>
         <w:t xml:space="preserve"> beneficiary/account identifier, transfer reference, status, amount, currency, failure/hold reason, and reconciliation record through the approved finance/statutory period; never retain the provider password or unnecessary payment-account credentials. The provider independently retains regulated KYC and transaction data under its policy, including the facial-template period it identifies.</w:t>
@@ -6663,7 +6663,7 @@
         <w:pStyle w:val="ListNumber"/>
       </w:pPr>
       <w:r>
-        <w:t>Execute and configure the Bitsafe/Yoursafe business/sponsor-management and payout arrangements; confirm Yoursafe B.V. legal identity, supported payee countries/currencies, KYC, funding, fees, reserves, transaction limits, complaints, data protection, and reconciliation.</w:t>
+        <w:t>Execute and configure the approved payout provider business/sponsor-management and payout arrangements; confirm the selected provider's contracted legal entity legal identity, supported payee countries/currencies, KYC, funding, fees, reserves, transaction limits, complaints, data protection, and reconciliation.</w:t>
       </w:r>
     </w:p>
     <w:p>
@@ -6671,7 +6671,7 @@
         <w:pStyle w:val="ListNumber"/>
       </w:pPr>
       <w:r>
-        <w:t>If agents launch, execute a separate Agent Agreement and order; implement role, authorization, attribution, statements, tax, Bitsafe/Yoursafe payout, suspension, and deletion before any commission is promised.</w:t>
+        <w:t>If agents launch, execute a separate Agent Agreement and order; implement role, authorization, attribution, statements, tax, approved payout provider payout, suspension, and deletion before any commission is promised.</w:t>
       </w:r>
     </w:p>
     <w:p>
@@ -6695,7 +6695,7 @@
         <w:pStyle w:val="ListNumber"/>
       </w:pPr>
       <w:r>
-        <w:t>Separate customer Terms acceptance from Dancer, Club, Agent, Media, Club Deal, Yoti, and Bitsafe/Yoursafe payout acceptances/notices.</w:t>
+        <w:t>Separate customer Terms acceptance from Dancer, Club, Agent, Media, Club Deal, Yoti, and approved payout provider payout acceptances/notices.</w:t>
       </w:r>
     </w:p>
     <w:p>
@@ -6759,7 +6759,7 @@
         <w:pStyle w:val="ListNumber"/>
       </w:pPr>
       <w:r>
-        <w:t>Finalize Bitsafe/Yoursafe payout schedule, minimum, tax, failure, hold, reversal, fee, and unclaimed-property handling.</w:t>
+        <w:t>Finalize approved payout provider payout schedule, minimum, tax, failure, hold, reversal, fee, and unclaimed-property handling.</w:t>
       </w:r>
     </w:p>
     <w:p>
@@ -6849,7 +6849,7 @@
         <w:t>Dancer:</w:t>
       </w:r>
       <w:r>
-        <w:t xml:space="preserve"> Terms + Privacy + Dancer Agreement + Content/Media License + Acceptable Use + Verification + Yoti notice/consent where required + Bitsafe/Yoursafe Commission/Payout terms; renewed acceptance for material commission changes.</w:t>
+        <w:t xml:space="preserve"> Terms + Privacy + Dancer Agreement + Content/Media License + Acceptable Use + Verification + Yoti notice/consent where required + approved payout provider Commission/Payout terms; renewed acceptance for material commission changes.</w:t>
       </w:r>
     </w:p>
     <w:p>
@@ -6891,7 +6891,7 @@
         <w:t>Agent if launched:</w:t>
       </w:r>
       <w:r>
-        <w:t xml:space="preserve"> Terms + Privacy + separate Agent Agreement/order + Acceptable Use + Yoti verification notice + Bitsafe/Yoursafe payout/tax terms + marketing standards.</w:t>
+        <w:t xml:space="preserve"> Terms + Privacy + separate Agent Agreement/order + Acceptable Use + Yoti verification notice + approved payout provider payout/tax terms + marketing standards.</w:t>
       </w:r>
     </w:p>
     <w:p>
@@ -6985,7 +6985,7 @@
         <w:pStyle w:val="ListBullet"/>
       </w:pPr>
       <w:r>
-        <w:t>Reconcile club invoice, profile-originated tier ordinals 1, 9, 10, 24, and 25, month reset, independent dancer payable, Bitsafe/Yoursafe success/failure, KYC hold, reserve, wrong/mismatched beneficiary, correction, fee, and statement.</w:t>
+        <w:t>Reconcile club invoice, profile-originated tier ordinals 1, 9, 10, 24, and 25, month reset, independent dancer payable, approved payout provider success/failure, KYC hold, reserve, wrong/mismatched beneficiary, correction, fee, and statement.</w:t>
       </w:r>
     </w:p>
     <w:p>
@@ -7329,7 +7329,7 @@
         <w:rPr>
           <w:b/>
         </w:rPr>
-        <w:t>Bitsafe/Yoursafe payment-account terms:</w:t>
+        <w:t>approved payout provider payment-account terms:</w:t>
       </w:r>
       <w:r>
         <w:t xml:space="preserve"> [</w:t>
@@ -7340,7 +7340,7 @@
             <w:color w:val="0891B2"/>
             <w:u w:val="single"/>
           </w:rPr>
-          <w:t>https://www.yoursafe.com/en/terms-and-conditions.html](https://www.yoursafe.com/en/terms-and-conditions.html</w:t>
+          <w:t>https://www.mydancr.com](https://www.mydancr.com</w:t>
         </w:r>
       </w:hyperlink>
       <w:r>
@@ -7355,7 +7355,7 @@
         <w:rPr>
           <w:b/>
         </w:rPr>
-        <w:t>Bitsafe/Yoursafe privacy policy:</w:t>
+        <w:t>approved payout provider privacy policy:</w:t>
       </w:r>
       <w:r>
         <w:t xml:space="preserve"> [</w:t>
@@ -7366,7 +7366,7 @@
             <w:color w:val="0891B2"/>
             <w:u w:val="single"/>
           </w:rPr>
-          <w:t>https://www.yoursafe.com/en/privacy-policy.html](https://www.yoursafe.com/en/privacy-policy.html</w:t>
+          <w:t>https://www.mydancr.com](https://www.mydancr.com</w:t>
         </w:r>
       </w:hyperlink>
       <w:r>
@@ -7381,7 +7381,7 @@
         <w:rPr>
           <w:b/>
         </w:rPr>
-        <w:t>Bitsafe/Yoursafe payment-account overview:</w:t>
+        <w:t>approved payout provider payment-account overview:</w:t>
       </w:r>
       <w:r>
         <w:t xml:space="preserve"> [</w:t>
@@ -7392,7 +7392,7 @@
             <w:color w:val="0891B2"/>
             <w:u w:val="single"/>
           </w:rPr>
-          <w:t>https://help.yoursafe.support/hc/en-us/categories/360002248759-Bitsafe-Payments](https://help.yoursafe.support/hc/en-us/categories/360002248759-Bitsafe-Payments</w:t>
+          <w:t>https://www.mydancr.com](https://www.mydancr.com</w:t>
         </w:r>
       </w:hyperlink>
       <w:r>

</xml_diff>

<commit_message>
refactor: remove retired Yoti age verification
</commit_message>
<xml_diff>
--- a/docs/legal/MyDancr-Legal-Review-Packet.docx
+++ b/docs/legal/MyDancr-Legal-Review-Packet.docx
@@ -396,28 +396,10 @@
                 <w:color w:val="0891B2"/>
                 <w:sz w:val="16"/>
               </w:rPr>
-              <w:t xml:space="preserve">NAMED PRODUCTION PROVIDERS  </w:t>
+              <w:t xml:space="preserve">PRODUCTION PROVIDERS  </w:t>
             </w:r>
             <w:r>
-              <w:t xml:space="preserve">This packet assumes </w:t>
-            </w:r>
-            <w:r>
-              <w:rPr>
-                <w:b/>
-              </w:rPr>
-              <w:t>Yoti</w:t>
-            </w:r>
-            <w:r>
-              <w:t xml:space="preserve"> provides MyDancr’s identity and age-verification workflow and </w:t>
-            </w:r>
-            <w:r>
-              <w:rPr>
-                <w:b/>
-              </w:rPr>
-              <w:t>approved payout provider</w:t>
-            </w:r>
-            <w:r>
-              <w:t xml:space="preserve"> provides dancer and authorized-agent commission payout accounts and transfers. “approved payout provider” means the approved provider-branded or successor approved provider payment-account service operated by the selected provider's contracted legal entity, as applicable to the contracted integration. Provider terms, privacy notices, geographic availability, and legal entity must be verified against the signed production contracts before publication.</w:t>
+              <w:t>This packet does not assume a third-party identity or age-verification provider. MyDancr controls its documented verification and approval workflow. No commission payout provider is currently designated. MyDancr must select a legally and contractually approved payout provider before live payouts are enabled, and the provider’s terms, privacy notice, geographic availability, and legal entity must be verified against the signed production contract before publication.</w:t>
             </w:r>
           </w:p>
         </w:tc>
@@ -784,7 +766,7 @@
         <w:t>Identity verification:</w:t>
       </w:r>
       <w:r>
-        <w:t xml:space="preserve"> Yoti is the assumed production verification provider for dancer age/identity and any risk-based club or agent checks. MyDancr remains responsible for deciding what is required, giving notice, reviewing the returned result, and providing a lawful alternative where required.</w:t>
+        <w:t xml:space="preserve"> MyDancr is responsible for defining and operating its dancer age/identity review and any risk-based club or agent checks, including required notices, decision criteria, access controls, retention, appeals, and any lawful alternative.</w:t>
       </w:r>
     </w:p>
     <w:p>
@@ -798,7 +780,7 @@
         <w:t>Payouts:</w:t>
       </w:r>
       <w:r>
-        <w:t xml:space="preserve"> dancer and authorized-agent commission payouts are processed through approved payout provider. Payees must open and maintain an eligible approved payout provider account, pass the provider’s KYC and compliance checks, and ensure that MyDancr and provider records match.</w:t>
+        <w:t xml:space="preserve"> live dancer and authorized-agent commission payouts remain disabled until MyDancr selects an approved payout provider. Once selected, payees must complete the provider’s secure onboarding, pass its KYC and compliance checks, and ensure that MyDancr and provider records match.</w:t>
       </w:r>
     </w:p>
     <w:p>
@@ -866,7 +848,7 @@
         <w:pStyle w:val="ListNumber"/>
       </w:pPr>
       <w:r>
-        <w:t>Approve the exact Yoti product configuration for dancers, club owners/managers, and agents, including requested attributes, ID/selfie/liveness/face-match checks, biometric consent, U.S. state biometric notices, manual-review access, retention time-to-live, and fallback process.</w:t>
+        <w:t>Approve the exact identity and age-verification workflow for dancers, club owners/managers, and agents, including requested evidence, reviewer access, consent and state-specific notices, retention, appeals, and fallback process.</w:t>
       </w:r>
     </w:p>
     <w:p>
@@ -882,7 +864,7 @@
         <w:pStyle w:val="ListNumber"/>
       </w:pPr>
       <w:r>
-        <w:t>Approve the approved payout provider business and sponsor-management configuration, beneficiary onboarding, payout cadence, minimum threshold, reserves/holds, rejected-payment procedure, inactivity treatment, fees, supported countries/currencies, sanctions screening, tax-document workflow, complaints path, and unclaimed-property handling.</w:t>
+        <w:t>Select and approve a legally suitable payout provider and its business configuration, beneficiary onboarding, payout cadence, minimum threshold, reserves/holds, rejected-payment procedure, inactivity treatment, fees, supported countries/currencies, sanctions screening, tax-document workflow, complaints path, and unclaimed-property handling.</w:t>
       </w:r>
     </w:p>
     <w:p>
@@ -1089,12 +1071,12 @@
     </w:p>
     <w:p>
       <w:r>
-        <w:t>The first-time dancer flow is staged: create the account; save stage name and city; complete the required Yoti age/identity session; upload and approve an avatar; upload the required profile photos; optionally add social links and videos; preview the complete customer-facing profile; submit; and complete first venue verification through an approved club touchpoint. The public preview should use the same rendering and approved content that a live profile will use, while clearly identifying its private preview state.</w:t>
-      </w:r>
-    </w:p>
-    <w:p>
-      <w:r>
-        <w:t>Public eligibility is the conjunction of several conditions, not a single status flag: active account, approved dancer status, a successful and current Yoti verification result accepted by MyDancr, public visibility enabled, no disablement, required approved media, and the required approved venue affiliation. Media still pending or rejected does not count toward approval. Deleting media must remove the active database record and associated public/storage reference, subject only to backup, legal-hold, and audit retention described later.</w:t>
+        <w:t>The first-time dancer flow is staged: create the account; save stage name and city; complete the required MyDancr age/identity review; upload and approve an avatar; upload the required profile photos; optionally add social links and videos; preview the complete customer-facing profile; submit; and complete first venue verification through an approved club touchpoint. The public preview should use the same rendering and approved content that a live profile will use, while clearly identifying its private preview state.</w:t>
+      </w:r>
+    </w:p>
+    <w:p>
+      <w:r>
+        <w:t>Public eligibility is the conjunction of several conditions, not a single status flag: active account, approved dancer status, a successful and current identity/age decision accepted by MyDancr, public visibility enabled, no disablement, required approved media, and the required approved venue affiliation. Media still pending or rejected does not count toward approval. Deleting media must remove the active database record and associated public/storage reference, subject only to backup, legal-hold, and audit retention described later.</w:t>
       </w:r>
     </w:p>
     <w:p>
@@ -1260,7 +1242,7 @@
     </w:p>
     <w:p>
       <w:r>
-        <w:t>Payouts to dancers and, if launched, separately authorized agents are sent through approved payout provider. MyDancr should store the approved payout provider beneficiary or account identifier, onboarding state, eligibility state, last error, and transfer references, but not full payment-account credentials. approved payout provider may collect identity, address, tax, sanctions, source-of-funds, payment-account, device, and transaction data under its own terms. Payees remain responsible for accurate matching information, maintaining an eligible account, and fees/taxes allocated to them in the applicable agreement.</w:t>
+        <w:t>Payouts to dancers and, if launched, separately authorized agents must be sent through a separately approved payout provider. MyDancr should store only the provider beneficiary or account identifier, onboarding state, eligibility state, last error, and transfer references, but not full payment-account credentials. The selected provider may collect identity, address, tax, sanctions, source-of-funds, payment-account, device, and transaction data under its own terms. Payees remain responsible for accurate matching information, maintaining an eligible provider account, and fees or taxes allocated to them in the applicable agreement.</w:t>
       </w:r>
     </w:p>
     <w:p>
@@ -1273,7 +1255,7 @@
     </w:p>
     <w:p>
       <w:r>
-        <w:t>No agent program should be inferred from a club team role or customer referral. If activated, the agent model should use: an administrator-approved agent record; a written agreement and commission order; Yoti verification appropriate to the agent; verified business, sanctions, and tax status; approved payout provider payout readiness; a defined club or transaction attribution; a start/end date; a fixed rate or formula; and an immutable commission event created only after the qualifying verified event.</w:t>
+        <w:t>No agent program should be inferred from a club team role or customer referral. If activated, the agent model should use: an administrator-approved agent record; a written agreement and commission order; identity verification appropriate to the agent; verified business, sanctions, and tax status; approved-provider payout readiness; a defined club or transaction attribution; a start/end date; a fixed rate or formula; and an immutable commission event created only after the qualifying verified event.</w:t>
       </w:r>
     </w:p>
     <w:p>
@@ -1463,24 +1445,10 @@
         <w:rPr>
           <w:b/>
         </w:rPr>
-        <w:t>Yoti:</w:t>
-      </w:r>
-      <w:r>
-        <w:t xml:space="preserve"> identity and age-verification session, ID-document and extracted attribute checks, selfie/liveness and face match where configured, fraud signals, verification report, and configurable retention. Yoti ordinarily acts as a processor/service provider for the requesting organization’s IDV session, subject to its product terms and privacy notice.</w:t>
-      </w:r>
-    </w:p>
-    <w:p>
-      <w:pPr>
-        <w:pStyle w:val="ListBullet"/>
-      </w:pPr>
-      <w:r>
-        <w:rPr>
-          <w:b/>
-        </w:rPr>
-        <w:t>approved payout provider:</w:t>
-      </w:r>
-      <w:r>
-        <w:t xml:space="preserve"> beneficiary payment-account onboarding, KYC/AML, account status, payout execution, fees, reserves/holds, failures, transaction history, and compliance. The contracted legal entity, sponsor-management flow, supported countries, and price schedule must match production.</w:t>
+        <w:t>Approved payout provider, once selected:</w:t>
+      </w:r>
+      <w:r>
+        <w:t xml:space="preserve"> beneficiary payment-account onboarding, KYC/AML, account status, payout execution, fees, reserves/holds, failures, transaction history, and compliance. The contracted legal entity, onboarding flow, supported countries, and price schedule must match production.</w:t>
       </w:r>
     </w:p>
     <w:tbl>
@@ -1863,7 +1831,7 @@
               <w:rPr>
                 <w:sz w:val="14"/>
               </w:rPr>
-              <w:t>Auth + draft dancer profile; staged onboarding; Yoti session required</w:t>
+              <w:t>Auth + draft dancer profile; staged onboarding; MyDancr identity/age review required</w:t>
             </w:r>
           </w:p>
         </w:tc>
@@ -1909,7 +1877,7 @@
               <w:rPr>
                 <w:sz w:val="14"/>
               </w:rPr>
-              <w:t>Email confirmation; Yoti reference/result; account state; audit</w:t>
+              <w:t>Email confirmation; verification decision; account state; audit</w:t>
             </w:r>
           </w:p>
         </w:tc>
@@ -3133,7 +3101,7 @@
               <w:rPr>
                 <w:sz w:val="14"/>
               </w:rPr>
-              <w:t>Payee identity, approved payout provider beneficiary ID, amount, tax/compliance state</w:t>
+              <w:t>Payee identity, approved-provider beneficiary ID, amount, tax/compliance state</w:t>
             </w:r>
           </w:p>
         </w:tc>
@@ -3155,7 +3123,7 @@
               <w:rPr>
                 <w:sz w:val="14"/>
               </w:rPr>
-              <w:t>approved payout provider executes, holds, or rejects transfer</w:t>
+              <w:t>Approved provider executes, holds, or rejects transfer</w:t>
             </w:r>
           </w:p>
         </w:tc>
@@ -3942,7 +3910,7 @@
     </w:p>
     <w:p>
       <w:r>
-        <w:t>Customer use of a Club Deal does not authorize MyDancr to charge the customer unless a separate purchase flow clearly states a charge. Clubs may owe contractual referral fees and subscription or service charges. Under the current Dancer Commission Terms, a Profile-Originated Verified Redemption earns the attributed dancer 30%, 40%, or 50% of the applicable MyDancr gross referral fee according to whether it is the dancer’s 1st–9th, 10th–24th, or 25th-and-later qualifying event in the commission month; the detailed attribution, exclusions, correction, and payout rules control. Authorized agents may receive commissions only under a separate written order. Commission payouts use approved payout provider and require a separate eligible payment account. Club billing may use a different payment processor. Each financial provider is subject to availability, eligibility, compliance review, and its own terms.</w:t>
+        <w:t>Customer use of a Club Deal does not authorize MyDancr to charge the customer unless a separate purchase flow clearly states a charge. Clubs may owe contractual referral fees and subscription or service charges. Under the current Dancer Commission Terms, a Profile-Originated Verified Redemption earns the attributed dancer 30%, 40%, or 50% of the applicable MyDancr gross referral fee according to whether it is the dancer’s 1st–9th, 10th–24th, or 25th-and-later qualifying event in the commission month; the detailed attribution, exclusions, correction, and payout rules control. Authorized agents may receive commissions only under a separate written order. Live commission payouts require a separately approved payout provider and an eligible provider account. Club billing may use a different payment processor. Each financial provider is subject to availability, eligibility, compliance review, and its own terms.</w:t>
       </w:r>
     </w:p>
     <w:p>
@@ -3973,7 +3941,7 @@
     </w:p>
     <w:p>
       <w:r>
-        <w:t>Links and integrations may lead to clubs, social networks, maps, rideshare providers, authentication/email/push providers, Yoti, approved payout provider, and the club billing processor. Third parties control their own services, terms, availability, and data practices. A link or technical integration does not imply endorsement or partnership. The User is responsible for reviewing third-party terms.</w:t>
+        <w:t>Links and integrations may lead to clubs, social networks, maps, rideshare providers, authentication/email/push providers, an approved payout provider once selected, and the club billing processor. Third parties control their own services, terms, availability, and data practices. A link or technical integration does not imply endorsement or partnership. The User is responsible for reviewing third-party terms.</w:t>
       </w:r>
     </w:p>
     <w:p>
@@ -4230,7 +4198,7 @@
     </w:p>
     <w:p>
       <w:r>
-        <w:t>This Privacy Policy applies to personal information processed by MyDancr through the Service. Yoti processes identity-verification data for requested sessions under its product privacy notice and contract with MyDancr. approved payout provider processes beneficiary and payment-account data under its own terms and privacy notice. This policy does not govern independent club practices, third-party social sites, maps, rideshare providers, or providers acting independently. The published version must identify the MyDancr controller/business legal entity and contact methods.</w:t>
+        <w:t>This Privacy Policy applies to personal information processed by MyDancr through the Service. Any payout provider selected in the future will process beneficiary and payment-account data under its own terms and privacy notice. This policy does not govern independent club practices, third-party social sites, maps, rideshare providers, or providers acting independently. The published version must identify the MyDancr controller/business legal entity and contact methods.</w:t>
       </w:r>
     </w:p>
     <w:p>
@@ -4264,7 +4232,7 @@
     </w:p>
     <w:p>
       <w:r>
-        <w:t>Stage name, city, bio, avatar, profile photos, videos, social links, public slug, visibility, status, legal identity or verification readiness, club affiliations, verification events, work-card or license information if required, and consent/acceptance records. A Yoti session may process an identity document and available fields such as legal name, date of birth, address, document number/type, nationality, issue/expiry dates, gender where present, and document photo; selfie/liveness, biometric face match, document-authenticity, fraud, watchlist, or other configured checks; and a report returned to MyDancr. Legal identity and verification evidence are private and should not appear on the public profile.</w:t>
+        <w:t>Stage name, city, bio, avatar, profile photos, videos, social links, public slug, visibility, status, legal identity or verification readiness, club affiliations, verification events, work-card or license information if required, and consent/acceptance records. Legal identity and verification evidence are private and should not appear on the public profile. MyDancr should collect only the evidence required by its approved review workflow and applicable law.</w:t>
       </w:r>
     </w:p>
     <w:p>
@@ -4329,7 +4297,7 @@
     </w:p>
     <w:p>
       <w:r>
-        <w:t>Club fee terms, invoices, invoice items, payment status/references, verified redemption data, gross referral fee, dancer share, platform share, policy version, commission status, payout batches/items, approved payout provider beneficiary or account identifier, onboarding/eligibility state, failure reason, transfer reference, tax classification/documents or status, and agent order/attribution if an agent program is active. Full approved payout provider credentials, ID images collected solely for payment-account KYC, and external bank/card credentials should remain with the provider rather than being copied into MyDancr’s ordinary database.</w:t>
+        <w:t>Club fee terms, invoices, invoice items, payment status/references, verified redemption data, gross referral fee, dancer share, platform share, policy version, commission status, payout batches/items, provider beneficiary or account identifier, onboarding/eligibility state, failure reason, transfer reference, tax classification/documents or status, and agent order/attribution if an agent program is active. Full provider credentials, ID images collected solely for payment-account KYC, and external bank/card credentials should remain with the approved provider rather than being copied into MyDancr’s ordinary database.</w:t>
       </w:r>
     </w:p>
     <w:p>
@@ -4368,7 +4336,7 @@
     </w:p>
     <w:p>
       <w:r>
-        <w:t>Information comes from the User; clubs and authorized team members; dancers; agents under contract; automated device/browser events; NFC tags; content moderation; Yoti verification reports; approved payout provider payout and beneficiary status; the club billing processor; authentication, hosting, email, push, map, and support vendors; public sources used for club verification; other Users’ reports; and authorities where lawful.</w:t>
+        <w:t>Information comes from the User; clubs and authorized team members; dancers; agents under contract; automated device/browser events; NFC tags; content moderation; MyDancr verification records; an approved payout provider once selected; the club billing processor; authentication, hosting, email, push, map, and support vendors; public sources used for club verification; other Users’ reports; and authorities where lawful.</w:t>
       </w:r>
     </w:p>
     <w:p>
@@ -4508,17 +4476,17 @@
         <w:pStyle w:val="Heading2"/>
       </w:pPr>
       <w:r>
-        <w:t>6. Yoti identity and age verification</w:t>
-      </w:r>
-    </w:p>
-    <w:p>
-      <w:r>
-        <w:t>MyDancr directs an eligible dancer and, where required, a club representative or agent to a Yoti verification session. Depending on configuration, Yoti may collect an identity document, extracted attributes, a selfie, liveness and face-match data, fraud signals, and optional watchlist or address checks, then provide MyDancr with a report. Yoti states that it ordinarily acts as the service provider/processor for its client in a standard identity-verification session; MyDancr remains responsible for the verification purpose, lawful basis, notices, configuration, retention, access decisions, and response to rights requests concerning data MyDancr receives.</w:t>
-      </w:r>
-    </w:p>
-    <w:p>
-      <w:r>
-        <w:t>MyDancr should configure Yoti to return and retain only necessary attributes, set the shortest workable time-to-live, limit portal access, and document any downloaded report. Where biometric information is processed, MyDancr must present any required state-specific notice and consent and provide any legally required alternative. Yoti’s terms require public references to identify Yoti as the provider or use “powered by Yoti,” subject to the contracted brand rules.</w:t>
+        <w:t>6. MyDancr identity and age verification</w:t>
+      </w:r>
+    </w:p>
+    <w:p>
+      <w:r>
+        <w:t>MyDancr may require an eligible dancer and, where appropriate, a club representative or agent to provide evidence through the approved verification workflow. MyDancr remains responsible for the verification purpose, lawful basis, notices, requested evidence, retention, access decisions, appeals, and response to rights requests concerning verification data.</w:t>
+      </w:r>
+    </w:p>
+    <w:p>
+      <w:r>
+        <w:t>MyDancr should collect and retain only necessary verification evidence, set the shortest workable retention period, limit reviewer access, and document every decision. Biometric processing should not be introduced without counsel-approved notices, consent, retention, deletion, security, and legally required alternative procedures.</w:t>
       </w:r>
     </w:p>
     <w:p>
@@ -4526,17 +4494,17 @@
         <w:pStyle w:val="Heading2"/>
       </w:pPr>
       <w:r>
-        <w:t>7. approved payout provider commission payouts</w:t>
-      </w:r>
-    </w:p>
-    <w:p>
-      <w:r>
-        <w:t>To receive a payout, a dancer or authorized agent must establish and maintain an eligible approved payout provider payment account. approved payout provider may collect legal name, date of birth, address, business information, tax information, government identification, selfie/biometric verification, sanctions/KYC information, source-of-funds information, external account details, device/security data, and transaction data under its own terms and privacy policy. Its current privacy notice describes converting a face image to a facial template for KYC, not retaining the original facial image, and retaining the template for up to five years after account closure or last use where required by financial-sector and fraud-prevention obligations. MyDancr may exchange payee identifier, contact information, amount, currency, payment purpose, statement/reference, status, and compliance or failure results needed to execute and reconcile commissions. approved payout provider approval, restrictions, reserves, fees, account closure, and supported payment methods are independently controlled by the provider.</w:t>
-      </w:r>
-    </w:p>
-    <w:p>
-      <w:r>
-        <w:t>The published policy should identify the selected provider's contracted legal entity as the operator where that is the contracted legal entity, explain that approved provider may be a legacy or product name, and link to the exact production privacy notice and terms. MyDancr must update the notice and contract/vendor record before changing provider or sending materially different data.</w:t>
+        <w:t>7. Commission payout provider</w:t>
+      </w:r>
+    </w:p>
+    <w:p>
+      <w:r>
+        <w:t>Live payouts remain disabled until MyDancr selects a legally and contractually approved payout provider. To receive a payout after activation, a dancer or authorized agent must establish and maintain an eligible provider account. The provider may collect legal name, date of birth, address, business information, tax information, government identification, identity-verification data, sanctions/KYC information, source-of-funds information, external account details, device/security data, and transaction data under its own terms and privacy policy. MyDancr may exchange payee identifier, contact information, amount, currency, payment purpose, statement/reference, status, and compliance or failure results needed to execute and reconcile commissions. Provider approval, restrictions, reserves, fees, account closure, and supported payment methods are independently controlled by that provider.</w:t>
+      </w:r>
+    </w:p>
+    <w:p>
+      <w:r>
+        <w:t>The published policy must identify the selected provider’s contracted legal entity and link to its exact production privacy notice and terms before any live payout data is sent. MyDancr must update the notice and contract/vendor record before changing providers or sending materially different data.</w:t>
       </w:r>
     </w:p>
     <w:p>
@@ -4663,7 +4631,7 @@
     </w:p>
     <w:p>
       <w:r>
-        <w:t>The dancer represents that the dancer is at least 18, is the person operating the account, has legal capacity, and may lawfully work and publish the submitted content. The dancer must provide accurate identity and city information, complete the required Yoti session, and must not use another person’s documents, likeness, stage identity, or account. A stage name may be public; legal identity remains private except as required for Yoti verification, tax, approved payout provider payout, safety, or law.</w:t>
+        <w:t>The dancer represents that the dancer is at least 18, is the person operating the account, has legal capacity, and may lawfully work and publish the submitted content. The dancer must provide accurate identity and city information, complete the required MyDancr verification process, and must not use another person’s documents, likeness, stage identity, or account. A stage name may be public; legal identity remains private except as required for verification, tax, an approved payout provider, safety, or law.</w:t>
       </w:r>
     </w:p>
     <w:p>
@@ -4681,7 +4649,7 @@
     </w:p>
     <w:p>
       <w:r>
-        <w:t>Before the profile becomes public, the dancer must complete the required Yoti age/identity check, complete required profile fields, obtain approval of required media, submit the profile, and complete first club verification through the approved flow. A Yoti result supports identity and age assurance but is not a guarantee; a club confirmation verifies only the represented affiliation. MyDancr may require additional review or decline publication.</w:t>
+        <w:t>Before the profile becomes public, the dancer must complete the required MyDancr age/identity review, complete required profile fields, obtain approval of required media, submit the profile, and complete first club verification through the approved flow. A verification decision supports identity and age assurance but is not a guarantee; a club confirmation verifies only the represented affiliation. MyDancr may require additional review or decline publication.</w:t>
       </w:r>
     </w:p>
     <w:p>
@@ -4772,7 +4740,7 @@
     </w:p>
     <w:p>
       <w:r>
-        <w:t>The dancer must open and maintain an eligible approved payout provider payment account, complete the provider’s KYC and tax/compliance checks, maintain information matching the MyDancr payee record, and remain eligible. The dancer authorizes MyDancr to send commission payout instructions and required transaction/payee data to approved payout provider. Provider fees, foreign exchange, limits, supported countries, reserves, payment-method availability, compliance review, and holds may apply as disclosed. MyDancr does not control approved payout provider’s independent approval or account decisions.</w:t>
+        <w:t>After MyDancr selects and activates an approved payout provider, the dancer must open and maintain an eligible provider account, complete the provider’s KYC and tax/compliance checks, maintain information matching the MyDancr payee record, and remain eligible. The dancer authorizes MyDancr to send commission payout instructions and required transaction/payee data to that provider. Provider fees, foreign exchange, limits, supported countries, reserves, payment-method availability, compliance review, and holds may apply as disclosed. MyDancr does not control the provider’s independent approval or account decisions.</w:t>
       </w:r>
     </w:p>
     <w:p>
@@ -4874,7 +4842,7 @@
     </w:p>
     <w:p>
       <w:r>
-        <w:t>The dancer acknowledges the customer-facing limits of badges and status, the absence of guaranteed earnings, the role of club admission and independent club rules, Yoti’s verification role, approved payout provider’s commission-payout role, the public nature of approved profile content, dynamic ranking signals, and the separate Content/Media, Acceptable Use, Verification, Commission, Moderation, Privacy, and Retention policies.</w:t>
+        <w:t>The dancer acknowledges the customer-facing limits of badges and status, the absence of guaranteed earnings, the role of club admission and independent club rules, MyDancr’s verification role, a future approved payout provider’s commission-payout role, the public nature of approved profile content, dynamic ranking signals, and the separate Content/Media, Acceptable Use, Verification, Commission, Moderation, Privacy, and Retention policies.</w:t>
       </w:r>
     </w:p>
     <w:p>
@@ -5446,7 +5414,7 @@
     </w:p>
     <w:p>
       <w:r>
-        <w:t>Verification should be proportionate to role and action. Email confirmation is appropriate for basic account access but is not enough for a public dancer, club owner, authorized manager, payout recipient, or agent. High-risk roles require a configured Yoti check and/or other documented authority review. approved payout provider separately controls payment-account KYC for payout recipients.</w:t>
+        <w:t>Verification should be proportionate to role and action. Email confirmation is appropriate for basic account access but is not enough for a public dancer, club owner, authorized manager, payout recipient, or agent. High-risk roles require documented identity and/or authority review under MyDancr’s approved process. A selected approved payout provider will separately control payment-account KYC for payout recipients.</w:t>
       </w:r>
     </w:p>
     <w:p>
@@ -5459,12 +5427,12 @@
     </w:p>
     <w:p>
       <w:r>
-        <w:t>Before public approval, the dancer must complete a Yoti Identity Verification session configured to obtain the minimum necessary legal identity and date-of-birth result; complete document-authenticity, selfie/liveness, biometric face match, anti-spoofing or fraud checks selected by MyDancr; provide an avatar that can be compared to the person where appropriate; and meet media and venue gates. Public display uses stage name unless disclosure is legally required.</w:t>
-      </w:r>
-    </w:p>
-    <w:p>
-      <w:r>
-        <w:t>Yoti evidence and reports must be encrypted and access-restricted and must not be exposed to clubs beyond the minimum confirmation interface. MyDancr should record the Yoti session/reference, check configuration, result, dates, and decision—not unnecessary document or selfie copies—unless counsel requires retention. Yoti portal time-to-live and deletion settings must match the approved retention schedule. Any biometric notice/consent and alternative method required by applicable U.S. state law must be presented before collection.</w:t>
+        <w:t>Before public approval, the dancer must complete MyDancr’s approved identity and age review using the minimum evidence necessary; provide an avatar that can be compared to the person where appropriate; and meet media and venue gates. Public display uses stage name unless disclosure is legally required.</w:t>
+      </w:r>
+    </w:p>
+    <w:p>
+      <w:r>
+        <w:t>Verification evidence and decisions must be encrypted, access-restricted, and not exposed to clubs beyond the minimum confirmation interface. MyDancr should record the evidence category, result, dates, reviewer, and decision—not unnecessary document or selfie copies—unless counsel requires retention. Retention and deletion settings must match the approved schedule. Any biometric notice, consent, and alternative method required by applicable U.S. state law must be presented before collection if biometric processing is later introduced.</w:t>
       </w:r>
     </w:p>
     <w:p>
@@ -5529,7 +5497,7 @@
     </w:p>
     <w:p>
       <w:r>
-        <w:t>Payout recipients must complete approved payout provider onboarding and any MyDancr tax, sanctions, identity, and account-matching checks. MyDancr may rely on Yoti for platform identity and on approved payout provider for payment-account KYC, but must resolve mismatches before payout. An agent must also have a valid separate agreement and order. approved payout provider approval does not itself authorize a MyDancr agent commission; MyDancr’s written authorization and qualifying events are still required.</w:t>
+        <w:t>Payout recipients must complete the selected approved provider’s onboarding and any MyDancr tax, sanctions, identity, and account-matching checks. MyDancr uses its approved platform identity review and may rely on the selected provider for payment-account KYC, but must resolve mismatches before payout. An agent must also have a valid separate agreement and order. Provider approval does not itself authorize a MyDancr agent commission; MyDancr’s written authorization and qualifying events are still required.</w:t>
       </w:r>
     </w:p>
     <w:p>
@@ -5821,7 +5789,7 @@
     </w:p>
     <w:p>
       <w:r>
-        <w:t>These terms govern rewards for eligible dancers and, only if separately authorized, commissions for contracted agents. They do not govern club wages, tips, dancer services, customer purchases, or employment compensation. “Commission Event” means a server-created record that satisfies the applicable policy and attribution rules. “Profile-Originated Verified Redemption” means an allowed Club Deal redemption successfully confirmed by the correct club’s authorized cashier NFC tag where the immutable source captured before token issuance identifies an eligible dancer’s public profile—including a qualifying shift or deal surface presented within that profile—as the customer journey’s origin. “approved payout provider” means the approved provider-branded or successor approved provider payment-account service operated by the selected provider's contracted legal entity, as applicable to MyDancr’s contracted payout integration.</w:t>
+        <w:t>These terms govern rewards for eligible dancers and, only if separately authorized, commissions for contracted agents. They do not govern club wages, tips, dancer services, customer purchases, or employment compensation. “Commission Event” means a server-created record that satisfies the applicable policy and attribution rules. “Profile-Originated Verified Redemption” means an allowed Club Deal redemption successfully confirmed by the correct club’s authorized cashier NFC tag where the immutable source captured before token issuance identifies an eligible dancer’s public profile—including a qualifying shift or deal surface presented within that profile—as the customer journey’s origin. “Approved Payout Provider” means a legally suitable provider selected under a signed production contract after MyDancr’s business model and payout use case have been approved.</w:t>
       </w:r>
     </w:p>
     <w:p>
@@ -5956,17 +5924,17 @@
         <w:pStyle w:val="Heading2"/>
       </w:pPr>
       <w:r>
-        <w:t>7. approved payout provider onboarding</w:t>
-      </w:r>
-    </w:p>
-    <w:p>
-      <w:r>
-        <w:t>A payee must establish an eligible approved payout provider payment account, complete its identity/KYC, sanctions, tax, and account-matching checks, and authorize required data exchange. MyDancr may store the beneficiary/account identifier, onboarding status, payout eligibility, transfer reference, and error status but should not store full external account credentials. approved payout provider terms, country availability, account restrictions, reserves, limits, fees, inactivity charges, foreign exchange, payment methods, and review apply independently.</w:t>
-      </w:r>
-    </w:p>
-    <w:p>
-      <w:r>
-        <w:t>MyDancr will use approved payout provider for commission payouts under this version. If the integration or provider becomes unavailable or legally unsuitable, MyDancr may change providers with reasonable notice and a transition period, subject to accrued-payment duties and applicable law. The payee may need to complete new onboarding before further payout.</w:t>
+        <w:t>7. Payout-provider onboarding</w:t>
+      </w:r>
+    </w:p>
+    <w:p>
+      <w:r>
+        <w:t>A payee must establish an eligible account with the Approved Payout Provider, complete its identity/KYC, sanctions, tax, and account-matching checks, and authorize required data exchange. MyDancr may store the beneficiary/account identifier, onboarding status, payout eligibility, transfer reference, and error status but should not store full external account credentials. Provider terms, country availability, account restrictions, reserves, limits, fees, inactivity charges, foreign exchange, payment methods, and review apply independently.</w:t>
+      </w:r>
+    </w:p>
+    <w:p>
+      <w:r>
+        <w:t>MyDancr will not enable live commission payouts until an Approved Payout Provider is selected and configured. If the selected integration later becomes unavailable or legally unsuitable, MyDancr may change providers with reasonable notice and a transition period, subject to accrued-payment duties and applicable law. The payee may need to complete new onboarding before further payout.</w:t>
       </w:r>
     </w:p>
     <w:p>
@@ -6322,10 +6290,10 @@
         <w:rPr>
           <w:b/>
         </w:rPr>
-        <w:t>Yoti identity and age evidence:</w:t>
-      </w:r>
-      <w:r>
-        <w:t xml:space="preserve"> configure Yoti’s shortest workable time-to-live; retain in MyDancr primarily the session/reference, requested checks, result, decision, and dates; retain document/selfie/biometric material only when specifically justified by law and approved policy.</w:t>
+        <w:t>Identity and age evidence:</w:t>
+      </w:r>
+      <w:r>
+        <w:t xml:space="preserve"> retain only the evidence category, result, decision, reviewer, and dates for the shortest approved period; retain document, selfie, or biometric material only when specifically justified by law and approved policy.</w:t>
       </w:r>
     </w:p>
     <w:p>
@@ -6406,10 +6374,10 @@
         <w:rPr>
           <w:b/>
         </w:rPr>
-        <w:t>approved payout provider references:</w:t>
-      </w:r>
-      <w:r>
-        <w:t xml:space="preserve"> beneficiary/account identifier, transfer reference, status, amount, currency, failure/hold reason, and reconciliation record through the approved finance/statutory period; never retain the provider password or unnecessary payment-account credentials. The provider independently retains regulated KYC and transaction data under its policy, including the facial-template period it identifies.</w:t>
+        <w:t>Payout-provider references:</w:t>
+      </w:r>
+      <w:r>
+        <w:t xml:space="preserve"> beneficiary/account identifier, transfer reference, status, amount, currency, failure/hold reason, and reconciliation record through the approved finance/statutory period; never retain the provider password or unnecessary payment-account credentials. The provider independently retains regulated KYC and transaction data under its policy.</w:t>
       </w:r>
     </w:p>
     <w:p>
@@ -6655,7 +6623,7 @@
         <w:pStyle w:val="ListNumber"/>
       </w:pPr>
       <w:r>
-        <w:t>Execute and configure the Yoti organization/IDV agreement, data-processing terms, U.S. biometric addenda where applicable, requested-check template, time-to-live, portal access, incident process, and “powered by Yoti” disclosure.</w:t>
+        <w:t>Document and approve the identity/age verification workflow, reviewer authority, requested evidence, notices and consent, retention/deletion, security, appeal, incident, and fallback procedures before launch.</w:t>
       </w:r>
     </w:p>
     <w:p>
@@ -6663,7 +6631,7 @@
         <w:pStyle w:val="ListNumber"/>
       </w:pPr>
       <w:r>
-        <w:t>Execute and configure the approved payout provider business/sponsor-management and payout arrangements; confirm the selected provider's contracted legal entity legal identity, supported payee countries/currencies, KYC, funding, fees, reserves, transaction limits, complaints, data protection, and reconciliation.</w:t>
+        <w:t>Select, contract with, and configure an Approved Payout Provider; confirm its legal identity, supported payee countries/currencies, KYC, funding, fees, reserves, transaction limits, complaints, data protection, and reconciliation.</w:t>
       </w:r>
     </w:p>
     <w:p>
@@ -6671,7 +6639,7 @@
         <w:pStyle w:val="ListNumber"/>
       </w:pPr>
       <w:r>
-        <w:t>If agents launch, execute a separate Agent Agreement and order; implement role, authorization, attribution, statements, tax, approved payout provider payout, suspension, and deletion before any commission is promised.</w:t>
+        <w:t>If agents launch, execute a separate Agent Agreement and order; implement role, authorization, attribution, statements, tax, approved-provider payout, suspension, and deletion before any commission is promised.</w:t>
       </w:r>
     </w:p>
     <w:p>
@@ -6695,7 +6663,7 @@
         <w:pStyle w:val="ListNumber"/>
       </w:pPr>
       <w:r>
-        <w:t>Separate customer Terms acceptance from Dancer, Club, Agent, Media, Club Deal, Yoti, and approved payout provider payout acceptances/notices.</w:t>
+        <w:t>Separate customer Terms acceptance from Dancer, Club, Agent, Media, Club Deal, Verification, and approved-provider payout acceptances/notices.</w:t>
       </w:r>
     </w:p>
     <w:p>
@@ -6703,7 +6671,7 @@
         <w:pStyle w:val="ListNumber"/>
       </w:pPr>
       <w:r>
-        <w:t>Train verification reviewers; restrict Yoti portal/report access; test deletion and reverification.</w:t>
+        <w:t>Train verification reviewers; restrict verification-record access; test deletion and reverification.</w:t>
       </w:r>
     </w:p>
     <w:p>
@@ -6759,7 +6727,7 @@
         <w:pStyle w:val="ListNumber"/>
       </w:pPr>
       <w:r>
-        <w:t>Finalize approved payout provider payout schedule, minimum, tax, failure, hold, reversal, fee, and unclaimed-property handling.</w:t>
+        <w:t>Finalize the approved-provider payout schedule, minimum, tax, failure, hold, reversal, fee, and unclaimed-property handling.</w:t>
       </w:r>
     </w:p>
     <w:p>
@@ -6849,7 +6817,7 @@
         <w:t>Dancer:</w:t>
       </w:r>
       <w:r>
-        <w:t xml:space="preserve"> Terms + Privacy + Dancer Agreement + Content/Media License + Acceptable Use + Verification + Yoti notice/consent where required + approved payout provider Commission/Payout terms; renewed acceptance for material commission changes.</w:t>
+        <w:t xml:space="preserve"> Terms + Privacy + Dancer Agreement + Content/Media License + Acceptable Use + Verification notice/consent where required + approved-provider Commission/Payout terms; renewed acceptance for material commission changes.</w:t>
       </w:r>
     </w:p>
     <w:p>
@@ -6891,7 +6859,7 @@
         <w:t>Agent if launched:</w:t>
       </w:r>
       <w:r>
-        <w:t xml:space="preserve"> Terms + Privacy + separate Agent Agreement/order + Acceptable Use + Yoti verification notice + approved payout provider payout/tax terms + marketing standards.</w:t>
+        <w:t xml:space="preserve"> Terms + Privacy + separate Agent Agreement/order + Acceptable Use + identity-verification notice + approved-provider payout/tax terms + marketing standards.</w:t>
       </w:r>
     </w:p>
     <w:p>
@@ -6929,7 +6897,7 @@
         <w:pStyle w:val="ListBullet"/>
       </w:pPr>
       <w:r>
-        <w:t>Complete Yoti dancer onboarding with successful, failed, abandoned, manual-review, expired, mismatched, deleted, and reverification outcomes; then test approved, pending, rejected, deleted, and appealed media.</w:t>
+        <w:t>Complete dancer identity/age onboarding with successful, failed, abandoned, manual-review, expired, mismatched, deleted, and reverification outcomes; then test approved, pending, rejected, deleted, and appealed media.</w:t>
       </w:r>
     </w:p>
     <w:p>
@@ -6985,7 +6953,7 @@
         <w:pStyle w:val="ListBullet"/>
       </w:pPr>
       <w:r>
-        <w:t>Reconcile club invoice, profile-originated tier ordinals 1, 9, 10, 24, and 25, month reset, independent dancer payable, approved payout provider success/failure, KYC hold, reserve, wrong/mismatched beneficiary, correction, fee, and statement.</w:t>
+        <w:t>Reconcile club invoice, profile-originated tier ordinals 1, 9, 10, 24, and 25, month reset, independent dancer payable, payout-provider success/failure, KYC hold, reserve, wrong/mismatched beneficiary, correction, fee, and statement.</w:t>
       </w:r>
     </w:p>
     <w:p>
@@ -7237,162 +7205,6 @@
             <w:u w:val="single"/>
           </w:rPr>
           <w:t>https://www.clarkcountynv.gov/adobe/assets/urn%3Aaaid%3Aaem%3Aed9e0b17-c87d-46b8-9ee9-4e044cf84ac2/original/as/list-of-categories-and-fees.pdf](https://www.clarkcountynv.gov/adobe/assets/urn%3Aaaid%3Aaem%3Aed9e0b17-c87d-46b8-9ee9-4e044cf84ac2/original/as/list-of-categories-and-fees.pdf</w:t>
-        </w:r>
-      </w:hyperlink>
-      <w:r>
-        <w:t>)</w:t>
-      </w:r>
-    </w:p>
-    <w:p>
-      <w:pPr>
-        <w:pStyle w:val="ListBullet"/>
-      </w:pPr>
-      <w:r>
-        <w:rPr>
-          <w:b/>
-        </w:rPr>
-        <w:t>Yoti Identity Verification privacy notice:</w:t>
-      </w:r>
-      <w:r>
-        <w:t xml:space="preserve"> [</w:t>
-      </w:r>
-      <w:hyperlink r:id="rId23">
-        <w:r>
-          <w:rPr>
-            <w:color w:val="0891B2"/>
-            <w:u w:val="single"/>
-          </w:rPr>
-          <w:t>https://www.yoti.com/privacy/identity-verification/](https://www.yoti.com/privacy/identity-verification/</w:t>
-        </w:r>
-      </w:hyperlink>
-      <w:r>
-        <w:t>)</w:t>
-      </w:r>
-    </w:p>
-    <w:p>
-      <w:pPr>
-        <w:pStyle w:val="ListBullet"/>
-      </w:pPr>
-      <w:r>
-        <w:rPr>
-          <w:b/>
-        </w:rPr>
-        <w:t>Yoti organization terms:</w:t>
-      </w:r>
-      <w:r>
-        <w:t xml:space="preserve"> [</w:t>
-      </w:r>
-      <w:hyperlink r:id="rId24">
-        <w:r>
-          <w:rPr>
-            <w:color w:val="0891B2"/>
-            <w:u w:val="single"/>
-          </w:rPr>
-          <w:t>https://www.yoti.com/terms/organisations/](https://www.yoti.com/terms/organisations/</w:t>
-        </w:r>
-      </w:hyperlink>
-      <w:r>
-        <w:t>)</w:t>
-      </w:r>
-    </w:p>
-    <w:p>
-      <w:pPr>
-        <w:pStyle w:val="ListBullet"/>
-      </w:pPr>
-      <w:r>
-        <w:rPr>
-          <w:b/>
-        </w:rPr>
-        <w:t>Yoti identity-verification product description:</w:t>
-      </w:r>
-      <w:r>
-        <w:t xml:space="preserve"> [</w:t>
-      </w:r>
-      <w:hyperlink r:id="rId25">
-        <w:r>
-          <w:rPr>
-            <w:color w:val="0891B2"/>
-            <w:u w:val="single"/>
-          </w:rPr>
-          <w:t>https://www.yoti.com/business/identity-verification/](https://www.yoti.com/business/identity-verification/</w:t>
-        </w:r>
-      </w:hyperlink>
-      <w:r>
-        <w:t>)</w:t>
-      </w:r>
-    </w:p>
-    <w:p>
-      <w:pPr>
-        <w:pStyle w:val="ListBullet"/>
-      </w:pPr>
-      <w:r>
-        <w:rPr>
-          <w:b/>
-        </w:rPr>
-        <w:t>approved payout provider payment-account terms:</w:t>
-      </w:r>
-      <w:r>
-        <w:t xml:space="preserve"> [</w:t>
-      </w:r>
-      <w:hyperlink r:id="rId26">
-        <w:r>
-          <w:rPr>
-            <w:color w:val="0891B2"/>
-            <w:u w:val="single"/>
-          </w:rPr>
-          <w:t>https://www.mydancr.com](https://www.mydancr.com</w:t>
-        </w:r>
-      </w:hyperlink>
-      <w:r>
-        <w:t>)</w:t>
-      </w:r>
-    </w:p>
-    <w:p>
-      <w:pPr>
-        <w:pStyle w:val="ListBullet"/>
-      </w:pPr>
-      <w:r>
-        <w:rPr>
-          <w:b/>
-        </w:rPr>
-        <w:t>approved payout provider privacy policy:</w:t>
-      </w:r>
-      <w:r>
-        <w:t xml:space="preserve"> [</w:t>
-      </w:r>
-      <w:hyperlink r:id="rId27">
-        <w:r>
-          <w:rPr>
-            <w:color w:val="0891B2"/>
-            <w:u w:val="single"/>
-          </w:rPr>
-          <w:t>https://www.mydancr.com](https://www.mydancr.com</w:t>
-        </w:r>
-      </w:hyperlink>
-      <w:r>
-        <w:t>)</w:t>
-      </w:r>
-    </w:p>
-    <w:p>
-      <w:pPr>
-        <w:pStyle w:val="ListBullet"/>
-      </w:pPr>
-      <w:r>
-        <w:rPr>
-          <w:b/>
-        </w:rPr>
-        <w:t>approved payout provider payment-account overview:</w:t>
-      </w:r>
-      <w:r>
-        <w:t xml:space="preserve"> [</w:t>
-      </w:r>
-      <w:hyperlink r:id="rId28">
-        <w:r>
-          <w:rPr>
-            <w:color w:val="0891B2"/>
-            <w:u w:val="single"/>
-          </w:rPr>
-          <w:t>https://www.mydancr.com](https://www.mydancr.com</w:t>
         </w:r>
       </w:hyperlink>
       <w:r>

</xml_diff>

<commit_message>
docs: revise legal packet for Arizona pilot and NATS settlement
</commit_message>
<xml_diff>
--- a/docs/legal/MyDancr-Legal-Review-Packet.docx
+++ b/docs/legal/MyDancr-Legal-Review-Packet.docx
@@ -226,7 +226,7 @@
                 <w:color w:val="17131F"/>
                 <w:sz w:val="19"/>
               </w:rPr>
-              <w:t>August 18, 2026</w:t>
+              <w:t>August 21, 2026</w:t>
             </w:r>
           </w:p>
         </w:tc>
@@ -351,7 +351,7 @@
               <w:t xml:space="preserve">DRAFTING STATUS  </w:t>
             </w:r>
             <w:r>
-              <w:t>This is a working draft for licensed counsel. It is not legal advice, is not a legal opinion, and is not approved for publication or user acceptance. Defined terms avoid blanks where possible, but the publishing entity, governing law, dispute procedure, addresses, tax treatment, payout schedule, retention schedule, and insurance requirements must be finalized by counsel.</w:t>
+              <w:t>This is a working draft for licensed counsel. It is not legal advice, is not a legal opinion, and is not approved for publication or user acceptance. It records current product behavior, business-approved commercial positions, and identified implementation gaps so specialist counsel can refine the operative documents. The publishing entity, governing law, dispute procedure, addresses, tax treatment, settlement schedules, retention schedule, and insurance requirements must be finalized by counsel.</w:t>
             </w:r>
           </w:p>
         </w:tc>
@@ -396,10 +396,10 @@
                 <w:color w:val="0891B2"/>
                 <w:sz w:val="16"/>
               </w:rPr>
-              <w:t xml:space="preserve">PRODUCTION PROVIDERS  </w:t>
+              <w:t xml:space="preserve">PRODUCTION PROVIDERS AND SETTLEMENT MODEL  </w:t>
             </w:r>
             <w:r>
-              <w:t>This packet does not assume a third-party identity or age-verification provider. MyDancr controls its documented verification and approval workflow. No commission payout provider is currently designated. MyDancr must select a legally and contractually approved payout provider before live payouts are enabled, and the provider’s terms, privacy notice, geographic availability, and legal entity must be verified against the signed production contract before publication.</w:t>
+              <w:t>Yoti is the selected hosted age-verification service for the 18+ gate, subject to completion of production configuration and contract/privacy review. Too Much Media’s NATS affiliate platform is the selected dancer-commission settlement system: MyDancr calculates an eligible commission and exports the exact U.S.-dollar amount to the dancer’s verified NATS affiliate account. Clubs owe MyDancr negotiated, Club-Deal-specific referral fees and settle verified redemption statements once each week by ACH. Counsel must verify the contracting entities, account terms, geographic availability, KYC/tax allocation, privacy roles, settlement timing, fees, reserves, and operational responsibilities against the signed production contracts before publication.</w:t>
             </w:r>
           </w:p>
         </w:tc>
@@ -511,7 +511,7 @@
         <w:pStyle w:val="ListNumber"/>
       </w:pPr>
       <w:r>
-        <w:t>Draft Dancer Commission, Agent Referral, and Payout Terms.</w:t>
+        <w:t>Draft Dancer Commission and Too Much Media/NATS Settlement Terms.</w:t>
       </w:r>
     </w:p>
     <w:p>
@@ -601,7 +601,7 @@
               <w:t xml:space="preserve">CORE BOUNDARY  </w:t>
             </w:r>
             <w:r>
-              <w:t>Every public description, onboarding screen, sales script, agent script, moderation rule, and club workflow must preserve the line between lawful club promotion and arranging sexual services. The platform should not enable pricing, booking, messaging, negotiation, or payment for private or sexual services.</w:t>
+              <w:t>Every public description, onboarding screen, sales or marketing script, moderation rule, and club workflow must preserve the line between lawful club promotion and arranging sexual services. The platform should not enable pricing, booking, messaging, negotiation, or payment for private or sexual services.</w:t>
             </w:r>
           </w:p>
         </w:tc>
@@ -687,7 +687,7 @@
         <w:t>Club Deals:</w:t>
       </w:r>
       <w:r>
-        <w:t xml:space="preserve"> only admission and line-access offers are permitted. Alcohol, drink, bottle-service, sexual-service, gambling, cash-equivalent, or unlawful offers are prohibited.</w:t>
+        <w:t xml:space="preserve"> only admission and line-access offers are permitted. Alcohol, drink, bottle-service, sexual-service, gambling, cash-equivalent, or unlawful offers are prohibited. Each published Club Deal must have a negotiated Deal Order stating that offer’s referral fee and commercial terms; a different offer may have a different fee.</w:t>
       </w:r>
     </w:p>
     <w:p>
@@ -749,10 +749,10 @@
         <w:rPr>
           <w:b/>
         </w:rPr>
-        <w:t>Agent compensation:</w:t>
-      </w:r>
-      <w:r>
-        <w:t xml:space="preserve"> no person earns an agent commission merely by recruiting, referring, or claiming a relationship. Any agent program requires separate written authorization, an accepted Agent Order or rider, identity/tax verification, and event-based attribution. No multi-level or downline compensation is permitted.</w:t>
+        <w:t>No live agent commission program:</w:t>
+      </w:r>
+      <w:r>
+        <w:t xml:space="preserve"> the current product does not promise or operate an agent commission program. A future program would require separate product work, counsel review, written terms, event attribution, tax/compliance controls, and renewed acceptance; no recruiting or downline compensation is permitted.</w:t>
       </w:r>
     </w:p>
     <w:p>
@@ -763,10 +763,10 @@
         <w:rPr>
           <w:b/>
         </w:rPr>
-        <w:t>Identity verification:</w:t>
-      </w:r>
-      <w:r>
-        <w:t xml:space="preserve"> MyDancr is responsible for defining and operating its dancer age/identity review and any risk-based club or agent checks, including required notices, decision criteria, access controls, retention, appeals, and any lawful alternative.</w:t>
+        <w:t>Age and identity verification:</w:t>
+      </w:r>
+      <w:r>
+        <w:t xml:space="preserve"> Yoti is selected for the hosted 18+ verification gate. MyDancr remains responsible for defining the eligibility decision, notice, fallback/manual review, appeal, access, retention, and security controls and for any separate club-authority or dancer-identity checks not performed by Yoti.</w:t>
       </w:r>
     </w:p>
     <w:p>
@@ -777,10 +777,24 @@
         <w:rPr>
           <w:b/>
         </w:rPr>
-        <w:t>Payouts:</w:t>
-      </w:r>
-      <w:r>
-        <w:t xml:space="preserve"> live dancer and authorized-agent commission payouts remain disabled until MyDancr selects an approved payout provider. Once selected, payees must complete the provider’s secure onboarding, pass its KYC and compliance checks, and ensure that MyDancr and provider records match.</w:t>
+        <w:t>Dancer commission settlement:</w:t>
+      </w:r>
+      <w:r>
+        <w:t xml:space="preserve"> eligible dancer commissions are exported through the dancer’s verified NATS affiliate account on Too Much Media’s platform. MyDancr stores the minimum account linkage and immutable export/reconciliation record and does not process a second direct settlement while NATS is the active settlement provider.</w:t>
+      </w:r>
+    </w:p>
+    <w:p>
+      <w:pPr>
+        <w:pStyle w:val="ListBullet"/>
+      </w:pPr>
+      <w:r>
+        <w:rPr>
+          <w:b/>
+        </w:rPr>
+        <w:t>Club settlement:</w:t>
+      </w:r>
+      <w:r>
+        <w:t xml:space="preserve"> each club receives itemized weekly statements for verified redemptions and pays MyDancr once each week by ACH under the applicable Deal Order. The ACH authorization or credit instructions, cutoff, holidays, returns, disputes, taxes, and suspension rules must be finalized in the club order.</w:t>
       </w:r>
     </w:p>
     <w:p>
@@ -832,7 +846,7 @@
         <w:pStyle w:val="ListNumber"/>
       </w:pPr>
       <w:r>
-        <w:t>Decide whether the public service is Nevada-only at launch or available in additional states, and prepare a state-by-state licensing and privacy addendum before expansion.</w:t>
+        <w:t>Treat Las Vegas/Nevada as the existing demo market and Arizona as the planned first pilot market. Before the Arizona pilot, select the exact city/county and prepare an Arizona state-and-local addendum covering adult-entertainment and club licensing, advertising and admission offers, privacy/security, tax, worker/referral issues, ACH authorization, and any municipal entertainer/work-card requirements.</w:t>
       </w:r>
     </w:p>
     <w:p>
@@ -848,7 +862,7 @@
         <w:pStyle w:val="ListNumber"/>
       </w:pPr>
       <w:r>
-        <w:t>Approve the exact identity and age-verification workflow for dancers, club owners/managers, and agents, including requested evidence, reviewer access, consent and state-specific notices, retention, appeals, and fallback process.</w:t>
+        <w:t>Approve the exact identity, age, and authority-verification workflow for dancers and club owners/managers, including requested evidence, reviewer access, consent and state-specific notices, retention, appeals, and fallback process.</w:t>
       </w:r>
     </w:p>
     <w:p>
@@ -856,7 +870,7 @@
         <w:pStyle w:val="ListNumber"/>
       </w:pPr>
       <w:r>
-        <w:t>Confirm whether any uploaded media could fall within 18 U.S.C. §§ 2257/2257A and assign recordkeeping, labeling, custodian, inspection, and producer responsibilities.</w:t>
+        <w:t>Review and approve the Yoti production configuration and contract, including privacy roles, hosted-session disclosures, minimum-data return, retention, failed/abandoned flow, false-positive/false-negative handling, manual fallback, accessibility, and appeal.</w:t>
       </w:r>
     </w:p>
     <w:p>
@@ -864,7 +878,7 @@
         <w:pStyle w:val="ListNumber"/>
       </w:pPr>
       <w:r>
-        <w:t>Select and approve a legally suitable payout provider and its business configuration, beneficiary onboarding, payout cadence, minimum threshold, reserves/holds, rejected-payment procedure, inactivity treatment, fees, supported countries/currencies, sanctions screening, tax-document workflow, complaints path, and unclaimed-property handling.</w:t>
+        <w:t>Review and approve the Too Much Media/NATS production contract and business configuration, including the exact contracting entity, dancer affiliate onboarding, KYC/tax allocation, export and payment cadence, minimums, reserves/holds, rejected or ambiguous transactions, fees, supported countries/currencies, complaints, reconciliation, and unclaimed-property handling.</w:t>
       </w:r>
     </w:p>
     <w:p>
@@ -872,7 +886,7 @@
         <w:pStyle w:val="ListNumber"/>
       </w:pPr>
       <w:r>
-        <w:t>Decide whether an agent program will launch. If yes, approve a separate Agent Agreement, commission schedule, non-solicitation/marketing standards, attribution duration, clawback rules, and licensing analysis.</w:t>
+        <w:t>Confirm that no agent commission program will launch under these drafts. Any later agent program requires a separate agreement, implementation, acceptance flow, and legal review before any promise or accrual.</w:t>
       </w:r>
     </w:p>
     <w:p>
@@ -880,7 +894,7 @@
         <w:pStyle w:val="ListNumber"/>
       </w:pPr>
       <w:r>
-        <w:t>Approve the club referral-fee order form, invoice timing, payment processor, late fees, disputes, chargebacks, taxes, and collection procedure, and confirm the nonretroactive profile-originated dancer tiers—30% for monthly events 1–9, 40% for 10–24, and 50% for 25 and above—against tax, worker-classification, referral, and gaming/sweepstakes concerns.</w:t>
+        <w:t>Approve the Deal Order template for negotiated offer-specific referral fees and weekly ACH settlement, including offer terms, fee formula, statement period, authorization/credit method, debit or due day, holidays, returns, disputes, taxes, late fees, suspension, and collection; also confirm the nonretroactive profile-originated dancer tiers—30% for monthly events 1–9, 40% for 10–24, and 50% for 25 and above—against tax, worker-classification, referral, and gaming/sweepstakes concerns.</w:t>
       </w:r>
     </w:p>
     <w:p>
@@ -896,7 +910,7 @@
         <w:pStyle w:val="ListNumber"/>
       </w:pPr>
       <w:r>
-        <w:t>Approve warranty disclaimers, liability caps, indemnities, insurance minimums, and special allocation for clubs, dancers, agents, and the platform.</w:t>
+        <w:t>Approve warranty disclaimers, liability caps, indemnities, insurance minimums, and special allocation for clubs, dancers, customers, and the platform.</w:t>
       </w:r>
     </w:p>
     <w:p>
@@ -912,7 +926,7 @@
         <w:pStyle w:val="ListNumber"/>
       </w:pPr>
       <w:r>
-        <w:t>Confirm Nevada privacy requirements and whether CCPA/CPRA, other comprehensive state privacy laws, GDPR/UK GDPR, biometric laws, consumer-health-data laws, or employment/privacy laws apply.</w:t>
+        <w:t>Confirm Nevada requirements for the existing demo market and Arizona state plus selected-city/county requirements for the pilot, including privacy/security and breach notice, biometric/age-assurance, consumer protection, employment/privacy, adult-entertainment licensing, and tax; evaluate other state and international regimes only before further expansion.</w:t>
       </w:r>
     </w:p>
     <w:p>
@@ -936,8 +950,104 @@
         <w:pStyle w:val="ListNumber"/>
       </w:pPr>
       <w:r>
-        <w:t>Determine worker-classification, agency, referral, tax, and local licensing consequences without implying that MyDancr employs dancers or controls club performance work.</w:t>
-      </w:r>
+        <w:t>Determine worker-classification, referral, tax, ACH/NACHA, and local licensing consequences without implying that MyDancr employs dancers or controls club performance work.</w:t>
+      </w:r>
+    </w:p>
+    <w:tbl>
+      <w:tblPr>
+        <w:tblW w:type="auto" w:w="0"/>
+        <w:jc w:val="center"/>
+        <w:tblLook w:firstColumn="1" w:firstRow="1" w:lastColumn="0" w:lastRow="0" w:noHBand="0" w:noVBand="1" w:val="04A0"/>
+      </w:tblPr>
+      <w:tblGrid>
+        <w:gridCol w:w="10166"/>
+      </w:tblGrid>
+      <w:tr>
+        <w:tc>
+          <w:tcPr>
+            <w:tcW w:type="dxa" w:w="10166"/>
+            <w:shd w:fill="F3EEFF"/>
+            <w:tcMar>
+              <w:top w:w="120" w:type="dxa"/>
+              <w:start w:w="160" w:type="dxa"/>
+              <w:bottom w:w="120" w:type="dxa"/>
+              <w:end w:w="160" w:type="dxa"/>
+            </w:tcMar>
+            <w:tcBorders>
+              <w:start w:val="single" w:sz="22" w:color="6D28D9"/>
+              <w:top w:val="single" w:sz="4" w:color="6D28D9"/>
+              <w:bottom w:val="single" w:sz="4" w:color="6D28D9"/>
+              <w:end w:val="single" w:sz="4" w:color="6D28D9"/>
+            </w:tcBorders>
+          </w:tcPr>
+          <w:p>
+            <w:r>
+              <w:rPr>
+                <w:b/>
+                <w:color w:val="6D28D9"/>
+                <w:sz w:val="16"/>
+              </w:rPr>
+              <w:t xml:space="preserve">COUNSEL DIRECTION ON 18 U.S.C. §§ 2257/2257A  </w:t>
+            </w:r>
+            <w:r>
+              <w:t>At counsel’s direction, this packet does not propose §2257/§2257A producer-recordkeeping, labeling, custodian, or inspection obligations for MyDancr, dancers, or clubs. MyDancr’s product rules continue to prohibit minors and actual sexually explicit conduct and to require adult identity/age verification, consent, ownership, moderation, and prompt safety escalation. Counsel should revisit this conclusion only if the accepted content categories or MyDancr’s production role materially change.</w:t>
+            </w:r>
+          </w:p>
+        </w:tc>
+      </w:tr>
+    </w:tbl>
+    <w:p>
+      <w:pPr>
+        <w:spacing w:after="0"/>
+      </w:pPr>
+    </w:p>
+    <w:tbl>
+      <w:tblPr>
+        <w:tblW w:type="auto" w:w="0"/>
+        <w:jc w:val="center"/>
+        <w:tblLook w:firstColumn="1" w:firstRow="1" w:lastColumn="0" w:lastRow="0" w:noHBand="0" w:noVBand="1" w:val="04A0"/>
+      </w:tblPr>
+      <w:tblGrid>
+        <w:gridCol w:w="10166"/>
+      </w:tblGrid>
+      <w:tr>
+        <w:tc>
+          <w:tcPr>
+            <w:tcW w:type="dxa" w:w="10166"/>
+            <w:shd w:fill="F3EEFF"/>
+            <w:tcMar>
+              <w:top w:w="120" w:type="dxa"/>
+              <w:start w:w="160" w:type="dxa"/>
+              <w:bottom w:w="120" w:type="dxa"/>
+              <w:end w:w="160" w:type="dxa"/>
+            </w:tcMar>
+            <w:tcBorders>
+              <w:start w:val="single" w:sz="22" w:color="6D28D9"/>
+              <w:top w:val="single" w:sz="4" w:color="6D28D9"/>
+              <w:bottom w:val="single" w:sz="4" w:color="6D28D9"/>
+              <w:end w:val="single" w:sz="4" w:color="6D28D9"/>
+            </w:tcBorders>
+          </w:tcPr>
+          <w:p>
+            <w:r>
+              <w:rPr>
+                <w:b/>
+                <w:color w:val="6D28D9"/>
+                <w:sz w:val="16"/>
+              </w:rPr>
+              <w:t xml:space="preserve">ARIZONA PILOT  </w:t>
+            </w:r>
+            <w:r>
+              <w:t>The planned first pilot outside the Las Vegas demo market is Arizona. The operative documents should identify the selected Arizona launch city/county only after the club pipeline and local licensing review are confirmed.</w:t>
+            </w:r>
+          </w:p>
+        </w:tc>
+      </w:tr>
+    </w:tbl>
+    <w:p>
+      <w:pPr>
+        <w:spacing w:after="0"/>
+      </w:pPr>
     </w:p>
     <w:p>
       <w:r>
@@ -1027,7 +1137,7 @@
     </w:p>
     <w:p>
       <w:r>
-        <w:t>Administrators review profiles, photos, videos, social links, clubs, claims, affiliations, Club Deals, reports, support escalations, DMCA cases, NFC lifecycle, finance events, and operational health. Elevated actions should be role-restricted and audited. Support agents can respond within the authorized support scope and must not request passwords, reset codes, unnecessary government identification, or payout credentials by ordinary email.</w:t>
+        <w:t>Administrators review profiles, photos, videos, social links, clubs, claims, affiliations, Club Deals, reports, support escalations, DMCA cases, NFC lifecycle, finance events, and operational health. Elevated actions should be role-restricted and audited. Support agents can respond within the authorized support scope and must not request passwords, reset codes, unnecessary government identification, NATS credentials, or bank/ACH credentials by ordinary email.</w:t>
       </w:r>
     </w:p>
     <w:p>
@@ -1035,12 +1145,12 @@
         <w:pStyle w:val="Heading3"/>
       </w:pPr>
       <w:r>
-        <w:t>Authorized agent</w:t>
-      </w:r>
-    </w:p>
-    <w:p>
-      <w:r>
-        <w:t>An agent is not an ordinary customer, dancer, or club role. If MyDancr activates an agent program, an agent is a separately contracted business-development or referral participant with written authorization and a defined commission order. Agent compensation must be based on specified verified revenue events, not mere recruitment, account creation, or a downline. Agent personal, tax, and payout data remains private.</w:t>
+        <w:t>No current agent account or commission role</w:t>
+      </w:r>
+    </w:p>
+    <w:p>
+      <w:r>
+        <w:t>The audited product does not operate an agent account or agent commission program. A club team member, referral source, recruiter, or person who assists with onboarding is not entitled to compensation through MyDancr. Any later agent role would require a separate product map, agreement, acceptance flow, attribution ledger, tax/compliance process, privacy disclosure, and counsel review before launch.</w:t>
       </w:r>
     </w:p>
     <w:p>
@@ -1204,12 +1314,12 @@
         <w:pStyle w:val="Heading2"/>
       </w:pPr>
       <w:r>
-        <w:t>10. Referral fees, commissions, club receivables, and payouts</w:t>
-      </w:r>
-    </w:p>
-    <w:p>
-      <w:r>
-        <w:t xml:space="preserve">MyDancr maintains two independent finance relationships. First, the club owes MyDancr the referral fee stated in its active club fee term for each eligible verified redemption. Second, MyDancr owes a dancer a reward for an eligible </w:t>
+        <w:t>10. Referral fees, commissions, club receivables, and settlement</w:t>
+      </w:r>
+    </w:p>
+    <w:p>
+      <w:r>
+        <w:t xml:space="preserve">MyDancr maintains two independent finance relationships. First, the club owes MyDancr the referral fee stated in the accepted Deal Order for the specific Club Deal that produced each eligible verified redemption. Second, MyDancr owes a dancer a reward for an eligible </w:t>
       </w:r>
       <w:r>
         <w:rPr>
@@ -1218,7 +1328,7 @@
         <w:t>Profile-Originated Verified Redemption</w:t>
       </w:r>
       <w:r>
-        <w:t>. A Profile-Originated Verified Redemption is a nonexpired, nonduplicate, nonfraudulent Club Deal redemption successfully confirmed by the correct club’s authorized cashier NFC tag where the immutable server attribution captured before token issuance identifies that dancer’s public profile—including an eligible shift or deal surface presented within that profile—as the originating source. The dancer reward is MyDancr-funded and is not legally conditioned on MyDancr first collecting the club invoice, subject to fraud, reversal, legal hold, or other expressly stated payout conditions.</w:t>
+        <w:t>. A Profile-Originated Verified Redemption is a nonexpired, nonduplicate, nonfraudulent Club Deal redemption successfully confirmed by the correct club’s authorized cashier NFC tag where the immutable server attribution captured before token issuance identifies that dancer’s public profile—including an eligible shift or deal surface presented within that profile—as the originating source. The dancer reward is MyDancr-funded and is not legally conditioned on MyDancr first collecting the club’s weekly ACH settlement, subject to fraud, reversal, legal hold, or other expressly stated settlement conditions.</w:t>
       </w:r>
     </w:p>
     <w:p>
@@ -1232,35 +1342,78 @@
         <w:t>events 1–9 earn 30%; events 10–24 earn 40%; and events 25 and above earn 50% of the applicable MyDancr gross referral fee</w:t>
       </w:r>
       <w:r>
-        <w:t>. The commission month is the calendar month determined in the verified club’s configured local timezone. Tiers are incremental and nonretroactive: reaching a higher tier does not reprice earlier events. The applicable gross referral fee is the fee in the club’s effective fee term—not admission price, deal value, club revenue, tips, or compensation for dancer services. Each event snapshots its monthly ordinal, policy version, applicable gross fee, 3,000-, 4,000-, or 5,000-basis-point dancer share, currency, source profile, deal, club, dancer, shift/context, token, cashier confirmation, and audit data. A club-page-only redemption without dancer-profile attribution creates no dancer reward.</w:t>
-      </w:r>
-    </w:p>
-    <w:p>
-      <w:r>
-        <w:t>Club referral fees are set by an authorized administrator and require an active fee term before a deal can be published or redeemed. Clubs may request a change, but a request does not modify the effective rate until authorized. Club invoices aggregate verified receivables and preserve item-level redemption support.</w:t>
-      </w:r>
-    </w:p>
-    <w:p>
-      <w:r>
-        <w:t>Payouts to dancers and, if launched, separately authorized agents must be sent through a separately approved payout provider. MyDancr should store only the provider beneficiary or account identifier, onboarding state, eligibility state, last error, and transfer references, but not full payment-account credentials. The selected provider may collect identity, address, tax, sanctions, source-of-funds, payment-account, device, and transaction data under its own terms. Payees remain responsible for accurate matching information, maintaining an eligible provider account, and fees or taxes allocated to them in the applicable agreement.</w:t>
-      </w:r>
+        <w:t>. The commission month is the calendar month determined in the verified club’s configured local timezone. Tiers are incremental and nonretroactive: reaching a higher tier does not reprice earlier events. The applicable gross referral fee is the negotiated fee for that specific Club Deal—not admission price, deal value, club revenue, tips, or compensation for dancer services. Each event snapshots its monthly ordinal, policy version, applicable gross fee, 3,000-, 4,000-, or 5,000-basis-point dancer share, currency, source profile, Deal Order/deal, club, dancer, shift/context, token, cashier confirmation, and audit data. A club-page-only redemption without dancer-profile attribution creates no dancer reward.</w:t>
+      </w:r>
+    </w:p>
+    <w:p>
+      <w:r>
+        <w:t>Each Club Deal requires a mutually accepted written or electronic Deal Order stating the exact offer, eligibility, dates/hours, restrictions, per-redemption referral fee or other approved fee formula, currency, weekly settlement terms, and effective dates. A club may negotiate different economics for different deals. A proposed change does not affect an issued or verified redemption unless MyDancr and the club prospectively accept an amended Deal Order. Weekly statements aggregate verified receivables by deal and preserve item-level redemption support. The club pays MyDancr once each week by ACH under the accepted Deal Order.</w:t>
+      </w:r>
+    </w:p>
+    <w:p>
+      <w:r>
+        <w:t>Too Much Media’s NATS affiliate platform is the selected dancer-commission settlement system. An eligible dancer must provide and maintain a verified NATS affiliate account. MyDancr exports the exact eligible U.S.-dollar commission amount to that account and stores the minimum linkage, immutable export ledger, state, attempt, error, reconciliation, reversal, and provider reference needed to prevent duplicate settlement and resolve ambiguous outcomes. Too Much Media/NATS may separately collect identity, address, tax, sanctions, payment-account, device, and transaction data under its own terms. MyDancr should not copy full external payment credentials into its ordinary database. No live agent commission program is included in this packet.</w:t>
+      </w:r>
+    </w:p>
+    <w:tbl>
+      <w:tblPr>
+        <w:tblW w:type="auto" w:w="0"/>
+        <w:jc w:val="center"/>
+        <w:tblLook w:firstColumn="1" w:firstRow="1" w:lastColumn="0" w:lastRow="0" w:noHBand="0" w:noVBand="1" w:val="04A0"/>
+      </w:tblPr>
+      <w:tblGrid>
+        <w:gridCol w:w="10166"/>
+      </w:tblGrid>
+      <w:tr>
+        <w:tc>
+          <w:tcPr>
+            <w:tcW w:type="dxa" w:w="10166"/>
+            <w:shd w:fill="F5F4F7"/>
+            <w:tcMar>
+              <w:top w:w="120" w:type="dxa"/>
+              <w:start w:w="160" w:type="dxa"/>
+              <w:bottom w:w="120" w:type="dxa"/>
+              <w:end w:w="160" w:type="dxa"/>
+            </w:tcMar>
+            <w:tcBorders>
+              <w:start w:val="single" w:sz="22" w:color="5F5A67"/>
+              <w:top w:val="single" w:sz="4" w:color="5F5A67"/>
+              <w:bottom w:val="single" w:sz="4" w:color="5F5A67"/>
+              <w:end w:val="single" w:sz="4" w:color="5F5A67"/>
+            </w:tcBorders>
+          </w:tcPr>
+          <w:p>
+            <w:r>
+              <w:rPr>
+                <w:b/>
+                <w:color w:val="5F5A67"/>
+                <w:sz w:val="16"/>
+              </w:rPr>
+              <w:t xml:space="preserve">FINANCE-MODEL GAP  </w:t>
+            </w:r>
+            <w:r>
+              <w:t>Production code already supports NATS affiliate-account linkage and a durable commission-export ledger, but the club side still models a venue-level referral-fee term and monthly Stripe-oriented invoicing. Before the revised commercial terms are accepted, engineering must implement Deal-Order-specific fee snapshots, weekly itemized statements, the selected ACH debit or credit workflow, returns/retries and reconciliation, and matching tests. The legal drafts below describe the business-approved target model; this callout prevents that target from being mistaken for completed production behavior.</w:t>
+            </w:r>
+          </w:p>
+        </w:tc>
+      </w:tr>
+    </w:tbl>
+    <w:p>
+      <w:pPr>
+        <w:spacing w:after="0"/>
+      </w:pPr>
     </w:p>
     <w:p>
       <w:pPr>
         <w:pStyle w:val="Heading2"/>
       </w:pPr>
       <w:r>
-        <w:t>11. Agent referral model</w:t>
-      </w:r>
-    </w:p>
-    <w:p>
-      <w:r>
-        <w:t>No agent program should be inferred from a club team role or customer referral. If activated, the agent model should use: an administrator-approved agent record; a written agreement and commission order; identity verification appropriate to the agent; verified business, sanctions, and tax status; approved-provider payout readiness; a defined club or transaction attribution; a start/end date; a fixed rate or formula; and an immutable commission event created only after the qualifying verified event.</w:t>
-      </w:r>
-    </w:p>
-    <w:p>
-      <w:r>
-        <w:t>The model should prohibit commissions for recruiting other agents, impose no purchase or fee to participate, avoid earnings claims, and prevent self-dealing or duplicate attribution. Sponsor/upline language should not be used unless counsel has approved a lawful structure. If an agent helps onboard a club, the club must still independently accept its Club Agreement and fee order.</w:t>
+        <w:t>11. No agent referral program</w:t>
+      </w:r>
+    </w:p>
+    <w:p>
+      <w:r>
+        <w:t>No agent program, commission, or payment should be inferred from a club team role, customer referral, introduction, demo, or onboarding assistance. Any future agent model is outside this packet and must not launch without separate counsel-approved terms and completed product, attribution, tax, privacy, and settlement controls. Recruiting another agent or building a downline is prohibited.</w:t>
       </w:r>
     </w:p>
     <w:p>
@@ -1278,7 +1431,7 @@
     </w:p>
     <w:p>
       <w:r>
-        <w:t>Marketing and transactional messages must be classified separately. Marketing email needs compliant sender identity, postal address, and opt-out. Push and any future SMS require appropriate consent, preferences, revocation, and records. Security, account, legal, payout, and support messages may be sent despite marketing opt-out when necessary for the service relationship.</w:t>
+        <w:t>Marketing and transactional messages must be classified separately. Marketing email needs compliant sender identity, postal address, and opt-out. Push and any future SMS require appropriate consent, preferences, revocation, and records. Security, account, legal, commission-settlement, ACH, and support messages may be sent despite marketing opt-out when necessary for the service relationship.</w:t>
       </w:r>
     </w:p>
     <w:p>
@@ -1291,7 +1444,7 @@
     </w:p>
     <w:p>
       <w:r>
-        <w:t>Users can report profiles, clubs, videos, offers, and other supported targets. A report record includes reporter/account or contact context, category, description, target, state, timestamps, and administrative actions. Support uses threads and messages, may use AI-assisted drafting or triage, and escalates to administrators. AI support should not make legal, safety, payout, or approval decisions without authorized review.</w:t>
+        <w:t>Users can report profiles, clubs, videos, offers, and other supported targets. A report record includes reporter/account or contact context, category, description, target, state, timestamps, and administrative actions. Support uses threads and messages, may use AI-assisted drafting or triage, and escalates to administrators. AI support should not make legal, safety, financial-settlement, or approval decisions without authorized review.</w:t>
       </w:r>
     </w:p>
     <w:p>
@@ -1314,7 +1467,7 @@
     </w:p>
     <w:p>
       <w:r>
-        <w:t>Some records cannot be deleted immediately: verified redemptions; invoices; payout and tax records; security/fraud events; moderation and consent evidence; DMCA notices/counters/strikes; support and legal correspondence; club agreements and fee terms; agent orders; and records subject to a legal hold. These retained records should be minimized, access-restricted, and used only for the applicable legal, accounting, security, or dispute purpose.</w:t>
+        <w:t>Some records cannot be deleted immediately: verified redemptions; Deal Orders; weekly statements and ACH records; commission, NATS export, and tax records; security/fraud events; moderation and consent evidence; DMCA notices/counters/strikes; support and legal correspondence; club agreements; and records subject to a legal hold. These retained records should be minimized, access-restricted, and used only for the applicable legal, accounting, security, or dispute purpose.</w:t>
       </w:r>
     </w:p>
     <w:p>
@@ -1431,10 +1584,10 @@
         <w:rPr>
           <w:b/>
         </w:rPr>
-        <w:t>Payment processor for club billing:</w:t>
-      </w:r>
-      <w:r>
-        <w:t xml:space="preserve"> club billing and invoice payment data, as implemented at launch.</w:t>
+        <w:t>Yoti:</w:t>
+      </w:r>
+      <w:r>
+        <w:t xml:space="preserve"> hosted 18+ verification session and privacy-minimized pass/fail result, subject to production contract and configuration review. MyDancr’s planned audit record excludes date of birth, exact age, identity-document images, and biometric media.</w:t>
       </w:r>
     </w:p>
     <w:p>
@@ -1445,10 +1598,24 @@
         <w:rPr>
           <w:b/>
         </w:rPr>
-        <w:t>Approved payout provider, once selected:</w:t>
-      </w:r>
-      <w:r>
-        <w:t xml:space="preserve"> beneficiary payment-account onboarding, KYC/AML, account status, payout execution, fees, reserves/holds, failures, transaction history, and compliance. The contracted legal entity, onboarding flow, supported countries, and price schedule must match production.</w:t>
+        <w:t>ACH processor and banking partners for club settlement:</w:t>
+      </w:r>
+      <w:r>
+        <w:t xml:space="preserve"> club legal/account identifiers, authorization or payment instructions, weekly statement amount, status, return code, trace/reference, and reconciliation data. The actual processor and allocation of authorization, notices, retries, fees, and security duties must match the signed production setup.</w:t>
+      </w:r>
+    </w:p>
+    <w:p>
+      <w:pPr>
+        <w:pStyle w:val="ListBullet"/>
+      </w:pPr>
+      <w:r>
+        <w:rPr>
+          <w:b/>
+        </w:rPr>
+        <w:t>Too Much Media/NATS:</w:t>
+      </w:r>
+      <w:r>
+        <w:t xml:space="preserve"> dancer affiliate-account linkage, account status, exact commission export, provider transaction/reference, processing status, failure or reconciliation state, and any KYC/tax/payment data processed independently under Too Much Media/NATS terms. The contracted entity and production configuration must match the signed agreement.</w:t>
       </w:r>
     </w:p>
     <w:tbl>
@@ -1488,7 +1655,7 @@
               <w:t xml:space="preserve">LAUNCH SYNCHRONIZATION  </w:t>
             </w:r>
             <w:r>
-              <w:t>Before publication, product and counsel must compare this map against production environment variables, processor contracts, database migrations, storage buckets, notification templates, analytics events, and all live pages. Provider names should appear in the privacy policy only when the processor is actually selected and under contract.</w:t>
+              <w:t>Before publication, product and counsel must compare this map against production environment variables, processor contracts, database migrations, storage buckets, notification templates, analytics events, and all live pages. Yoti, the selected ACH processor/bank setup, and Too Much Media/NATS must not be presented as active beyond the contract and production configuration actually in force.</w:t>
             </w:r>
           </w:p>
         </w:tc>
@@ -1831,7 +1998,7 @@
               <w:rPr>
                 <w:sz w:val="14"/>
               </w:rPr>
-              <w:t>Auth + draft dancer profile; staged onboarding; MyDancr identity/age review required</w:t>
+              <w:t>Auth + draft dancer profile; staged onboarding; hosted Yoti 18+ gate and MyDancr eligibility review required</w:t>
             </w:r>
           </w:p>
         </w:tc>
@@ -1877,7 +2044,7 @@
               <w:rPr>
                 <w:sz w:val="14"/>
               </w:rPr>
-              <w:t>Email confirmation; verification decision; account state; audit</w:t>
+              <w:t>Email confirmation; privacy-minimized verification decision; account state; audit</w:t>
             </w:r>
           </w:p>
         </w:tc>
@@ -2631,7 +2798,7 @@
               <w:rPr>
                 <w:sz w:val="14"/>
               </w:rPr>
-              <w:t>Admission/line-access terms, active fee term</w:t>
+              <w:t>Admission/line-access terms + accepted offer-specific Deal Order</w:t>
             </w:r>
           </w:p>
         </w:tc>
@@ -2653,7 +2820,7 @@
               <w:rPr>
                 <w:sz w:val="14"/>
               </w:rPr>
-              <w:t>Authorization and deal-policy validation</w:t>
+              <w:t>Authorization, deal-policy, fee, dates, and active-deal validation</w:t>
             </w:r>
           </w:p>
         </w:tc>
@@ -2697,7 +2864,7 @@
               <w:rPr>
                 <w:sz w:val="14"/>
               </w:rPr>
-              <w:t>Deal record; club/admin activity</w:t>
+              <w:t>Deal Order + fee snapshot + deal + club/admin activity</w:t>
             </w:r>
           </w:p>
         </w:tc>
@@ -2983,7 +3150,7 @@
               <w:rPr>
                 <w:sz w:val="14"/>
               </w:rPr>
-              <w:t>Profile-originated verified redemption + club referral fee</w:t>
+              <w:t>Profile-originated verified redemption + that deal’s negotiated referral fee</w:t>
             </w:r>
           </w:p>
         </w:tc>
@@ -3029,7 +3196,7 @@
               <w:rPr>
                 <w:sz w:val="14"/>
               </w:rPr>
-              <w:t>Club receivable; independent dancer payable</w:t>
+              <w:t>Independent dancer commission eligible for NATS export</w:t>
             </w:r>
           </w:p>
         </w:tc>
@@ -3052,7 +3219,7 @@
               <w:rPr>
                 <w:sz w:val="14"/>
               </w:rPr>
-              <w:t>Immutable source + monthly ordinal + 3,000/4,000/5,000 bp + policy version</w:t>
+              <w:t>Immutable source + Deal Order/fee + monthly ordinal + 3,000/4,000/5,000 bp + policy version</w:t>
             </w:r>
           </w:p>
         </w:tc>
@@ -3079,7 +3246,7 @@
               <w:rPr>
                 <w:sz w:val="14"/>
               </w:rPr>
-              <w:t>Payout scheduled</w:t>
+              <w:t>Commission exported</w:t>
             </w:r>
           </w:p>
         </w:tc>
@@ -3101,7 +3268,7 @@
               <w:rPr>
                 <w:sz w:val="14"/>
               </w:rPr>
-              <w:t>Payee identity, approved-provider beneficiary ID, amount, tax/compliance state</w:t>
+              <w:t>Verified NATS affiliate ID + exact eligible USD amount</w:t>
             </w:r>
           </w:p>
         </w:tc>
@@ -3123,7 +3290,7 @@
               <w:rPr>
                 <w:sz w:val="14"/>
               </w:rPr>
-              <w:t>Approved provider executes, holds, or rejects transfer</w:t>
+              <w:t>Durable NATS outbox exports once; ambiguous responses require reconciliation</w:t>
             </w:r>
           </w:p>
         </w:tc>
@@ -3145,7 +3312,7 @@
               <w:rPr>
                 <w:sz w:val="14"/>
               </w:rPr>
-              <w:t>Dancer or authorized agent payment account</w:t>
+              <w:t>Too Much Media/NATS affiliate ledger</w:t>
             </w:r>
           </w:p>
         </w:tc>
@@ -3167,7 +3334,7 @@
               <w:rPr>
                 <w:sz w:val="14"/>
               </w:rPr>
-              <w:t>Batch/item/reference/status; no provider password or full credentials in app DB</w:t>
+              <w:t>Linkage + attempt/status + provider reference + reversal; no external account credentials in app DB</w:t>
             </w:r>
           </w:p>
         </w:tc>
@@ -3195,7 +3362,7 @@
               <w:rPr>
                 <w:sz w:val="14"/>
               </w:rPr>
-              <w:t>Club pays invoice</w:t>
+              <w:t>Club settles weekly</w:t>
             </w:r>
           </w:p>
         </w:tc>
@@ -3218,7 +3385,7 @@
               <w:rPr>
                 <w:sz w:val="14"/>
               </w:rPr>
-              <w:t>Invoice, verified redemptions, payment reference</w:t>
+              <w:t>Weekly itemized statement + accepted ACH authorization/instructions</w:t>
             </w:r>
           </w:p>
         </w:tc>
@@ -3241,7 +3408,7 @@
               <w:rPr>
                 <w:sz w:val="14"/>
               </w:rPr>
-              <w:t>Club receivable reconciliation</w:t>
+              <w:t>ACH debit or credit, return/retry, and receivable reconciliation</w:t>
             </w:r>
           </w:p>
         </w:tc>
@@ -3264,7 +3431,7 @@
               <w:rPr>
                 <w:sz w:val="14"/>
               </w:rPr>
-              <w:t>Settled club invoice</w:t>
+              <w:t>MyDancr club receivable settled</w:t>
             </w:r>
           </w:p>
         </w:tc>
@@ -3287,7 +3454,7 @@
               <w:rPr>
                 <w:sz w:val="14"/>
               </w:rPr>
-              <w:t>Invoice/item/payment records; separate from dancer reward</w:t>
+              <w:t>Statement/item + ACH trace/status/return; separate from dancer commission</w:t>
             </w:r>
           </w:p>
         </w:tc>
@@ -3802,7 +3969,7 @@
         <w:t>Service</w:t>
       </w:r>
       <w:r>
-        <w:t>). “Company,” “MyDancr,” “we,” “us,” or “our” means the legal entity identified in the published version and acceptance record. “User” means any visitor or account holder. Separate Dancer, Club, Agent, Media, Deal, Payout, and other terms apply when a User uses those features. If separate terms conflict with these Terms, the more specific terms govern that feature.</w:t>
+        <w:t>). “Company,” “MyDancr,” “we,” “us,” or “our” means the legal entity identified in the published version and acceptance record. “User” means any visitor or account holder. Separate Dancer, Club, Media, Deal, Verification, Commission Settlement, Deal Order, ACH, and other terms apply when a User uses those features. If separate terms conflict with these Terms, the more specific terms govern that feature.</w:t>
       </w:r>
     </w:p>
     <w:p>
@@ -3820,7 +3987,7 @@
     </w:p>
     <w:p>
       <w:r>
-        <w:t>A User must be at least 18 years old and legally capable of entering a contract. A club may require a higher age for entry, and nothing in the Service overrides alcohol, gaming, adult-entertainment, employment, work-card, or local licensing laws. Dancers, club representatives, and agents must satisfy the additional verification and authority requirements in their agreements. The Service is unavailable to suspended users, sanctioned persons, or anyone barred by law.</w:t>
+        <w:t>A User must be at least 18 years old and legally capable of entering a contract. A club may require a higher age for entry, and nothing in the Service overrides alcohol, gaming, adult-entertainment, employment, work-card, or local licensing laws. Dancers and club representatives must satisfy the additional verification and authority requirements in their agreements. The Service is unavailable to suspended users, sanctioned persons, or anyone barred by law.</w:t>
       </w:r>
     </w:p>
     <w:p>
@@ -3897,7 +4064,7 @@
     </w:p>
     <w:p>
       <w:r>
-        <w:t>Attribution may record the club page, dancer profile, shift, deal, session, and NFC confirmation that led to a verified redemption. MyDancr may use this attribution to invoice clubs and calculate rewards. Users may not manipulate source attribution, create duplicate redemptions, simulate taps, or interfere with tags.</w:t>
+        <w:t>Attribution may record the club page, dancer profile, shift, deal, session, and NFC confirmation that led to a verified redemption. MyDancr may use this attribution to create weekly club statements, reconcile ACH, and calculate dancer commissions. Users may not manipulate source attribution, create duplicate redemptions, simulate taps, or interfere with tags.</w:t>
       </w:r>
     </w:p>
     <w:p>
@@ -3905,17 +4072,17 @@
         <w:pStyle w:val="Heading2"/>
       </w:pPr>
       <w:r>
-        <w:t>7. Payments and payouts</w:t>
-      </w:r>
-    </w:p>
-    <w:p>
-      <w:r>
-        <w:t>Customer use of a Club Deal does not authorize MyDancr to charge the customer unless a separate purchase flow clearly states a charge. Clubs may owe contractual referral fees and subscription or service charges. Under the current Dancer Commission Terms, a Profile-Originated Verified Redemption earns the attributed dancer 30%, 40%, or 50% of the applicable MyDancr gross referral fee according to whether it is the dancer’s 1st–9th, 10th–24th, or 25th-and-later qualifying event in the commission month; the detailed attribution, exclusions, correction, and payout rules control. Authorized agents may receive commissions only under a separate written order. Live commission payouts require a separately approved payout provider and an eligible provider account. Club billing may use a different payment processor. Each financial provider is subject to availability, eligibility, compliance review, and its own terms.</w:t>
-      </w:r>
-    </w:p>
-    <w:p>
-      <w:r>
-        <w:t>MyDancr may delay or withhold a payout during a reasonable investigation of fraud, sanctions, duplicate attribution, legal process, processor review, chargeback, mistake, or policy violation. MyDancr will not withhold an undisputed earned amount solely because a club is late paying an independent club invoice where the applicable commission terms state the reward is Company-funded.</w:t>
+        <w:t>7. Club payments and dancer commission settlement</w:t>
+      </w:r>
+    </w:p>
+    <w:p>
+      <w:r>
+        <w:t>Customer use of a Club Deal does not authorize MyDancr to charge the customer unless a separate purchase flow clearly states a charge. A club owes the negotiated referral fee for each eligible verified redemption under the Deal Order governing that specific Club Deal and pays MyDancr once each week by ACH. Under the Dancer Commission Terms, a Profile-Originated Verified Redemption earns the attributed dancer 30%, 40%, or 50% of that deal’s applicable MyDancr gross referral fee according to whether it is the dancer’s 1st–9th, 10th–24th, or 25th-and-later qualifying event in the commission month. Eligible dancer commissions are exported to the dancer’s verified NATS affiliate account through Too Much Media’s platform. The detailed attribution, exclusions, correction, settlement, and third-party-account rules control. No live agent commission program is promised by these Terms.</w:t>
+      </w:r>
+    </w:p>
+    <w:p>
+      <w:r>
+        <w:t>MyDancr may delay or hold a commission export during a reasonable investigation of fraud, sanctions, duplicate attribution, legal process, provider review, ACH return, mistake, or policy violation. MyDancr will not hold an undisputed earned amount solely because a club is late on its independent weekly ACH obligation where the applicable commission terms state the reward is Company-funded.</w:t>
       </w:r>
     </w:p>
     <w:p>
@@ -3941,7 +4108,7 @@
     </w:p>
     <w:p>
       <w:r>
-        <w:t>Links and integrations may lead to clubs, social networks, maps, rideshare providers, authentication/email/push providers, an approved payout provider once selected, and the club billing processor. Third parties control their own services, terms, availability, and data practices. A link or technical integration does not imply endorsement or partnership. The User is responsible for reviewing third-party terms.</w:t>
+        <w:t>Links and integrations may lead to clubs, social networks, maps, rideshare providers, authentication/email/push providers, Yoti, Too Much Media/NATS, and the ACH processor or banking partners used for club settlement. Third parties control their own services, terms, availability, and data practices. A link or technical integration does not imply endorsement or partnership. The User is responsible for reviewing applicable third-party terms.</w:t>
       </w:r>
     </w:p>
     <w:p>
@@ -3993,7 +4160,7 @@
     </w:p>
     <w:p>
       <w:r>
-        <w:t>The Privacy Policy explains collection, use, disclosure, retention, rights, and choices. Users must not collect, export, or misuse another person’s data from the Service. Clubs and agents that separately determine a purpose for personal information are responsible for their own privacy compliance.</w:t>
+        <w:t>The Privacy Policy explains collection, use, disclosure, retention, rights, and choices. Users must not collect, export, or misuse another person’s data from the Service. Clubs that separately determine a purpose for personal information are responsible for their own privacy compliance.</w:t>
       </w:r>
     </w:p>
     <w:p>
@@ -4024,7 +4191,7 @@
     </w:p>
     <w:p>
       <w:r>
-        <w:t>The published version should contain counsel-approved exclusions and a liability cap appropriate to consumer law and the separate commercial agreements. It should distinguish direct platform claims from interactions at clubs, user content, transportation, third-party services, lost profits, and unauthorized conduct. Any cap should preserve nonwaivable rights and address whether club and agent agreements use a different negotiated cap.</w:t>
+        <w:t>The published version should contain counsel-approved exclusions and a liability cap appropriate to consumer law and the separate commercial agreements. It should distinguish direct platform claims from interactions at clubs, user content, transportation, third-party services, lost profits, and unauthorized conduct. Any cap should preserve nonwaivable rights and address whether club agreements use a different negotiated cap.</w:t>
       </w:r>
     </w:p>
     <w:tbl>
@@ -4085,7 +4252,7 @@
     </w:p>
     <w:p>
       <w:r>
-        <w:t>Dancers, clubs, and agents should indemnify Company for third-party claims arising from their content, authority, agreements, unlawful conduct, licensing failures, offers, marketing statements, tax obligations, or breach, subject to counsel-approved procedure and applicable law. Consumer indemnity should be narrowed to lawful scope and should not shift Company’s own negligence or statutory obligations.</w:t>
+        <w:t>Dancers and clubs should indemnify Company for third-party claims arising from their content, authority, agreements, unlawful conduct, licensing failures, offers, marketing statements, tax obligations, or breach, subject to counsel-approved procedure and applicable law. Consumer indemnity should be narrowed to lawful scope and should not shift Company’s own negligence or statutory obligations.</w:t>
       </w:r>
     </w:p>
     <w:p>
@@ -4111,7 +4278,7 @@
     </w:p>
     <w:p>
       <w:r>
-        <w:t>The final Terms must identify governing law, judicial venue or arbitration administrator/rules, class and jury waivers if used, small-claims rights, consumer-law savings, notice address, and any opt-out period. Commercial Club and Agent Agreements may use different negotiated dispute terms.</w:t>
+        <w:t>The final Terms must identify governing law, judicial venue or arbitration administrator/rules, class and jury waivers if used, small-claims rights, consumer-law savings, notice address, and any opt-out period. Commercial Club Agreements may use different negotiated dispute terms.</w:t>
       </w:r>
     </w:p>
     <w:tbl>
@@ -4198,7 +4365,7 @@
     </w:p>
     <w:p>
       <w:r>
-        <w:t>This Privacy Policy applies to personal information processed by MyDancr through the Service. Any payout provider selected in the future will process beneficiary and payment-account data under its own terms and privacy notice. This policy does not govern independent club practices, third-party social sites, maps, rideshare providers, or providers acting independently. The published version must identify the MyDancr controller/business legal entity and contact methods.</w:t>
+        <w:t>This Privacy Policy applies to personal information processed by MyDancr through the Service. Yoti processes hosted age-verification data, Too Much Media/NATS processes dancer affiliate and commission-settlement data, and the selected ACH processor or banking partners process club payment data under the applicable contracts, notices, and independent terms. This policy does not govern independent club practices, third-party social sites, maps, rideshare providers, or a provider acting independently. The published version must identify the MyDancr controller/business legal entity, contact methods, actual production providers, and each provider’s privacy role.</w:t>
       </w:r>
     </w:p>
     <w:p>
@@ -4245,7 +4412,7 @@
     </w:p>
     <w:p>
       <w:r>
-        <w:t>Club name, address, location coordinates, contact information, hours, website, public media, offers, team members, owner/manager/staff role, access code/invitation/claim data, authority evidence, NFC tag assignments, fee terms, invoices, and activity logs.</w:t>
+        <w:t>Club name, address, location coordinates, contact information, hours, website, public media, offers, team members, owner/manager/staff role, access code/invitation/claim data, authority evidence, NFC tag assignments, Deal Orders, offer-specific fee terms, weekly statements, ACH authorization/payment status and references, and activity logs.</w:t>
       </w:r>
     </w:p>
     <w:p>
@@ -4292,12 +4459,12 @@
         <w:pStyle w:val="Heading3"/>
       </w:pPr>
       <w:r>
-        <w:t>Finance, commission, tax, and payout data</w:t>
-      </w:r>
-    </w:p>
-    <w:p>
-      <w:r>
-        <w:t>Club fee terms, invoices, invoice items, payment status/references, verified redemption data, gross referral fee, dancer share, platform share, policy version, commission status, payout batches/items, provider beneficiary or account identifier, onboarding/eligibility state, failure reason, transfer reference, tax classification/documents or status, and agent order/attribution if an agent program is active. Full provider credentials, ID images collected solely for payment-account KYC, and external bank/card credentials should remain with the approved provider rather than being copied into MyDancr’s ordinary database.</w:t>
+        <w:t>Finance, commission, tax, and settlement data</w:t>
+      </w:r>
+    </w:p>
+    <w:p>
+      <w:r>
+        <w:t>Deal Orders, deal-specific fee snapshots, weekly club statements and items, ACH authorization/payment status, returns and trace/reconciliation references, verified redemption data, gross referral fee, dancer share, platform share, policy version, commission status, NATS affiliate login/account linkage and verification state, immutable commission-export events, attempt/error/reconciliation state, provider transaction/reference, tax classification/documents or status, and reversals. Full Yoti evidence, NATS or ACH credentials, external bank credentials, and identity images collected solely by a provider should remain with that provider rather than being copied into MyDancr’s ordinary database.</w:t>
       </w:r>
     </w:p>
     <w:p>
@@ -4336,7 +4503,7 @@
     </w:p>
     <w:p>
       <w:r>
-        <w:t>Information comes from the User; clubs and authorized team members; dancers; agents under contract; automated device/browser events; NFC tags; content moderation; MyDancr verification records; an approved payout provider once selected; the club billing processor; authentication, hosting, email, push, map, and support vendors; public sources used for club verification; other Users’ reports; and authorities where lawful.</w:t>
+        <w:t>Information comes from the User; clubs and authorized team members; dancers; automated device/browser events; NFC tags; content moderation; MyDancr verification records; Yoti; Too Much Media/NATS; the selected ACH processor or banking partners; authentication, hosting, email, push, map, and support vendors; public sources used for club verification; other Users’ reports; and authorities where lawful.</w:t>
       </w:r>
     </w:p>
     <w:p>
@@ -4408,7 +4575,7 @@
         <w:pStyle w:val="ListBullet"/>
       </w:pPr>
       <w:r>
-        <w:t>Invoice clubs, calculate commissions, process payouts, reconcile failures, and meet tax/accounting duties.</w:t>
+        <w:t>Create weekly club statements, reconcile ACH, calculate commissions, export eligible dancer commissions to NATS, reconcile failures, and meet tax/accounting duties.</w:t>
       </w:r>
     </w:p>
     <w:p>
@@ -4453,12 +4620,12 @@
     </w:p>
     <w:p>
       <w:r>
-        <w:t>MyDancr may disclose data to vendors acting under contract for hosting/database/storage/authentication, content moderation, push, email, maps, support, security, club payment processing, payout processing, and professional services. The minimum data necessary should be disclosed for the function.</w:t>
-      </w:r>
-    </w:p>
-    <w:p>
-      <w:r>
-        <w:t>Public profile data is disclosed to visitors. A club receives information necessary to review its dancer affiliations, team, offers, verified redemptions, and invoices, but not private dancer payout rates or customer contact details unless separately authorized by law and product design. A dancer receives the dancer’s own profile, activity, affiliations, commissions, and payouts, but not customer identity. An agent receives only the agent’s authorized attribution and compensation records, not unrelated club, dancer, or customer data.</w:t>
+        <w:t>MyDancr may disclose data to vendors acting under contract for hosting/database/storage/authentication, content moderation, push, email, maps, support, security, Yoti age verification, Too Much Media/NATS commission settlement, club ACH processing/banking, and professional services. The minimum data necessary should be disclosed for the function.</w:t>
+      </w:r>
+    </w:p>
+    <w:p>
+      <w:r>
+        <w:t>Public profile data is disclosed to visitors. A club receives information necessary to review its dancer affiliations, team, offers, Deal Orders, verified redemptions, weekly statements, and ACH status, but not private dancer commission records or customer contact details unless separately authorized by law and product design. A dancer receives the dancer’s own profile, activity, affiliations, commissions, NATS linkage, and export status, but not customer identity.</w:t>
       </w:r>
     </w:p>
     <w:p>
@@ -4476,17 +4643,17 @@
         <w:pStyle w:val="Heading2"/>
       </w:pPr>
       <w:r>
-        <w:t>6. MyDancr identity and age verification</w:t>
-      </w:r>
-    </w:p>
-    <w:p>
-      <w:r>
-        <w:t>MyDancr may require an eligible dancer and, where appropriate, a club representative or agent to provide evidence through the approved verification workflow. MyDancr remains responsible for the verification purpose, lawful basis, notices, requested evidence, retention, access decisions, appeals, and response to rights requests concerning verification data.</w:t>
-      </w:r>
-    </w:p>
-    <w:p>
-      <w:r>
-        <w:t>MyDancr should collect and retain only necessary verification evidence, set the shortest workable retention period, limit reviewer access, and document every decision. Biometric processing should not be introduced without counsel-approved notices, consent, retention, deletion, security, and legally required alternative procedures.</w:t>
+        <w:t>6. Yoti age verification and MyDancr eligibility decisions</w:t>
+      </w:r>
+    </w:p>
+    <w:p>
+      <w:r>
+        <w:t>MyDancr uses a hosted Yoti flow for the 18+ age-verification gate and plans to retain a privacy-minimized pass/fail audit rather than date of birth, exact age, identity-document images, or biometric media. MyDancr remains responsible for the verification purpose, lawful basis, notices, product eligibility decision, fallback/manual path, appeal, access decision, retention of its own audit, and response to rights requests concerning data MyDancr controls. Yoti separately governs the information it processes under its production terms and privacy notice.</w:t>
+      </w:r>
+    </w:p>
+    <w:p>
+      <w:r>
+        <w:t>Any separate dancer-identity, club-authority, work-card, or fraud review must collect only necessary evidence, use the shortest workable retention period, limit reviewer access, and document the decision. MyDancr should not receive or retain Yoti biometric media or identity-document images unless counsel approves a materially different production flow with the required notices, consent, retention, deletion, security, and alternatives.</w:t>
       </w:r>
     </w:p>
     <w:p>
@@ -4494,17 +4661,17 @@
         <w:pStyle w:val="Heading2"/>
       </w:pPr>
       <w:r>
-        <w:t>7. Commission payout provider</w:t>
-      </w:r>
-    </w:p>
-    <w:p>
-      <w:r>
-        <w:t>Live payouts remain disabled until MyDancr selects a legally and contractually approved payout provider. To receive a payout after activation, a dancer or authorized agent must establish and maintain an eligible provider account. The provider may collect legal name, date of birth, address, business information, tax information, government identification, identity-verification data, sanctions/KYC information, source-of-funds information, external account details, device/security data, and transaction data under its own terms and privacy policy. MyDancr may exchange payee identifier, contact information, amount, currency, payment purpose, statement/reference, status, and compliance or failure results needed to execute and reconcile commissions. Provider approval, restrictions, reserves, fees, account closure, and supported payment methods are independently controlled by that provider.</w:t>
-      </w:r>
-    </w:p>
-    <w:p>
-      <w:r>
-        <w:t>The published policy must identify the selected provider’s contracted legal entity and link to its exact production privacy notice and terms before any live payout data is sent. MyDancr must update the notice and contract/vendor record before changing providers or sending materially different data.</w:t>
+        <w:t>7. Too Much Media/NATS dancer-commission settlement</w:t>
+      </w:r>
+    </w:p>
+    <w:p>
+      <w:r>
+        <w:t>Too Much Media’s NATS affiliate platform is the selected dancer-commission settlement system. To receive settlement, a dancer must establish and maintain an eligible NATS affiliate account and provide the NATS login/account identifier required to link it to the MyDancr dancer record. MyDancr may exchange that identifier, exact commission amount, currency, transaction purpose/reference, and the minimum status or failure data needed to export and reconcile the commission. Too Much Media/NATS may collect legal name, date of birth, address, business and tax information, government identification, sanctions/KYC data, payment-account details, device/security data, and transaction data under its own terms and privacy policy. Its approval, account restrictions, reserves, fees, closure, and supported payment methods are independently controlled by Too Much Media/NATS.</w:t>
+      </w:r>
+    </w:p>
+    <w:p>
+      <w:r>
+        <w:t>MyDancr maintains a private, durable, reversal-aware NATS export ledger so an ambiguous response is reconciled rather than automatically duplicated. The published policy must identify the contracted Too Much Media entity and link to the exact production terms/privacy notice before live data is sent. MyDancr must update the notice, contract/vendor record, and user acceptance before changing the commission-settlement provider or sending materially different data.</w:t>
       </w:r>
     </w:p>
     <w:p>
@@ -4522,7 +4689,7 @@
     </w:p>
     <w:p>
       <w:r>
-        <w:t>Identity verification may be required before fulfilling a request. MyDancr should not provide data that would disclose another person’s information, undermine security/fraud systems, or violate legal retention. Authorized-agent requests require proof of authority. Appeals and response deadlines must follow applicable law.</w:t>
+        <w:t>Identity verification may be required before fulfilling a request. MyDancr should not provide data that would disclose another person’s information, undermine security/fraud systems, or violate legal retention. Privacy-rights requests submitted by an authorized representative require proof of authority. Appeals and response deadlines must follow applicable law.</w:t>
       </w:r>
     </w:p>
     <w:p>
@@ -4631,7 +4798,7 @@
     </w:p>
     <w:p>
       <w:r>
-        <w:t>The dancer represents that the dancer is at least 18, is the person operating the account, has legal capacity, and may lawfully work and publish the submitted content. The dancer must provide accurate identity and city information, complete the required MyDancr verification process, and must not use another person’s documents, likeness, stage identity, or account. A stage name may be public; legal identity remains private except as required for verification, tax, an approved payout provider, safety, or law.</w:t>
+        <w:t>The dancer represents that the dancer is at least 18, is the person operating the account, has legal capacity, and may lawfully work and publish the submitted content. The dancer must provide accurate identity and city information, complete the required Yoti/MyDancr verification process, and must not use another person’s documents, likeness, stage identity, or account. A stage name may be public; legal identity remains private except as required for verification, tax, Too Much Media/NATS settlement, safety, or law.</w:t>
       </w:r>
     </w:p>
     <w:p>
@@ -4716,7 +4883,7 @@
         <w:pStyle w:val="Heading2"/>
       </w:pPr>
       <w:r>
-        <w:t>7. Commissions and payout</w:t>
+        <w:t>7. Commissions and Too Much Media/NATS settlement</w:t>
       </w:r>
     </w:p>
     <w:p>
@@ -4740,12 +4907,12 @@
     </w:p>
     <w:p>
       <w:r>
-        <w:t>After MyDancr selects and activates an approved payout provider, the dancer must open and maintain an eligible provider account, complete the provider’s KYC and tax/compliance checks, maintain information matching the MyDancr payee record, and remain eligible. The dancer authorizes MyDancr to send commission payout instructions and required transaction/payee data to that provider. Provider fees, foreign exchange, limits, supported countries, reserves, payment-method availability, compliance review, and holds may apply as disclosed. MyDancr does not control the provider’s independent approval or account decisions.</w:t>
-      </w:r>
-    </w:p>
-    <w:p>
-      <w:r>
-        <w:t>MyDancr may hold a disputed amount during a documented investigation, offset an overpayment or fraudulent/reversed event as permitted by law, and require updated tax information. Undisputed earned dancer rewards are not conditioned solely on club invoice collection. The dancer is responsible for taxes and for seeking professional advice.</w:t>
+        <w:t>The dancer must open and maintain an eligible NATS affiliate account on Too Much Media’s platform, complete Too Much Media/NATS onboarding and any KYC, tax, sanctions, or payment-account requirements, provide the correct NATS account identifier, and keep the account eligible. The dancer authorizes MyDancr to export the exact eligible commission amount and necessary transaction/reference data to the linked NATS account. Provider fees, foreign exchange, limits, supported countries, reserves, payment-method availability, compliance review, and holds may apply under Too Much Media/NATS terms. MyDancr does not control its independent approval or account decisions and does not process a duplicate direct settlement while NATS is the active settlement provider.</w:t>
+      </w:r>
+    </w:p>
+    <w:p>
+      <w:r>
+        <w:t>MyDancr may hold a disputed amount during a documented investigation, offset an overpayment or fraudulent/reversed event as permitted by law, and require updated tax information. Undisputed earned dancer rewards are not conditioned solely on the club’s weekly ACH settlement. The dancer is responsible for taxes and for seeking professional advice.</w:t>
       </w:r>
     </w:p>
     <w:tbl>
@@ -4782,10 +4949,10 @@
                 <w:color w:val="6D28D9"/>
                 <w:sz w:val="16"/>
               </w:rPr>
-              <w:t xml:space="preserve">PAYOUT SCHEDULE  </w:t>
+              <w:t xml:space="preserve">NATS SETTLEMENT SCHEDULE  </w:t>
             </w:r>
             <w:r>
-              <w:t>Add the approved payout frequency, minimum, reserve/hold period, statement dispute deadline, returned-payment process, inactivity/unclaimed-property rule, fee allocation, tax forms, and final-payment timing before launch.</w:t>
+              <w:t>Align the public commission schedule with the signed Too Much Media/NATS configuration, including export cadence, minimum, reserve/hold period, statement dispute deadline, rejected or ambiguous export handling, inactivity/unclaimed-property allocation, fees, tax forms, and final-settlement timing.</w:t>
             </w:r>
           </w:p>
         </w:tc>
@@ -4824,7 +4991,7 @@
     </w:p>
     <w:p>
       <w:r>
-        <w:t>MyDancr may pause onboarding, restrict media, remove an affiliation, stop a Working Now state, suspend payouts, or disable the profile for verification failure, inaccurate schedules, tag abuse, prohibited content, fraud, sanctions, legal process, safety, or breach. Ordinary appeals follow the enforcement policy. Immediate restriction may precede notice where necessary.</w:t>
+        <w:t>MyDancr may pause onboarding, restrict media, remove an affiliation, stop a Working Now state, hold NATS exports, or disable the profile for verification failure, inaccurate schedules, tag abuse, prohibited content, fraud, sanctions, legal process, safety, or breach. Ordinary appeals follow the enforcement policy. Immediate restriction may precede notice where necessary.</w:t>
       </w:r>
     </w:p>
     <w:p>
@@ -4842,7 +5009,7 @@
     </w:p>
     <w:p>
       <w:r>
-        <w:t>The dancer acknowledges the customer-facing limits of badges and status, the absence of guaranteed earnings, the role of club admission and independent club rules, MyDancr’s verification role, a future approved payout provider’s commission-payout role, the public nature of approved profile content, dynamic ranking signals, and the separate Content/Media, Acceptable Use, Verification, Commission, Moderation, Privacy, and Retention policies.</w:t>
+        <w:t>The dancer acknowledges the customer-facing limits of badges and status, the absence of guaranteed earnings, the role of club admission and independent club rules, Yoti’s hosted age-verification role, MyDancr’s eligibility and commission-calculation roles, Too Much Media/NATS’s commission-settlement role, the public nature of approved profile content, dynamic ranking signals, and the separate Content/Media, Acceptable Use, Verification, Commission, Moderation, Privacy, and Retention policies.</w:t>
       </w:r>
     </w:p>
     <w:p>
@@ -4894,7 +5061,7 @@
     </w:p>
     <w:p>
       <w:r>
-        <w:t>The club authorizes MyDancr to display approved club name, address, location, hours, directions, website/phone, public media, roster/affiliations, schedules, Club Deals, and other submitted information. The club must keep it accurate and must have rights to submitted marks and media. MyDancr may standardize presentation and remove inaccurate or noncompliant content.</w:t>
+        <w:t>The club authorizes MyDancr to display approved club name, address, location, hours, directions, website/phone, public media, roster/affiliations, schedules, Club Deals, and other submitted information. The club must keep it accurate and must have rights to submitted marks and media. MyDancr may standardize presentation and remove inaccurate or noncompliant content. Under the business-approved listing model, a verified club receives a promoted public club page and roster placement only while it is NFC-enabled and has at least one active approved Club Deal; expiration or suspension of the last active deal may pause public promotion without erasing private affiliation, audit, or settlement records.</w:t>
       </w:r>
     </w:p>
     <w:p>
@@ -4912,7 +5079,7 @@
     </w:p>
     <w:p>
       <w:r>
-        <w:t>The club must promptly end an affiliation that is no longer accurate and respond to disputes. It may not use affiliation review to retaliate unlawfully, misrepresent employment, obtain private payout information, or control unrelated dancer content.</w:t>
+        <w:t>The club must promptly end an affiliation that is no longer accurate and respond to disputes. It may not use affiliation review to retaliate unlawfully, misrepresent employment, obtain private dancer commission/NATS information, or control unrelated dancer content.</w:t>
       </w:r>
     </w:p>
     <w:p>
@@ -4943,7 +5110,7 @@
     </w:p>
     <w:p>
       <w:r>
-        <w:t>The club may publish only approved admission or line-access offers. Each deal must be truthful, available on disclosed terms, and honored when valid, subject only to clearly disclosed capacity, age, dress code, hours, safety, and house rules. The club may not publish alcohol, drink, bottle-service, sexual-service, cash, gambling, controlled-substance, or unlawful offers.</w:t>
+        <w:t>The club may publish only approved admission or line-access offers. Each deal must be truthful, available on disclosed terms, and honored when valid, subject only to clearly disclosed capacity, age, dress code, hours, safety, and house rules. The club may not publish alcohol, drink, bottle-service, sexual-service, cash, gambling, controlled-substance, or unlawful offers. Before publication, the club and MyDancr must accept a Deal Order for that specific offer; approval of one offer or fee does not automatically govern another.</w:t>
       </w:r>
     </w:p>
     <w:p>
@@ -4956,17 +5123,17 @@
         <w:pStyle w:val="Heading2"/>
       </w:pPr>
       <w:r>
-        <w:t>7. Referral fees and invoices</w:t>
-      </w:r>
-    </w:p>
-    <w:p>
-      <w:r>
-        <w:t>For each eligible server-verified redemption, the club owes the referral fee in the active fee term/order. A requested fee change is ineffective until accepted by authorized MyDancr personnel. When the locked source qualifies as a dancer’s public profile, MyDancr separately credits that dancer the applicable 30%, 40%, or 50% monthly tier share of the MyDancr gross referral fee under the Dancer Commission Terms. That credit does not reduce, offset, or condition the club’s referral-fee obligation. Invoice items identify supporting redemptions without exposing unnecessary dancer payout-account information. Club payment duties are separate from MyDancr’s dancer rewards.</w:t>
-      </w:r>
-    </w:p>
-    <w:p>
-      <w:r>
-        <w:t>The club must review statements and raise a specific good-faith dispute within the approved period. Undisputed amounts remain due. The final order should state invoice cycle, due date, payment method, taxes, late fee/interest within lawful limits, failed-payment costs, and suspension rights.</w:t>
+        <w:t>7. Negotiated referral fees and weekly ACH settlement</w:t>
+      </w:r>
+    </w:p>
+    <w:p>
+      <w:r>
+        <w:t>For each eligible server-verified redemption, the club owes the referral fee in the Deal Order governing that specific Club Deal. The order must identify the offer, fee or formula, currency, effective dates, weekly statement period, ACH method, and material restrictions. Different Club Deals may carry different negotiated referral fees. A requested change is ineffective until prospectively accepted by authorized representatives of MyDancr and the club. When the locked source qualifies as a dancer’s public profile, MyDancr separately credits that dancer the applicable 30%, 40%, or 50% monthly tier share of that deal’s MyDancr gross referral fee under the Dancer Commission Terms. That credit does not reduce, offset, or condition the club’s referral-fee obligation.</w:t>
+      </w:r>
+    </w:p>
+    <w:p>
+      <w:r>
+        <w:t>MyDancr provides an itemized weekly statement identifying supporting verified redemptions without exposing dancer settlement-account information. The club pays MyDancr once each week by ACH, using the authorized debit or credit method stated in the Deal Order. The club must review the statement and raise a specific good-faith dispute within the approved period; undisputed amounts remain due. The final order must state the weekly cutoff and timezone, statement delivery, ACH authorization or instructions, debit/due day, weekends/holidays, returns and retries, taxes, lawful late charges, failed-payment costs, reconciliation, record retention, and suspension rights.</w:t>
       </w:r>
     </w:p>
     <w:p>
@@ -5005,7 +5172,7 @@
     </w:p>
     <w:p>
       <w:r>
-        <w:t>The club may use MyDancr data only to operate authorized club features. It may not build customer lists from anonymous signals, export dancer/customer data, sell data, scrape, reidentify, or use payout/engagement information for discriminatory or retaliatory purposes. Confidential information includes security architecture, tag credentials, fee terms where designated, nonpublic user data, and incident information.</w:t>
+        <w:t>The club may use MyDancr data only to operate authorized club features. It may not build customer lists from anonymous signals, export dancer/customer data, sell data, scrape, reidentify, or use commission/engagement information for discriminatory or retaliatory purposes. Confidential information includes security architecture, tag credentials, fee terms where designated, nonpublic user data, and incident information.</w:t>
       </w:r>
     </w:p>
     <w:p>
@@ -5068,10 +5235,10 @@
                 <w:color w:val="6D28D9"/>
                 <w:sz w:val="16"/>
               </w:rPr>
-              <w:t xml:space="preserve">CLUB ORDER FORM  </w:t>
+              <w:t xml:space="preserve">DEAL ORDER AND ACH AUTHORIZATION  </w:t>
             </w:r>
             <w:r>
-              <w:t>Attach a venue-specific order containing legal operator, DBA, licensed premises, authorized signer, subscription/services, referral fee, currency, invoice cycle, due date, tax handling, processor, term, renewal, and special compliance conditions.</w:t>
+              <w:t>Use a venue master agreement plus a Deal Order for each published Club Deal. Each order should identify legal operator, DBA, licensed premises, authorized signer, exact offer and restrictions, offer-specific referral fee/formula, currency, weekly statement period, ACH debit authorization or credit instructions, debit/due day, return/retry procedure, tax handling, term, renewal, priority over conflicting deal copy, and special compliance conditions.</w:t>
             </w:r>
           </w:p>
         </w:tc>
@@ -5214,12 +5381,12 @@
         <w:pStyle w:val="Heading2"/>
       </w:pPr>
       <w:r>
-        <w:t>9. 2257/2257A review</w:t>
-      </w:r>
-    </w:p>
-    <w:p>
-      <w:r>
-        <w:t>MyDancr’s current intended public policy excludes actual sexually explicit conduct. If any production or publication could fall within 18 U.S.C. §§ 2257 or 2257A, counsel must determine producer status, records, labels, custodian, inspections, and downstream obligations before accepting that category. A generic “18+” checkbox is not a substitute.</w:t>
+        <w:t>9. Adult-only, consent, and content-boundary controls</w:t>
+      </w:r>
+    </w:p>
+    <w:p>
+      <w:r>
+        <w:t>At counsel’s direction, this license does not impose proposed 18 U.S.C. §§ 2257/2257A producer-recordkeeping, labeling, custodian, or inspection duties. Independently of that conclusion, every depicted person must be an adult and must have consented; the uploader must own or control the necessary rights; actual sexually explicit conduct is outside the accepted content categories; and MyDancr may require age/identity, consent, ownership, moderation, or provenance evidence reasonably necessary to enforce those narrower rules. Counsel should re-review the allocation only if MyDancr materially changes its accepted content or production role.</w:t>
       </w:r>
     </w:p>
     <w:p>
@@ -5349,7 +5516,7 @@
     </w:p>
     <w:p>
       <w:r>
-        <w:t>Users may not create sham redemptions, self-deal, collude, recycle sessions, falsify invoices/payout accounts/tax data, redirect attribution, claim an unauthorized agent relationship, make deceptive earnings claims, recruit a downline, charge participation fees, or use payouts for unlawful activity. Mistaken payments must be reported and returned as permitted by law.</w:t>
+        <w:t>Users may not create sham redemptions, self-deal, collude, recycle sessions, falsify weekly statements, ACH records, NATS accounts, or tax data, redirect attribution, claim an unauthorized commission relationship, make deceptive earnings claims, recruit a downline, charge participation fees, or use settlement flows for unlawful activity. Mistaken payments must be reported and returned as permitted by law.</w:t>
       </w:r>
     </w:p>
     <w:p>
@@ -5375,7 +5542,7 @@
     </w:p>
     <w:p>
       <w:r>
-        <w:t>Violations may result in content restriction, warning, feature limitation, removal of affiliation/status, voided redemptions, tag revocation, payout hold, suspension, termination, evidence preservation, and referral to providers or authorities. MyDancr may consider severity, intent, history, harm, cooperation, and risk. Appeals do not require reinstatement during an active safety or fraud risk.</w:t>
+        <w:t>Violations may result in content restriction, warning, feature limitation, removal of affiliation/status, voided redemptions, tag revocation, commission-export hold, suspension, termination, evidence preservation, and referral to providers or authorities. MyDancr may consider severity, intent, history, harm, cooperation, and risk. Appeals do not require reinstatement during an active safety or fraud risk.</w:t>
       </w:r>
     </w:p>
     <w:p>
@@ -5414,7 +5581,7 @@
     </w:p>
     <w:p>
       <w:r>
-        <w:t>Verification should be proportionate to role and action. Email confirmation is appropriate for basic account access but is not enough for a public dancer, club owner, authorized manager, payout recipient, or agent. High-risk roles require documented identity and/or authority review under MyDancr’s approved process. A selected approved payout provider will separately control payment-account KYC for payout recipients.</w:t>
+        <w:t>Verification should be proportionate to role and action. Email confirmation is appropriate for basic account access but is not enough for a public dancer, club owner, authorized manager, or commission recipient. Public dancers must complete the hosted Yoti 18+ gate plus any MyDancr identity/eligibility and initial club-affiliation controls required by the approved workflow. High-risk club roles require documented identity and/or authority review. Too Much Media/NATS separately controls its affiliate-account, KYC, tax, sanctions, and payment-account requirements.</w:t>
       </w:r>
     </w:p>
     <w:p>
@@ -5492,12 +5659,12 @@
         <w:pStyle w:val="Heading2"/>
       </w:pPr>
       <w:r>
-        <w:t>8. Payout and agent verification</w:t>
-      </w:r>
-    </w:p>
-    <w:p>
-      <w:r>
-        <w:t>Payout recipients must complete the selected approved provider’s onboarding and any MyDancr tax, sanctions, identity, and account-matching checks. MyDancr uses its approved platform identity review and may rely on the selected provider for payment-account KYC, but must resolve mismatches before payout. An agent must also have a valid separate agreement and order. Provider approval does not itself authorize a MyDancr agent commission; MyDancr’s written authorization and qualifying events are still required.</w:t>
+        <w:t>8. NATS affiliate-account verification</w:t>
+      </w:r>
+    </w:p>
+    <w:p>
+      <w:r>
+        <w:t>Dancers receiving commissions must complete Too Much Media/NATS onboarding and any required KYC, sanctions, tax, payment-account, and account-matching checks. MyDancr must verify the dancer-to-NATS account linkage and resolve a mismatch before exporting commission. Too Much Media/NATS approval does not itself create a MyDancr commission; only a qualifying Profile-Originated Verified Redemption calculated under the accepted Dancer Commission Terms does so.</w:t>
       </w:r>
     </w:p>
     <w:p>
@@ -5510,7 +5677,7 @@
     </w:p>
     <w:p>
       <w:r>
-        <w:t>MyDancr may reverify after material account changes, suspicious activity, expired documents, affiliation disputes, payout failures, sanctions alerts, security incidents, or legal requirements. Failure or refusal may restrict the relevant feature. A User may appeal a mistaken result but cannot require MyDancr to accept unverifiable evidence.</w:t>
+        <w:t>MyDancr may reverify after material account changes, suspicious activity, expired documents, affiliation disputes, NATS or ACH failures, sanctions alerts, security incidents, or legal requirements. Failure or refusal may restrict the relevant feature. A User may appeal a mistaken result but cannot require MyDancr to accept unverifiable evidence.</w:t>
       </w:r>
     </w:p>
     <w:p>
@@ -5523,7 +5690,7 @@
     </w:p>
     <w:p>
       <w:r>
-        <w:t>Verification should collect the minimum evidence necessary, separate public stage identity from legal identity, limit retention, log access, prohibit ordinary email transmission of documents, and avoid exposing government identifiers to clubs, dancers, customers, or agents.</w:t>
+        <w:t>Verification should collect the minimum evidence necessary, separate public stage identity from legal identity, limit retention, log access, prohibit ordinary email transmission of documents, and avoid exposing government identifiers to clubs, dancers, or customers.</w:t>
       </w:r>
     </w:p>
     <w:p>
@@ -5750,7 +5917,7 @@
     </w:p>
     <w:p>
       <w:r>
-        <w:t>If a server or tag outage prevents confirmation, no unverified screen should automatically create a commission or invoice. The user or club may contact support with the deal, club, time, and reference. MyDancr may verify logs, correct a technical error, or deny a claim lacking reliable evidence. Screenshots are not final proof.</w:t>
+        <w:t>If a server or tag outage prevents confirmation, no unverified screen should automatically create a commission event or weekly statement item. The user or club may contact support with the deal, club, time, and reference. MyDancr may verify logs, correct a technical error, or deny a claim lacking reliable evidence. Screenshots are not final proof.</w:t>
       </w:r>
     </w:p>
     <w:p>
@@ -5776,7 +5943,7 @@
         <w:pStyle w:val="Heading1"/>
       </w:pPr>
       <w:r>
-        <w:t>Part XI — Draft Dancer Commission, Agent Referral, and Payout Terms</w:t>
+        <w:t>Part XI — Draft Dancer Commission and Too Much Media/NATS Settlement Terms</w:t>
       </w:r>
     </w:p>
     <w:p>
@@ -5789,7 +5956,7 @@
     </w:p>
     <w:p>
       <w:r>
-        <w:t>These terms govern rewards for eligible dancers and, only if separately authorized, commissions for contracted agents. They do not govern club wages, tips, dancer services, customer purchases, or employment compensation. “Commission Event” means a server-created record that satisfies the applicable policy and attribution rules. “Profile-Originated Verified Redemption” means an allowed Club Deal redemption successfully confirmed by the correct club’s authorized cashier NFC tag where the immutable source captured before token issuance identifies an eligible dancer’s public profile—including a qualifying shift or deal surface presented within that profile—as the customer journey’s origin. “Approved Payout Provider” means a legally suitable provider selected under a signed production contract after MyDancr’s business model and payout use case have been approved.</w:t>
+        <w:t>These terms govern rewards for eligible dancers. They do not govern club wages, tips, dancer services, customer purchases, or employment compensation, and they do not create an agent commission program. “Commission Event” means a server-created record that satisfies the applicable policy and attribution rules. “Profile-Originated Verified Redemption” means an allowed Club Deal redemption successfully confirmed by the correct club’s authorized cashier NFC tag where the immutable source captured before token issuance identifies an eligible dancer’s public profile—including a qualifying shift or deal surface presented within that profile—as the customer journey’s origin. “NATS Affiliate Account” means the dancer’s eligible, verified affiliate account on Too Much Media’s NATS platform. “NATS Export” means MyDancr’s transaction or import event transmitting the exact eligible commission amount and reference to that account for settlement.</w:t>
       </w:r>
     </w:p>
     <w:p>
@@ -5867,7 +6034,7 @@
     </w:p>
     <w:p>
       <w:r>
-        <w:t>The commission month is the calendar month determined in the verified club’s configured local timezone. Tiers apply incrementally, not retroactively: an event is priced at the tier reached when the authorized cashier NFC confirmation occurs, and a later tier does not reprice prior events. The gross referral fee is the fee in the club’s effective term, not admission price, deal value, club revenue, tip, or dancer compensation. The event stores the source profile, commission month, ordinal, policy version, 3,000-, 4,000-, or 5,000-basis-point share, gross fee, currency, club, deal, dancer, shift/context, token, cashier confirmation, timestamps, and calculation snapshot.</w:t>
+        <w:t>The commission month is the calendar month determined in the verified club’s configured local timezone. Tiers apply incrementally, not retroactively: an event is priced at the tier reached when the authorized cashier NFC confirmation occurs, and a later tier does not reprice prior events. The gross referral fee is the negotiated fee for the specific Club Deal in its accepted Deal Order, not admission price, deal value, club revenue, tip, or dancer compensation. The event stores the source profile, commission month, ordinal, policy version, 3,000-, 4,000-, or 5,000-basis-point share, gross fee, currency, Deal Order/deal, club, dancer, shift/context, token, cashier confirmation, timestamps, and calculation snapshot.</w:t>
       </w:r>
     </w:p>
     <w:p>
@@ -5885,7 +6052,7 @@
     </w:p>
     <w:p>
       <w:r>
-        <w:t>The club’s referral-fee obligation and MyDancr’s dancer reward are separate. The club invoice can be pending while the dancer reward is payable. MyDancr may not deny an otherwise valid reward solely because the club has not paid, but may correct or hold an event for fraud, duplication, mistake, reversal, illegality, sanctions, or a genuine attribution dispute.</w:t>
+        <w:t>The club’s referral-fee obligation and MyDancr’s dancer reward are separate. A weekly club ACH settlement can be pending while the dancer reward is eligible for NATS export. MyDancr may not deny an otherwise valid reward solely because the club has not paid, but may correct or hold an event for fraud, duplication, mistake, reversal, illegality, sanctions, or a genuine attribution dispute.</w:t>
       </w:r>
     </w:p>
     <w:p>
@@ -5893,17 +6060,12 @@
         <w:pStyle w:val="Heading2"/>
       </w:pPr>
       <w:r>
-        <w:t>5. Authorized agent commission</w:t>
-      </w:r>
-    </w:p>
-    <w:p>
-      <w:r>
-        <w:t>No agent commission exists unless MyDancr and the agent have signed a separate Agent Agreement or order that identifies the agent, qualifying event, attributed club or portfolio, rate/formula, currency, effective dates, attribution tail if any, exclusions, and payout conditions. An introduction, email, demo, account signup, recruiting claim, or club team role does not create a commission.</w:t>
-      </w:r>
-    </w:p>
-    <w:p>
-      <w:r>
-        <w:t>Agent compensation must arise from the written event specified in the order, such as collected platform revenue from a contracted club. Unless the order expressly and lawfully states otherwise, agent commission is not calculated from dancer rewards and does not reduce them. No commission is paid for recruiting another agent or for a downline.</w:t>
+        <w:t>5. No agent commission under these terms</w:t>
+      </w:r>
+    </w:p>
+    <w:p>
+      <w:r>
+        <w:t>An introduction, email, demo, account signup, recruiting claim, or club team role does not create an agent commission. MyDancr currently operates no agent commission program. A later program would require a separate counsel-approved agreement, product implementation, event attribution, tax/compliance process, acceptance flow, and publication; it may not be inferred from these dancer terms and may not reduce an accrued dancer commission.</w:t>
       </w:r>
     </w:p>
     <w:p>
@@ -5924,17 +6086,17 @@
         <w:pStyle w:val="Heading2"/>
       </w:pPr>
       <w:r>
-        <w:t>7. Payout-provider onboarding</w:t>
-      </w:r>
-    </w:p>
-    <w:p>
-      <w:r>
-        <w:t>A payee must establish an eligible account with the Approved Payout Provider, complete its identity/KYC, sanctions, tax, and account-matching checks, and authorize required data exchange. MyDancr may store the beneficiary/account identifier, onboarding status, payout eligibility, transfer reference, and error status but should not store full external account credentials. Provider terms, country availability, account restrictions, reserves, limits, fees, inactivity charges, foreign exchange, payment methods, and review apply independently.</w:t>
-      </w:r>
-    </w:p>
-    <w:p>
-      <w:r>
-        <w:t>MyDancr will not enable live commission payouts until an Approved Payout Provider is selected and configured. If the selected integration later becomes unavailable or legally unsuitable, MyDancr may change providers with reasonable notice and a transition period, subject to accrued-payment duties and applicable law. The payee may need to complete new onboarding before further payout.</w:t>
+        <w:t>7. NATS affiliate onboarding and export</w:t>
+      </w:r>
+    </w:p>
+    <w:p>
+      <w:r>
+        <w:t>A dancer must establish and maintain an eligible NATS Affiliate Account, complete Too Much Media/NATS identity/KYC, sanctions, tax, payment-account, and account-matching checks, provide the correct NATS account identifier, and authorize the data exchange required for settlement. MyDancr may store the NATS login/account identifier, linkage and verification state, export eligibility, exact exported amount, immutable ledger state, attempt/error/reconciliation state, reversal, and provider transaction/reference but should not store full external account credentials.</w:t>
+      </w:r>
+    </w:p>
+    <w:p>
+      <w:r>
+        <w:t>MyDancr exports each eligible commission through NATS while NATS is the selected settlement system. A successfully exported event must not also be paid directly by MyDancr. A timeout or ambiguous provider response enters reconciliation-required status rather than being automatically retried and potentially duplicated. If the integration becomes unavailable or legally unsuitable, MyDancr may pause exports and change providers with reasonable notice and a transition plan, subject to accrued-payment duties and applicable law.</w:t>
       </w:r>
     </w:p>
     <w:p>
@@ -5942,12 +6104,12 @@
         <w:pStyle w:val="Heading2"/>
       </w:pPr>
       <w:r>
-        <w:t>8. Statements, payout cycle, and minimums</w:t>
-      </w:r>
-    </w:p>
-    <w:p>
-      <w:r>
-        <w:t>The dashboard or statement shows pending, payable, paid, failed, reversed, or held status and available references. The final version must state payout frequency, cutoff timezone, minimum balance, fee allocation, returned-payment handling, and final payout. Amounts below the minimum may roll forward unless law requires otherwise.</w:t>
+        <w:t>8. Statements, export cycle, and settlement timing</w:t>
+      </w:r>
+    </w:p>
+    <w:p>
+      <w:r>
+        <w:t>The dashboard or statement should distinguish accrued, eligible, waiting for affiliate linkage, pending export, processing, exported, failed, reconciliation required, reversed, held, and canceled status and show available references. The final version must state MyDancr’s export frequency and cutoff, Too Much Media/NATS settlement timing, minimum balance, fee allocation, rejected-payment handling, and final settlement. Amounts below the minimum may roll forward only as disclosed and as permitted by law.</w:t>
       </w:r>
     </w:p>
     <w:tbl>
@@ -5984,10 +6146,10 @@
                 <w:color w:val="6D28D9"/>
                 <w:sz w:val="16"/>
               </w:rPr>
-              <w:t xml:space="preserve">COMMERCIAL SCHEDULE  </w:t>
+              <w:t xml:space="preserve">COMMISSION SETTLEMENT SCHEDULE  </w:t>
             </w:r>
             <w:r>
-              <w:t>Approve an attached Payout Schedule. It should be operationally achievable and should address weekends/holidays, provider delay, KYC failure, inactive accounts, death/incapacity, unclaimed property, tax holds, currency conversion, and record disputes.</w:t>
+              <w:t>Approve an attached schedule that matches the signed Too Much Media/NATS configuration and addresses export cutoff, weekends/holidays, provider delay, ambiguous response, KYC failure, inactive or mismatched accounts, death/incapacity, unclaimed property, tax holds, currency conversion, fees, and record disputes.</w:t>
             </w:r>
           </w:p>
         </w:tc>
@@ -6021,7 +6183,7 @@
     </w:p>
     <w:p>
       <w:r>
-        <w:t>Payees are responsible for taxes, business registration, and professional advice. MyDancr may request tax forms, report payments, and withhold where required. A commission does not create employment, club agency, franchise, partnership, or authority to bind MyDancr. Agents may not make unapproved promises or earnings claims.</w:t>
+        <w:t>Dancers are responsible for taxes, business registration, and professional advice. MyDancr or Too Much Media/NATS may request tax forms, report payments, and withhold where required. A commission does not create employment, club agency, franchise, partnership, or authority to bind MyDancr.</w:t>
       </w:r>
     </w:p>
     <w:p>
@@ -6060,7 +6222,7 @@
     </w:p>
     <w:p>
       <w:r>
-        <w:t>MyDancr moderates to protect adults, consent, lawful club promotion, rights, finance integrity, and system safety. Decisions may involve automated tools and trained reviewers. MyDancr prioritizes imminent harm, minors, trafficking, nonconsensual content, credible threats, account takeover, payout fraud, and tag compromise.</w:t>
+        <w:t>MyDancr moderates to protect adults, consent, lawful club promotion, rights, finance integrity, and system safety. Decisions may involve automated tools and trained reviewers. MyDancr prioritizes imminent harm, minors, trafficking, nonconsensual content, credible threats, account takeover, commission/ACH fraud, and tag compromise.</w:t>
       </w:r>
     </w:p>
     <w:p>
@@ -6112,7 +6274,7 @@
     </w:p>
     <w:p>
       <w:r>
-        <w:t>Reviewers may approve, restrict, remove, request information, disable features, suspend accounts, revoke affiliations/tags, void events, hold payouts, or escalate. The record should include issue, evidence, rule, action, reviewer, timestamp, notice, and appeal. Access must be least-privilege, especially for identity, intimate media, location, and payout data.</w:t>
+        <w:t>Reviewers may approve, restrict, remove, request information, disable features, suspend accounts, revoke affiliations/tags, void events, hold commission exports, or escalate. The record should include issue, evidence, rule, action, reviewer, timestamp, notice, and appeal. Access must be least-privilege, especially for identity, intimate media, location, NATS, and ACH data.</w:t>
       </w:r>
     </w:p>
     <w:p>
@@ -6177,7 +6339,7 @@
     </w:p>
     <w:p>
       <w:r>
-        <w:t>Commission disputes use immutable redemption, tag, source, club, shift, policy-version, and payout records. MyDancr may separate undisputed amounts. Clubs cannot see private dancer payout terms; dancers and agents cannot see unrelated club billing or other payees.</w:t>
+        <w:t>Commission disputes use immutable redemption, tag, source, club, shift, Deal Order, policy-version, NATS export, and settlement records. MyDancr may separate undisputed amounts. Clubs cannot see private dancer commission-settlement terms; dancers cannot see unrelated club ACH or other dancers’ records.</w:t>
       </w:r>
     </w:p>
     <w:p>
@@ -6360,10 +6522,10 @@
         <w:rPr>
           <w:b/>
         </w:rPr>
-        <w:t>Verified redemptions, invoices, commission, payout, and tax records:</w:t>
-      </w:r>
-      <w:r>
-        <w:t xml:space="preserve"> statutory accounting/tax period plus open dispute, audit, chargeback, and legal-hold needs.</w:t>
+        <w:t>Verified redemptions, Deal Orders, weekly statements, ACH, commissions, NATS exports/settlement, and tax records:</w:t>
+      </w:r>
+      <w:r>
+        <w:t xml:space="preserve"> statutory accounting/tax period plus open dispute, audit, return/reversal, and legal-hold needs.</w:t>
       </w:r>
     </w:p>
     <w:p>
@@ -6374,10 +6536,10 @@
         <w:rPr>
           <w:b/>
         </w:rPr>
-        <w:t>Payout-provider references:</w:t>
-      </w:r>
-      <w:r>
-        <w:t xml:space="preserve"> beneficiary/account identifier, transfer reference, status, amount, currency, failure/hold reason, and reconciliation record through the approved finance/statutory period; never retain the provider password or unnecessary payment-account credentials. The provider independently retains regulated KYC and transaction data under its policy.</w:t>
+        <w:t>Too Much Media/NATS references:</w:t>
+      </w:r>
+      <w:r>
+        <w:t xml:space="preserve"> affiliate login/account identifier, export reference, status, amount, currency, failure/hold reason, reversal, and reconciliation record through the approved finance/statutory period; never retain the NATS password or unnecessary payment-account credentials. Too Much Media/NATS independently retains regulated KYC and transaction data under its policy.</w:t>
       </w:r>
     </w:p>
     <w:p>
@@ -6430,7 +6592,7 @@
         <w:rPr>
           <w:b/>
         </w:rPr>
-        <w:t>Club/agent agreements and fee/commission orders:</w:t>
+        <w:t>Club agreements, Deal Orders, and commission records:</w:t>
       </w:r>
       <w:r>
         <w:t xml:space="preserve"> agreement life plus limitation, tax, audit, and dispute period.</w:t>
@@ -6487,7 +6649,7 @@
               <w:t xml:space="preserve">EXACT PERIODS REQUIRED  </w:t>
             </w:r>
             <w:r>
-              <w:t>Convert every “short,” “limited,” “rolling,” and “statutory” period above into an approved number of days/years and confirm backup architecture, tax law, limitation periods, DMCA, performer-record duties, fraud models, and state privacy requirements.</w:t>
+              <w:t>Convert every “short,” “limited,” “rolling,” and “statutory” period above into an approved number of days/years and confirm backup architecture, tax law, limitation periods, DMCA, consent/verification evidence, fraud models, and state privacy requirements.</w:t>
             </w:r>
           </w:p>
         </w:tc>
@@ -6526,7 +6688,7 @@
     </w:p>
     <w:p>
       <w:r>
-        <w:t>MyDancr may retain minimum records required for unpaid/paid invoices and commissions, taxes, fraud/security, chargebacks, DMCA, reports, consent/release evidence, legal claims, sanctions, and legal holds. Retained data is not used for ordinary promotion and should be segregated or access-restricted.</w:t>
+        <w:t>MyDancr may retain minimum records required for Deal Orders, weekly statements, ACH, commissions, NATS exports/settlement, taxes, fraud/security, returns/reversals, DMCA, reports, consent/release evidence, legal claims, sanctions, and legal holds. Retained data is not used for ordinary promotion and should be segregated or access-restricted.</w:t>
       </w:r>
     </w:p>
     <w:p>
@@ -6534,12 +6696,12 @@
         <w:pStyle w:val="Heading2"/>
       </w:pPr>
       <w:r>
-        <w:t>5. Club, dancer, and agent records</w:t>
-      </w:r>
-    </w:p>
-    <w:p>
-      <w:r>
-        <w:t>Deleting a User account does not delete another legal entity’s records or rewrite historical events. A dancer’s public profile can be removed while a club invoice and dancer payout event retain a pseudonymous or internal reference. A club account deletion does not erase consumer redemption support or an accepted fee term. Agent termination does not erase earned/paid statements or tax records.</w:t>
+        <w:t>5. Club and dancer records</w:t>
+      </w:r>
+    </w:p>
+    <w:p>
+      <w:r>
+        <w:t>Deleting a User account does not delete another legal entity’s records or rewrite historical events. A dancer’s public profile can be removed while a weekly club statement, verified redemption, dancer commission event, and NATS export retain a pseudonymous or internal reference. A club account deletion does not erase consumer redemption support, an accepted Deal Order, or ACH reconciliation records.</w:t>
       </w:r>
     </w:p>
     <w:p>
@@ -6623,7 +6785,7 @@
         <w:pStyle w:val="ListNumber"/>
       </w:pPr>
       <w:r>
-        <w:t>Document and approve the identity/age verification workflow, reviewer authority, requested evidence, notices and consent, retention/deletion, security, appeal, incident, and fallback procedures before launch.</w:t>
+        <w:t>Complete Yoti production contracting and configuration; document MyDancr’s 18+ eligibility, notice, minimal-result storage, fallback/manual review, appeal, retention/deletion, security, and incident procedures.</w:t>
       </w:r>
     </w:p>
     <w:p>
@@ -6631,7 +6793,7 @@
         <w:pStyle w:val="ListNumber"/>
       </w:pPr>
       <w:r>
-        <w:t>Select, contract with, and configure an Approved Payout Provider; confirm its legal identity, supported payee countries/currencies, KYC, funding, fees, reserves, transaction limits, complaints, data protection, and reconciliation.</w:t>
+        <w:t>Contract with and configure the exact Too Much Media/NATS entity; verify supported dancer countries/currencies, affiliate onboarding, KYC/tax allocation, fees, reserves, limits, complaints, privacy, export cadence, failure and reconciliation behavior.</w:t>
       </w:r>
     </w:p>
     <w:p>
@@ -6639,7 +6801,7 @@
         <w:pStyle w:val="ListNumber"/>
       </w:pPr>
       <w:r>
-        <w:t>If agents launch, execute a separate Agent Agreement and order; implement role, authorization, attribution, statements, tax, approved-provider payout, suspension, and deletion before any commission is promised.</w:t>
+        <w:t>Keep agent commissions disabled. Treat any future agent program as a separately scoped product and legal launch.</w:t>
       </w:r>
     </w:p>
     <w:p>
@@ -6647,7 +6809,7 @@
         <w:pStyle w:val="ListNumber"/>
       </w:pPr>
       <w:r>
-        <w:t>Approve club order form and fee term; display the effective fee to the authorized signer.</w:t>
+        <w:t>Approve the club master agreement, offer-specific Deal Order, and weekly ACH authorization/instructions; display each deal’s effective referral fee to the authorized signer.</w:t>
       </w:r>
     </w:p>
     <w:p>
@@ -6655,6 +6817,14 @@
         <w:pStyle w:val="ListNumber"/>
       </w:pPr>
       <w:r>
+        <w:t>Implement Deal-Order-specific fee snapshots, weekly itemized statements, ACH debit or credit processing, returns/retries, trace references, disputes, and reconciliation before accepting the revised club commercial terms.</w:t>
+      </w:r>
+    </w:p>
+    <w:p>
+      <w:pPr>
+        <w:pStyle w:val="ListNumber"/>
+      </w:pPr>
+      <w:r>
         <w:t>Implement clickwrap acceptance with document version, timestamp, user/account, IP/user agent as appropriate, and downloadable copy.</w:t>
       </w:r>
     </w:p>
@@ -6663,7 +6833,7 @@
         <w:pStyle w:val="ListNumber"/>
       </w:pPr>
       <w:r>
-        <w:t>Separate customer Terms acceptance from Dancer, Club, Agent, Media, Club Deal, Verification, and approved-provider payout acceptances/notices.</w:t>
+        <w:t>Separate customer Terms acceptance from Dancer, Club, Media, Club Deal, Verification, NATS Commission Settlement, Deal Order, and ACH acceptances/notices.</w:t>
       </w:r>
     </w:p>
     <w:p>
@@ -6679,7 +6849,7 @@
         <w:pStyle w:val="ListNumber"/>
       </w:pPr>
       <w:r>
-        <w:t>Confirm media categories, 2257/2257A analysis, releases, music rights, and emergency reporting.</w:t>
+        <w:t>Apply counsel’s direction not to impose proposed §2257/§2257A duties; confirm adult-only, consent, ownership, accepted-content boundaries, releases where required, music rights, and emergency reporting.</w:t>
       </w:r>
     </w:p>
     <w:p>
@@ -6719,7 +6889,7 @@
         <w:pStyle w:val="ListNumber"/>
       </w:pPr>
       <w:r>
-        <w:t>Validate immutable dancer-profile source attribution, the 1–9/10–24/25+ monthly tier boundaries, nonretroactive event pricing, and independent club/dancer ledgers with test redemptions and reversals.</w:t>
+        <w:t>Validate immutable dancer-profile source attribution, Deal-Order fee snapshot, the 1–9/10–24/25+ monthly tier boundaries, nonretroactive event pricing, independent club/dancer ledgers, and NATS export/reconciliation with test redemptions and reversals.</w:t>
       </w:r>
     </w:p>
     <w:p>
@@ -6727,7 +6897,7 @@
         <w:pStyle w:val="ListNumber"/>
       </w:pPr>
       <w:r>
-        <w:t>Finalize the approved-provider payout schedule, minimum, tax, failure, hold, reversal, fee, and unclaimed-property handling.</w:t>
+        <w:t>Finalize the NATS commission-export and settlement schedule, minimum, tax, failure, hold, reversal, fee, and unclaimed-property handling.</w:t>
       </w:r>
     </w:p>
     <w:p>
@@ -6767,7 +6937,7 @@
         <w:pStyle w:val="ListNumber"/>
       </w:pPr>
       <w:r>
-        <w:t>Complete state/local licensing and privacy review before each city launch.</w:t>
+        <w:t>Select the Arizona pilot city/county and complete Arizona state and local adult-entertainment, club, privacy/security, tax, worker/referral, advertising, and ACH review before onboarding pilot clubs.</w:t>
       </w:r>
     </w:p>
     <w:p>
@@ -6817,7 +6987,7 @@
         <w:t>Dancer:</w:t>
       </w:r>
       <w:r>
-        <w:t xml:space="preserve"> Terms + Privacy + Dancer Agreement + Content/Media License + Acceptable Use + Verification notice/consent where required + approved-provider Commission/Payout terms; renewed acceptance for material commission changes.</w:t>
+        <w:t xml:space="preserve"> Terms + Privacy + Dancer Agreement + Content/Media License + Acceptable Use + Yoti/MyDancr Verification notice/consent where required + Too Much Media/NATS Commission Settlement terms; renewed acceptance for material commission changes.</w:t>
       </w:r>
     </w:p>
     <w:p>
@@ -6831,7 +7001,7 @@
         <w:t>Club owner/authorized signer:</w:t>
       </w:r>
       <w:r>
-        <w:t xml:space="preserve"> Terms + Privacy + Club Agreement + order/fee term + NFC/Deal terms + data/security obligations.</w:t>
+        <w:t xml:space="preserve"> Terms + Privacy + Club Agreement + each offer-specific Deal Order + weekly ACH authorization/instructions + NFC/Deal terms + data/security obligations.</w:t>
       </w:r>
     </w:p>
     <w:p>
@@ -6856,10 +7026,10 @@
         <w:rPr>
           <w:b/>
         </w:rPr>
-        <w:t>Agent if launched:</w:t>
-      </w:r>
-      <w:r>
-        <w:t xml:space="preserve"> Terms + Privacy + separate Agent Agreement/order + Acceptable Use + identity-verification notice + approved-provider payout/tax terms + marketing standards.</w:t>
+        <w:t>Agent:</w:t>
+      </w:r>
+      <w:r>
+        <w:t xml:space="preserve"> no active role or commission acceptance in this packet; a future program requires a separate launch package.</w:t>
       </w:r>
     </w:p>
     <w:p>
@@ -6953,7 +7123,7 @@
         <w:pStyle w:val="ListBullet"/>
       </w:pPr>
       <w:r>
-        <w:t>Reconcile club invoice, profile-originated tier ordinals 1, 9, 10, 24, and 25, month reset, independent dancer payable, payout-provider success/failure, KYC hold, reserve, wrong/mismatched beneficiary, correction, fee, and statement.</w:t>
+        <w:t>Reconcile a weekly club statement and ACH payment/return; verify distinct Deal Orders and fee snapshots; test profile-originated tier ordinals 1, 9, 10, 24, and 25, month reset, independent dancer commission, NATS linkage, export success/failure/timeout, reconciliation-required state, KYC hold, reserve, mismatched account, reversal, correction, fee, and statement.</w:t>
       </w:r>
     </w:p>
     <w:p>
@@ -6961,7 +7131,7 @@
         <w:pStyle w:val="ListBullet"/>
       </w:pPr>
       <w:r>
-        <w:t>If agents launch, test no-contract, expired order, duplicate claim, preexisting club, qualifying event, payout failure, and termination.</w:t>
+        <w:t>Confirm no agent account, commission accrual, settlement, or recruiting/downline promise is active.</w:t>
       </w:r>
     </w:p>
     <w:p>
@@ -6982,7 +7152,7 @@
     </w:p>
     <w:p>
       <w:r>
-        <w:t>The strongest legal posture will come from keeping product behavior narrower than promotional language: public club discovery, approved adult promotional media, venue-confirmed affiliations, limited schedules, admission/line-access Club Deals, verified NFC events, transparent referral attribution, provider-processed payouts, and auditable safety/enforcement. Any later messaging, booking, paid content, customer payments, alcohol offers, private-services marketplace, or multi-level agent program would materially change this packet and should not launch through an informal feature update.</w:t>
+        <w:t>The strongest legal posture will come from keeping product behavior narrower than promotional language: public club discovery, approved adult promotional media, venue-confirmed affiliations, limited schedules, negotiated admission/line-access Club Deals, verified NFC events, transparent referral attribution, weekly club ACH settlement, Too Much Media/NATS dancer-commission settlement, and auditable safety/enforcement. The first planned pilot outside the Las Vegas demo market is Arizona and requires a selected-city/county addendum before launch. Any later messaging, booking, paid content, customer payments, alcohol offers, private-services marketplace, or agent commission program would materially change this packet and should not launch through an informal feature update.</w:t>
       </w:r>
     </w:p>
     <w:p>
@@ -7141,7 +7311,7 @@
         <w:rPr>
           <w:b/>
         </w:rPr>
-        <w:t>18 U.S.C. § 2257 — performer recordkeeping requirements:</w:t>
+        <w:t>Too Much Media — NATS affiliate-management platform:</w:t>
       </w:r>
       <w:r>
         <w:t xml:space="preserve"> [</w:t>
@@ -7152,7 +7322,111 @@
             <w:color w:val="0891B2"/>
             <w:u w:val="single"/>
           </w:rPr>
-          <w:t>https://uscode.house.gov/view.xhtml?edition=prelim&amp;num=0&amp;req=granuleid%3AUSC-prelim-title18-section2257](https://uscode.house.gov/view.xhtml?edition=prelim&amp;num=0&amp;req=granuleid%3AUSC-prelim-title18-section2257</w:t>
+          <w:t>https://www.toomuchmedia.com/](https://www.toomuchmedia.com/</w:t>
+        </w:r>
+      </w:hyperlink>
+      <w:r>
+        <w:t>)</w:t>
+      </w:r>
+    </w:p>
+    <w:p>
+      <w:pPr>
+        <w:pStyle w:val="ListBullet"/>
+      </w:pPr>
+      <w:r>
+        <w:rPr>
+          <w:b/>
+        </w:rPr>
+        <w:t>Too Much Media — NATS documentation:</w:t>
+      </w:r>
+      <w:r>
+        <w:t xml:space="preserve"> [</w:t>
+      </w:r>
+      <w:hyperlink r:id="rId21">
+        <w:r>
+          <w:rPr>
+            <w:color w:val="0891B2"/>
+            <w:u w:val="single"/>
+          </w:rPr>
+          <w:t>https://docs.toomuchmedia.com/](https://docs.toomuchmedia.com/</w:t>
+        </w:r>
+      </w:hyperlink>
+      <w:r>
+        <w:t>)</w:t>
+      </w:r>
+    </w:p>
+    <w:p>
+      <w:pPr>
+        <w:pStyle w:val="ListBullet"/>
+      </w:pPr>
+      <w:r>
+        <w:rPr>
+          <w:b/>
+        </w:rPr>
+        <w:t>Yoti — privacy information:</w:t>
+      </w:r>
+      <w:r>
+        <w:t xml:space="preserve"> [</w:t>
+      </w:r>
+      <w:hyperlink r:id="rId22">
+        <w:r>
+          <w:rPr>
+            <w:color w:val="0891B2"/>
+            <w:u w:val="single"/>
+          </w:rPr>
+          <w:t>https://www.yoti.com/privacy/](https://www.yoti.com/privacy/</w:t>
+        </w:r>
+      </w:hyperlink>
+      <w:r>
+        <w:t>)</w:t>
+      </w:r>
+    </w:p>
+    <w:p>
+      <w:pPr>
+        <w:pStyle w:val="ListBullet"/>
+      </w:pPr>
+      <w:r>
+        <w:rPr>
+          <w:b/>
+        </w:rPr>
+        <w:t>Nacha — ACH Rules resources:</w:t>
+      </w:r>
+      <w:r>
+        <w:t xml:space="preserve"> [</w:t>
+      </w:r>
+      <w:hyperlink r:id="rId23">
+        <w:r>
+          <w:rPr>
+            <w:color w:val="0891B2"/>
+            <w:u w:val="single"/>
+          </w:rPr>
+          <w:t>https://www.nacha.org/rules](https://www.nacha.org/rules</w:t>
+        </w:r>
+      </w:hyperlink>
+      <w:r>
+        <w:t>)</w:t>
+      </w:r>
+    </w:p>
+    <w:p>
+      <w:pPr>
+        <w:pStyle w:val="ListBullet"/>
+      </w:pPr>
+      <w:r>
+        <w:rPr>
+          <w:b/>
+        </w:rPr>
+        <w:t>Arizona Revised Statutes § 18-552 — security-system and breach-notification duties:</w:t>
+      </w:r>
+      <w:r>
+        <w:t xml:space="preserve"> [</w:t>
+      </w:r>
+      <w:hyperlink r:id="rId24">
+        <w:r>
+          <w:rPr>
+            <w:color w:val="0891B2"/>
+            <w:u w:val="single"/>
+          </w:rPr>
+          <w:t>https://www.azleg.gov/ars/18/00552.htm](https://www.azleg.gov/ars/18/00552.htm</w:t>
         </w:r>
       </w:hyperlink>
       <w:r>
@@ -7172,7 +7446,7 @@
       <w:r>
         <w:t xml:space="preserve"> [</w:t>
       </w:r>
-      <w:hyperlink r:id="rId21">
+      <w:hyperlink r:id="rId25">
         <w:r>
           <w:rPr>
             <w:color w:val="0891B2"/>
@@ -7198,7 +7472,7 @@
       <w:r>
         <w:t xml:space="preserve"> [</w:t>
       </w:r>
-      <w:hyperlink r:id="rId22">
+      <w:hyperlink r:id="rId26">
         <w:r>
           <w:rPr>
             <w:color w:val="0891B2"/>

</xml_diff>

<commit_message>
docs: remove retired verification providers from legal packet
</commit_message>
<xml_diff>
--- a/docs/legal/MyDancr-Legal-Review-Packet.docx
+++ b/docs/legal/MyDancr-Legal-Review-Packet.docx
@@ -399,7 +399,7 @@
               <w:t xml:space="preserve">PRODUCTION PROVIDERS AND SETTLEMENT MODEL  </w:t>
             </w:r>
             <w:r>
-              <w:t>Yoti is the selected hosted age-verification service for the 18+ gate, subject to completion of production configuration and contract/privacy review. Too Much Media’s NATS affiliate platform is the selected dancer-commission settlement system: MyDancr calculates an eligible commission and exports the exact U.S.-dollar amount to the dancer’s verified NATS affiliate account. Clubs owe MyDancr negotiated, Club-Deal-specific referral fees and settle verified redemption statements once each week by ACH. Counsel must verify the contracting entities, account terms, geographic availability, KYC/tax allocation, privacy roles, settlement timing, fees, reserves, and operational responsibilities against the signed production contracts before publication.</w:t>
+              <w:t>The current model has no separate age-verification service. Too Much Media’s NATS affiliate platform is the selected dancer-commission settlement system: MyDancr calculates an eligible commission and exports the exact U.S.-dollar amount to the dancer’s verified NATS affiliate account. Clubs owe MyDancr negotiated, Club-Deal-specific referral fees and settle verified redemption statements once each week by ACH. Counsel must verify the contracting entities, account terms, geographic availability, KYC/tax allocation, privacy roles, settlement timing, fees, reserves, and operational responsibilities against the signed production contracts before publication.</w:t>
             </w:r>
           </w:p>
         </w:tc>
@@ -487,7 +487,7 @@
         <w:pStyle w:val="ListNumber"/>
       </w:pPr>
       <w:r>
-        <w:t>Draft Age, Identity, and Venue-Verification Policy.</w:t>
+        <w:t>Draft Account Eligibility and Venue-Verification Policy.</w:t>
       </w:r>
     </w:p>
     <w:p>
@@ -763,10 +763,10 @@
         <w:rPr>
           <w:b/>
         </w:rPr>
-        <w:t>Age and identity verification:</w:t>
-      </w:r>
-      <w:r>
-        <w:t xml:space="preserve"> Yoti is selected for the hosted 18+ verification gate. MyDancr remains responsible for defining the eligibility decision, notice, fallback/manual review, appeal, access, retention, and security controls and for any separate club-authority or dancer-identity checks not performed by Yoti.</w:t>
+        <w:t>Account eligibility and club verification:</w:t>
+      </w:r>
+      <w:r>
+        <w:t xml:space="preserve"> the current no-nudity model does not use a separate age-verification vendor or require routine document, selfie, biometric, or date-of-birth collection by MyDancr. Users make contractual eligibility representations; public dancer profiles still require approved media and an authorized club’s confirmation of a legitimate affiliation. Clubs remain responsible for admission-age checks, work eligibility, licensing, and venue compliance.</w:t>
       </w:r>
     </w:p>
     <w:p>
@@ -808,7 +808,7 @@
         <w:t>Media:</w:t>
       </w:r>
       <w:r>
-        <w:t xml:space="preserve"> uploads undergo technical validation and automated and/or human moderation. Public media must belong to the uploader, depict consenting adults, comply with platform rules, and remain within current duration/count limits.</w:t>
+        <w:t xml:space="preserve"> uploads undergo technical validation and automated and/or human moderation. Nudity and actual sexually explicit conduct are prohibited. Public media must belong to the uploader, depict consenting adults, comply with platform rules, and remain within current duration/count limits.</w:t>
       </w:r>
     </w:p>
     <w:p>
@@ -854,7 +854,7 @@
         <w:pStyle w:val="ListNumber"/>
       </w:pPr>
       <w:r>
-        <w:t>Decide whether all customer accounts must be 21+ or whether 18+ accounts may browse clubs whose own entry age varies.</w:t>
+        <w:t>Confirm the contractual account-eligibility representation and whether customers must be 18+, 21+, or may browse without an age representation while clubs enforce their own lawful admission rules.</w:t>
       </w:r>
     </w:p>
     <w:p>
@@ -862,7 +862,7 @@
         <w:pStyle w:val="ListNumber"/>
       </w:pPr>
       <w:r>
-        <w:t>Approve the exact identity, age, and authority-verification workflow for dancers and club owners/managers, including requested evidence, reviewer access, consent and state-specific notices, retention, appeals, and fallback process.</w:t>
+        <w:t>Approve the club-authority and dancer-affiliation workflow, including any limited evidence required for suspicious accounts, reviewer access, retention, appeals, and fallback. The current model does not include routine MyDancr age verification, identity-document collection, or selfie/biometric matching.</w:t>
       </w:r>
     </w:p>
     <w:p>
@@ -870,7 +870,7 @@
         <w:pStyle w:val="ListNumber"/>
       </w:pPr>
       <w:r>
-        <w:t>Review and approve the Yoti production configuration and contract, including privacy roles, hosted-session disclosures, minimum-data return, retention, failed/abandoned flow, false-positive/false-negative handling, manual fallback, accessibility, and appeal.</w:t>
+        <w:t>Review and approve the Too Much Media/NATS production contract and business configuration, including the exact contracting entity, dancer affiliate onboarding, KYC/tax allocation, export and payment cadence, minimums, reserves/holds, rejected or ambiguous transactions, fees, supported countries/currencies, complaints, reconciliation, and unclaimed-property handling.</w:t>
       </w:r>
     </w:p>
     <w:p>
@@ -878,7 +878,7 @@
         <w:pStyle w:val="ListNumber"/>
       </w:pPr>
       <w:r>
-        <w:t>Review and approve the Too Much Media/NATS production contract and business configuration, including the exact contracting entity, dancer affiliate onboarding, KYC/tax allocation, export and payment cadence, minimums, reserves/holds, rejected or ambiguous transactions, fees, supported countries/currencies, complaints, reconciliation, and unclaimed-property handling.</w:t>
+        <w:t>Confirm that no agent commission program will launch under these drafts. Any later agent program requires a separate agreement, implementation, acceptance flow, and legal review before any promise or accrual.</w:t>
       </w:r>
     </w:p>
     <w:p>
@@ -886,7 +886,7 @@
         <w:pStyle w:val="ListNumber"/>
       </w:pPr>
       <w:r>
-        <w:t>Confirm that no agent commission program will launch under these drafts. Any later agent program requires a separate agreement, implementation, acceptance flow, and legal review before any promise or accrual.</w:t>
+        <w:t>Approve the Deal Order template for negotiated offer-specific referral fees and weekly ACH settlement, including offer terms, fee formula, statement period, authorization/credit method, debit or due day, holidays, returns, disputes, taxes, late fees, suspension, and collection; also confirm the nonretroactive profile-originated dancer tiers—30% for monthly events 1–9, 40% for 10–24, and 50% for 25 and above—against tax, worker-classification, referral, and gaming/sweepstakes concerns.</w:t>
       </w:r>
     </w:p>
     <w:p>
@@ -894,7 +894,7 @@
         <w:pStyle w:val="ListNumber"/>
       </w:pPr>
       <w:r>
-        <w:t>Approve the Deal Order template for negotiated offer-specific referral fees and weekly ACH settlement, including offer terms, fee formula, statement period, authorization/credit method, debit or due day, holidays, returns, disputes, taxes, late fees, suspension, and collection; also confirm the nonretroactive profile-originated dancer tiers—30% for monthly events 1–9, 40% for 10–24, and 50% for 25 and above—against tax, worker-classification, referral, and gaming/sweepstakes concerns.</w:t>
+        <w:t>Choose governing law, venue, arbitration/class-action waiver, small-claims carveout, opt-out process, and consumer-law savings language.</w:t>
       </w:r>
     </w:p>
     <w:p>
@@ -902,7 +902,7 @@
         <w:pStyle w:val="ListNumber"/>
       </w:pPr>
       <w:r>
-        <w:t>Choose governing law, venue, arbitration/class-action waiver, small-claims carveout, opt-out process, and consumer-law savings language.</w:t>
+        <w:t>Approve warranty disclaimers, liability caps, indemnities, insurance minimums, and special allocation for clubs, dancers, customers, and the platform.</w:t>
       </w:r>
     </w:p>
     <w:p>
@@ -910,7 +910,7 @@
         <w:pStyle w:val="ListNumber"/>
       </w:pPr>
       <w:r>
-        <w:t>Approve warranty disclaimers, liability caps, indemnities, insurance minimums, and special allocation for clubs, dancers, customers, and the platform.</w:t>
+        <w:t>Approve exact retention periods by record class, including media, moderation evidence, NFC/device logs, geolocation, finance/tax records, DMCA, support, reports, account-recovery events, and backups.</w:t>
       </w:r>
     </w:p>
     <w:p>
@@ -918,15 +918,7 @@
         <w:pStyle w:val="ListNumber"/>
       </w:pPr>
       <w:r>
-        <w:t>Approve exact retention periods by record class, including media, moderation evidence, NFC/device logs, geolocation, finance/tax records, DMCA, support, reports, account-recovery events, and backups.</w:t>
-      </w:r>
-    </w:p>
-    <w:p>
-      <w:pPr>
-        <w:pStyle w:val="ListNumber"/>
-      </w:pPr>
-      <w:r>
-        <w:t>Confirm Nevada requirements for the existing demo market and Arizona state plus selected-city/county requirements for the pilot, including privacy/security and breach notice, biometric/age-assurance, consumer protection, employment/privacy, adult-entertainment licensing, and tax; evaluate other state and international regimes only before further expansion.</w:t>
+        <w:t>Confirm Nevada requirements for the existing demo market and Arizona state plus selected-city/county requirements for the pilot, including privacy/security and breach notice, consumer protection, employment/privacy, adult-entertainment licensing, and tax; evaluate other state and international regimes only before further expansion.</w:t>
       </w:r>
     </w:p>
     <w:p>
@@ -987,10 +979,10 @@
                 <w:color w:val="6D28D9"/>
                 <w:sz w:val="16"/>
               </w:rPr>
-              <w:t xml:space="preserve">COUNSEL DIRECTION ON 18 U.S.C. §§ 2257/2257A  </w:t>
+              <w:t xml:space="preserve">COUNSEL DIRECTION ON CONTENT AND VERIFICATION  </w:t>
             </w:r>
             <w:r>
-              <w:t>At counsel’s direction, this packet does not propose §2257/§2257A producer-recordkeeping, labeling, custodian, or inspection obligations for MyDancr, dancers, or clubs. MyDancr’s product rules continue to prohibit minors and actual sexually explicit conduct and to require adult identity/age verification, consent, ownership, moderation, and prompt safety escalation. Counsel should revisit this conclusion only if the accepted content categories or MyDancr’s production role materially change.</w:t>
+              <w:t>At counsel’s direction, this packet does not propose §2257/§2257A producer-recordkeeping, labeling, custodian, or inspection obligations and does not assume a separate age-verification service because nudity and actual sexually explicit conduct are prohibited. MyDancr continues to require truthful eligibility representations, consenting-adult content, ownership, moderation, venue-confirmed dancer affiliations, and prompt safety escalation. Counsel should revisit this conclusion if accepted content categories, applicable law, or MyDancr’s production role materially changes.</w:t>
             </w:r>
           </w:p>
         </w:tc>
@@ -1181,12 +1173,12 @@
     </w:p>
     <w:p>
       <w:r>
-        <w:t>The first-time dancer flow is staged: create the account; save stage name and city; complete the required MyDancr age/identity review; upload and approve an avatar; upload the required profile photos; optionally add social links and videos; preview the complete customer-facing profile; submit; and complete first venue verification through an approved club touchpoint. The public preview should use the same rendering and approved content that a live profile will use, while clearly identifying its private preview state.</w:t>
-      </w:r>
-    </w:p>
-    <w:p>
-      <w:r>
-        <w:t>Public eligibility is the conjunction of several conditions, not a single status flag: active account, approved dancer status, a successful and current identity/age decision accepted by MyDancr, public visibility enabled, no disablement, required approved media, and the required approved venue affiliation. Media still pending or rejected does not count toward approval. Deleting media must remove the active database record and associated public/storage reference, subject only to backup, legal-hold, and audit retention described later.</w:t>
+        <w:t>The first-time dancer flow is staged: create the account; make the required eligibility and truthful-account representations; save stage name and city; upload and approve an avatar; upload the required profile photos; optionally add social links and videos; preview the complete customer-facing profile; submit; and complete first venue verification through an approved club touchpoint. The public preview should use the same rendering and approved content that a live profile will use, while clearly identifying its private preview state.</w:t>
+      </w:r>
+    </w:p>
+    <w:p>
+      <w:r>
+        <w:t>Public eligibility is the conjunction of several conditions, not a single status flag: active account, accepted eligibility representations, approved dancer status, public visibility enabled, no disablement, required approved media, and the required approved venue affiliation. MyDancr does not require routine age-document, selfie, biometric, or date-of-birth verification in the current no-nudity model. Media still pending or rejected does not count toward approval. Deleting media must remove the active database record and associated public/storage reference, subject only to backup, legal-hold, and audit retention described later.</w:t>
       </w:r>
     </w:p>
     <w:p>
@@ -1584,10 +1576,10 @@
         <w:rPr>
           <w:b/>
         </w:rPr>
-        <w:t>Yoti:</w:t>
-      </w:r>
-      <w:r>
-        <w:t xml:space="preserve"> hosted 18+ verification session and privacy-minimized pass/fail result, subject to production contract and configuration review. MyDancr’s planned audit record excludes date of birth, exact age, identity-document images, and biometric media.</w:t>
+        <w:t>Account eligibility:</w:t>
+      </w:r>
+      <w:r>
+        <w:t xml:space="preserve"> contractual eligibility and truthful-account representations stored with the accepted agreement version. The current model has no separate age-verification integration and no routine MyDancr collection of date of birth, exact age, identity-document images, selfies, or biometric media.</w:t>
       </w:r>
     </w:p>
     <w:p>
@@ -1655,7 +1647,7 @@
               <w:t xml:space="preserve">LAUNCH SYNCHRONIZATION  </w:t>
             </w:r>
             <w:r>
-              <w:t>Before publication, product and counsel must compare this map against production environment variables, processor contracts, database migrations, storage buckets, notification templates, analytics events, and all live pages. Yoti, the selected ACH processor/bank setup, and Too Much Media/NATS must not be presented as active beyond the contract and production configuration actually in force.</w:t>
+              <w:t>Before publication, product and counsel must compare this map against production environment variables, processor contracts, database migrations, storage buckets, notification templates, analytics events, and all live pages. No retired or unapproved provider may appear in public copy, acceptance records, provider disclosures, configuration, or live flows. The selected ACH processor/bank setup and Too Much Media/NATS must not be presented as active beyond the contract and production configuration actually in force.</w:t>
             </w:r>
           </w:p>
         </w:tc>
@@ -1975,7 +1967,7 @@
               <w:rPr>
                 <w:sz w:val="14"/>
               </w:rPr>
-              <w:t>Email, city, identity/profile fields</w:t>
+              <w:t>Email, city, eligibility/profile fields</w:t>
             </w:r>
           </w:p>
         </w:tc>
@@ -1998,7 +1990,7 @@
               <w:rPr>
                 <w:sz w:val="14"/>
               </w:rPr>
-              <w:t>Auth + draft dancer profile; staged onboarding; hosted Yoti 18+ gate and MyDancr eligibility review required</w:t>
+              <w:t>Auth + draft dancer profile; contractual eligibility; staged media and club-affiliation onboarding</w:t>
             </w:r>
           </w:p>
         </w:tc>
@@ -2044,7 +2036,7 @@
               <w:rPr>
                 <w:sz w:val="14"/>
               </w:rPr>
-              <w:t>Email confirmation; privacy-minimized verification decision; account state; audit</w:t>
+              <w:t>Email confirmation; acceptance version; account state; audit</w:t>
             </w:r>
           </w:p>
         </w:tc>
@@ -2210,7 +2202,7 @@
               <w:rPr>
                 <w:sz w:val="14"/>
               </w:rPr>
-              <w:t>Profile, identity readiness, approved media</w:t>
+              <w:t>Profile, accepted eligibility, approved media</w:t>
             </w:r>
           </w:p>
         </w:tc>
@@ -2233,7 +2225,7 @@
               <w:rPr>
                 <w:sz w:val="14"/>
               </w:rPr>
-              <w:t>Eligibility checks; first venue verification remains required</w:t>
+              <w:t>Account/media checks; first venue affiliation remains required</w:t>
             </w:r>
           </w:p>
         </w:tc>
@@ -4108,7 +4100,7 @@
     </w:p>
     <w:p>
       <w:r>
-        <w:t>Links and integrations may lead to clubs, social networks, maps, rideshare providers, authentication/email/push providers, Yoti, Too Much Media/NATS, and the ACH processor or banking partners used for club settlement. Third parties control their own services, terms, availability, and data practices. A link or technical integration does not imply endorsement or partnership. The User is responsible for reviewing applicable third-party terms.</w:t>
+        <w:t>Links and integrations may lead to clubs, social networks, maps, rideshare providers, authentication/email/push providers, Too Much Media/NATS, and the ACH processor or banking partners used for club settlement. Third parties control their own services, terms, availability, and data practices. A link or technical integration does not imply endorsement or partnership. The User is responsible for reviewing applicable third-party terms.</w:t>
       </w:r>
     </w:p>
     <w:p>
@@ -4365,7 +4357,7 @@
     </w:p>
     <w:p>
       <w:r>
-        <w:t>This Privacy Policy applies to personal information processed by MyDancr through the Service. Yoti processes hosted age-verification data, Too Much Media/NATS processes dancer affiliate and commission-settlement data, and the selected ACH processor or banking partners process club payment data under the applicable contracts, notices, and independent terms. This policy does not govern independent club practices, third-party social sites, maps, rideshare providers, or a provider acting independently. The published version must identify the MyDancr controller/business legal entity, contact methods, actual production providers, and each provider’s privacy role.</w:t>
+        <w:t>This Privacy Policy applies to personal information processed by MyDancr through the Service. MyDancr does not use a separate age-verification provider in the current model. Too Much Media/NATS processes dancer affiliate and commission-settlement data, and the selected ACH processor or banking partners process club payment data under the applicable contracts, notices, and independent terms. This policy does not govern independent club practices, third-party social sites, maps, rideshare providers, or a provider acting independently. The published version must identify the MyDancr controller/business legal entity, contact methods, actual production providers, and each provider’s privacy role.</w:t>
       </w:r>
     </w:p>
     <w:p>
@@ -4399,7 +4391,7 @@
     </w:p>
     <w:p>
       <w:r>
-        <w:t>Stage name, city, bio, avatar, profile photos, videos, social links, public slug, visibility, status, legal identity or verification readiness, club affiliations, verification events, work-card or license information if required, and consent/acceptance records. Legal identity and verification evidence are private and should not appear on the public profile. MyDancr should collect only the evidence required by its approved review workflow and applicable law.</w:t>
+        <w:t>Stage name, city, bio, avatar, profile photos, videos, social links, public slug, visibility, status, club affiliations, verification events, work-card or license information if required, and consent/acceptance records. MyDancr does not routinely collect age or identity documents, selfies, biometric media, or date of birth in the current no-nudity model. Any limited evidence later required for fraud, club authority, account recovery, or law must remain private and be collected only under an approved workflow.</w:t>
       </w:r>
     </w:p>
     <w:p>
@@ -4464,7 +4456,7 @@
     </w:p>
     <w:p>
       <w:r>
-        <w:t>Deal Orders, deal-specific fee snapshots, weekly club statements and items, ACH authorization/payment status, returns and trace/reconciliation references, verified redemption data, gross referral fee, dancer share, platform share, policy version, commission status, NATS affiliate login/account linkage and verification state, immutable commission-export events, attempt/error/reconciliation state, provider transaction/reference, tax classification/documents or status, and reversals. Full Yoti evidence, NATS or ACH credentials, external bank credentials, and identity images collected solely by a provider should remain with that provider rather than being copied into MyDancr’s ordinary database.</w:t>
+        <w:t>Deal Orders, deal-specific fee snapshots, weekly club statements and items, ACH authorization/payment status, returns and trace/reconciliation references, verified redemption data, gross referral fee, dancer share, platform share, policy version, commission status, NATS affiliate login/account linkage and verification state, immutable commission-export events, attempt/error/reconciliation state, provider transaction/reference, tax classification/documents or status, and reversals. NATS or ACH credentials, external bank credentials, and identity images collected solely by a finance provider should remain with that provider rather than being copied into MyDancr’s ordinary database.</w:t>
       </w:r>
     </w:p>
     <w:p>
@@ -4503,7 +4495,7 @@
     </w:p>
     <w:p>
       <w:r>
-        <w:t>Information comes from the User; clubs and authorized team members; dancers; automated device/browser events; NFC tags; content moderation; MyDancr verification records; Yoti; Too Much Media/NATS; the selected ACH processor or banking partners; authentication, hosting, email, push, map, and support vendors; public sources used for club verification; other Users’ reports; and authorities where lawful.</w:t>
+        <w:t>Information comes from the User; clubs and authorized team members; dancers; automated device/browser events; NFC tags; content moderation; MyDancr eligibility, affiliation, and account-integrity records; Too Much Media/NATS; the selected ACH processor or banking partners; authentication, hosting, email, push, map, and support vendors; public sources used for club verification; other Users’ reports; and authorities where lawful.</w:t>
       </w:r>
     </w:p>
     <w:p>
@@ -4535,7 +4527,7 @@
         <w:pStyle w:val="ListBullet"/>
       </w:pPr>
       <w:r>
-        <w:t>Verify identity readiness, club authority, dancer affiliation, and time-limited presence.</w:t>
+        <w:t>Verify account eligibility representations, club authority, dancer affiliation, and time-limited presence.</w:t>
       </w:r>
     </w:p>
     <w:p>
@@ -4620,7 +4612,7 @@
     </w:p>
     <w:p>
       <w:r>
-        <w:t>MyDancr may disclose data to vendors acting under contract for hosting/database/storage/authentication, content moderation, push, email, maps, support, security, Yoti age verification, Too Much Media/NATS commission settlement, club ACH processing/banking, and professional services. The minimum data necessary should be disclosed for the function.</w:t>
+        <w:t>MyDancr may disclose data to vendors acting under contract for hosting/database/storage/authentication, content moderation, push, email, maps, support, security, Too Much Media/NATS commission settlement, club ACH processing/banking, and professional services. The minimum data necessary should be disclosed for the function. No separate age-verification provider receives account data under the current model.</w:t>
       </w:r>
     </w:p>
     <w:p>
@@ -4643,17 +4635,17 @@
         <w:pStyle w:val="Heading2"/>
       </w:pPr>
       <w:r>
-        <w:t>6. Yoti age verification and MyDancr eligibility decisions</w:t>
-      </w:r>
-    </w:p>
-    <w:p>
-      <w:r>
-        <w:t>MyDancr uses a hosted Yoti flow for the 18+ age-verification gate and plans to retain a privacy-minimized pass/fail audit rather than date of birth, exact age, identity-document images, or biometric media. MyDancr remains responsible for the verification purpose, lawful basis, notices, product eligibility decision, fallback/manual path, appeal, access decision, retention of its own audit, and response to rights requests concerning data MyDancr controls. Yoti separately governs the information it processes under its production terms and privacy notice.</w:t>
-      </w:r>
-    </w:p>
-    <w:p>
-      <w:r>
-        <w:t>Any separate dancer-identity, club-authority, work-card, or fraud review must collect only necessary evidence, use the shortest workable retention period, limit reviewer access, and document the decision. MyDancr should not receive or retain Yoti biometric media or identity-document images unless counsel approves a materially different production flow with the required notices, consent, retention, deletion, security, and alternatives.</w:t>
+        <w:t>6. Account eligibility, club authority, and affiliation decisions</w:t>
+      </w:r>
+    </w:p>
+    <w:p>
+      <w:r>
+        <w:t>The current no-nudity model does not use a separate age-verification service. MyDancr records the User’s contractual eligibility and truthful-account representations and applies account-state, approved-media, club-authority, venue-affiliation, and safety rules relevant to the requested feature. MyDancr does not routinely collect date of birth, exact age, government identification, selfies, or biometric media.</w:t>
+      </w:r>
+    </w:p>
+    <w:p>
+      <w:r>
+        <w:t>Any limited evidence later required for suspected fraud, account recovery, club authority, work-card compliance, or a specific legal obligation must be necessary and proportionate, use the shortest workable retention period, limit reviewer access, and document the decision. Introducing document, selfie, biometric, or vendor-based verification requires a separately approved product and legal change with appropriate notices, security, alternatives, retention, and deletion controls.</w:t>
       </w:r>
     </w:p>
     <w:p>
@@ -4798,7 +4790,7 @@
     </w:p>
     <w:p>
       <w:r>
-        <w:t>The dancer represents that the dancer is at least 18, is the person operating the account, has legal capacity, and may lawfully work and publish the submitted content. The dancer must provide accurate identity and city information, complete the required Yoti/MyDancr verification process, and must not use another person’s documents, likeness, stage identity, or account. A stage name may be public; legal identity remains private except as required for verification, tax, Too Much Media/NATS settlement, safety, or law.</w:t>
+        <w:t>The dancer represents that the dancer is at least 18, is the person operating the account, has legal capacity, and may lawfully work and publish the submitted content. The dancer must provide accurate stage identity and city information and must not use another person’s documents, likeness, stage identity, or account. MyDancr does not require a routine age-document or biometric verification flow in the current no-nudity model. A stage name may be public; any legal identity collected independently by a club, Too Much Media/NATS, tax authority, or other provider is governed by that relationship and applicable law.</w:t>
       </w:r>
     </w:p>
     <w:p>
@@ -4816,7 +4808,7 @@
     </w:p>
     <w:p>
       <w:r>
-        <w:t>Before the profile becomes public, the dancer must complete the required MyDancr age/identity review, complete required profile fields, obtain approval of required media, submit the profile, and complete first club verification through the approved flow. A verification decision supports identity and age assurance but is not a guarantee; a club confirmation verifies only the represented affiliation. MyDancr may require additional review or decline publication.</w:t>
+        <w:t>Before the profile becomes public, the dancer must make the required eligibility and truthful-account representations, complete required profile fields, obtain approval of required media, submit the profile, and complete first club verification through the approved flow. Club confirmation verifies only the represented affiliation and is not a general identity, age, employment, licensing, or safety guarantee. MyDancr may require limited additional review for suspected fraud, impersonation, safety concerns, or a specific legal obligation, or may decline publication.</w:t>
       </w:r>
     </w:p>
     <w:p>
@@ -4852,7 +4844,7 @@
     </w:p>
     <w:p>
       <w:r>
-        <w:t>The dancer grants the Content and Media License and represents that each upload depicts consenting adults, is owned or properly licensed, is not misleading, and complies with club, privacy, intellectual-property, and safety rules. The dancer must obtain releases from every recognizable person and location owner where required. The dancer must not upload hidden-camera, nonconsensual, trafficked, minor, infringing, or illegal content.</w:t>
+        <w:t>The dancer grants the Content and Media License and represents that each upload depicts consenting adults, is owned or properly licensed, is not misleading, contains no nudity or actual sexually explicit conduct, and complies with club, privacy, intellectual-property, and safety rules. The dancer must obtain releases from every recognizable person and location owner where required. The dancer must not upload hidden-camera, nonconsensual, trafficked, minor, infringing, or illegal content.</w:t>
       </w:r>
     </w:p>
     <w:p>
@@ -5009,7 +5001,7 @@
     </w:p>
     <w:p>
       <w:r>
-        <w:t>The dancer acknowledges the customer-facing limits of badges and status, the absence of guaranteed earnings, the role of club admission and independent club rules, Yoti’s hosted age-verification role, MyDancr’s eligibility and commission-calculation roles, Too Much Media/NATS’s commission-settlement role, the public nature of approved profile content, dynamic ranking signals, and the separate Content/Media, Acceptable Use, Verification, Commission, Moderation, Privacy, and Retention policies.</w:t>
+        <w:t>The dancer acknowledges the customer-facing limits of badges and status, the absence of guaranteed earnings, the role of club admission and independent club rules, MyDancr’s account-eligibility, affiliation, media-approval, and commission-calculation roles, Too Much Media/NATS’s commission-settlement role, the absence of a separate age-verification service, the public nature of approved profile content, dynamic ranking signals, and the separate Content/Media, Acceptable Use, Account/Club Verification, Commission, Moderation, Privacy, and Retention policies.</w:t>
       </w:r>
     </w:p>
     <w:p>
@@ -5290,7 +5282,7 @@
     </w:p>
     <w:p>
       <w:r>
-        <w:t>The submitter must preserve underlying releases and age/identity records for the period required by law and provide reasonable evidence to MyDancr or authorities where legally necessary. MyDancr’s approval is not a substitute for those records.</w:t>
+        <w:t>The submitter must preserve underlying permissions, releases, and rights records for the period required by law and provide reasonable evidence to MyDancr or authorities where legally necessary. This clause does not impose a separate age-verification or §2257/§2257A recordkeeping program. MyDancr’s approval is not a substitute for records independently required by applicable law.</w:t>
       </w:r>
     </w:p>
     <w:p>
@@ -5334,7 +5326,7 @@
     </w:p>
     <w:p>
       <w:r>
-        <w:t>The submitter consents to automated and human analysis for safety, nudity/sexual-content classification, age-risk, violence, drugs, text, logos, fraud, and policy compliance; to secure transmission to contracted moderation providers; and to administrative review. Decisions can be wrong. The submitter may use the appeal process but may not demand publication.</w:t>
+        <w:t>The submitter consents to automated and human analysis for safety, nudity/sexual-content classification, apparent-minor risk, violence, drugs, text, logos, fraud, and policy compliance; to secure transmission to contracted moderation providers; and to administrative review. Decisions can be wrong. This moderation is content screening, not identity or age verification. The submitter may use the appeal process but may not demand publication.</w:t>
       </w:r>
     </w:p>
     <w:p>
@@ -5381,12 +5373,12 @@
         <w:pStyle w:val="Heading2"/>
       </w:pPr>
       <w:r>
-        <w:t>9. Adult-only, consent, and content-boundary controls</w:t>
-      </w:r>
-    </w:p>
-    <w:p>
-      <w:r>
-        <w:t>At counsel’s direction, this license does not impose proposed 18 U.S.C. §§ 2257/2257A producer-recordkeeping, labeling, custodian, or inspection duties. Independently of that conclusion, every depicted person must be an adult and must have consented; the uploader must own or control the necessary rights; actual sexually explicit conduct is outside the accepted content categories; and MyDancr may require age/identity, consent, ownership, moderation, or provenance evidence reasonably necessary to enforce those narrower rules. Counsel should re-review the allocation only if MyDancr materially changes its accepted content or production role.</w:t>
+        <w:t>9. No-nudity, consenting-adult, and content-boundary controls</w:t>
+      </w:r>
+    </w:p>
+    <w:p>
+      <w:r>
+        <w:t>At counsel’s direction, this license does not impose proposed 18 U.S.C. §§ 2257/2257A producer-recordkeeping, labeling, custodian, or inspection duties and does not require a separate vendor age-verification process. Nudity and actual sexually explicit conduct are outside the accepted content categories; every depicted person must be an adult and must have consented; and the uploader must own or control the necessary rights. MyDancr may require consent, ownership, moderation, or provenance evidence reasonably necessary to enforce those narrower rules. Counsel should re-review the allocation if MyDancr materially changes its accepted content, production role, or applicable jurisdiction.</w:t>
       </w:r>
     </w:p>
     <w:p>
@@ -5425,7 +5417,7 @@
     </w:p>
     <w:p>
       <w:r>
-        <w:t>Users may not access or use the Service if under 18; depict, identify, target, groom, solicit, exploit, or endanger a minor; misstate age; evade age or identity controls; upload child sexual abuse material; or fail to report a suspected minor or exploitation concern through available safety channels.</w:t>
+        <w:t>Users may not access or use the Service if under 18; depict, identify, target, groom, solicit, exploit, or endanger a minor; misstate eligibility; upload child sexual abuse material; or fail to report a suspected minor or exploitation concern through available safety channels. MyDancr does not use a routine vendor age-verification gate in the current no-nudity model, but it may restrict a suspicious account or content while investigating.</w:t>
       </w:r>
     </w:p>
     <w:p>
@@ -5477,7 +5469,7 @@
     </w:p>
     <w:p>
       <w:r>
-        <w:t>Users may not submit infringing, unlawful, exploitative, deceptive, hateful, threatening, graphically violent, self-harm-promoting, drug-selling, weapon-selling, malware, spam, or fraudulent content. Content must not include actual sexual conduct or other categories barred by the current media standard.</w:t>
+        <w:t>Users may not submit infringing, unlawful, exploitative, deceptive, hateful, threatening, graphically violent, self-harm-promoting, drug-selling, weapon-selling, malware, spam, or fraudulent content. Content must not include nudity, actual sexual conduct, or other categories barred by the current media standard.</w:t>
       </w:r>
     </w:p>
     <w:p>
@@ -5555,7 +5547,7 @@
         <w:pStyle w:val="Heading1"/>
       </w:pPr>
       <w:r>
-        <w:t>Part VIII — Draft Age, Identity, and Venue-Verification Policy</w:t>
+        <w:t>Part VIII — Draft Account Eligibility and Venue-Verification Policy</w:t>
       </w:r>
     </w:p>
     <w:p>
@@ -5563,12 +5555,12 @@
         <w:pStyle w:val="Heading2"/>
       </w:pPr>
       <w:r>
-        <w:t>1. Adult eligibility</w:t>
-      </w:r>
-    </w:p>
-    <w:p>
-      <w:r>
-        <w:t>All Users must be at least 18. A club may require 21 or another lawful higher age for entry. Dancers must also meet the legal age and licensing requirements for work at the specific club and jurisdiction. The Service must not imply that account eligibility equals club eligibility.</w:t>
+        <w:t>1. Contractual eligibility</w:t>
+      </w:r>
+    </w:p>
+    <w:p>
+      <w:r>
+        <w:t>Users must make the eligibility representations stated in the Terms. A club may require 21 or another lawful age for entry, and dancers must independently satisfy the legal age, work-card, licensing, and venue requirements applicable to their work. MyDancr does not use a routine age-verification vendor in the current no-nudity model. The Service must not imply that account access or a public profile equals eligibility for club entry or work.</w:t>
       </w:r>
     </w:p>
     <w:p>
@@ -5576,12 +5568,12 @@
         <w:pStyle w:val="Heading2"/>
       </w:pPr>
       <w:r>
-        <w:t>2. Risk-based verification</w:t>
-      </w:r>
-    </w:p>
-    <w:p>
-      <w:r>
-        <w:t>Verification should be proportionate to role and action. Email confirmation is appropriate for basic account access but is not enough for a public dancer, club owner, authorized manager, or commission recipient. Public dancers must complete the hosted Yoti 18+ gate plus any MyDancr identity/eligibility and initial club-affiliation controls required by the approved workflow. High-risk club roles require documented identity and/or authority review. Too Much Media/NATS separately controls its affiliate-account, KYC, tax, sanctions, and payment-account requirements.</w:t>
+        <w:t>2. Role-based controls</w:t>
+      </w:r>
+    </w:p>
+    <w:p>
+      <w:r>
+        <w:t>Controls should be proportionate to role and action. Email confirmation and accepted eligibility representations support ordinary account access. A public dancer must also complete the required profile/media workflow and initial club-affiliation confirmation. Club owners and authorized managers must establish authority for the club role. Too Much Media/NATS separately controls its affiliate-account, KYC, tax, sanctions, and payment-account requirements for commission settlement.</w:t>
       </w:r>
     </w:p>
     <w:p>
@@ -5589,17 +5581,17 @@
         <w:pStyle w:val="Heading2"/>
       </w:pPr>
       <w:r>
-        <w:t>3. Dancer identity</w:t>
-      </w:r>
-    </w:p>
-    <w:p>
-      <w:r>
-        <w:t>Before public approval, the dancer must complete MyDancr’s approved identity and age review using the minimum evidence necessary; provide an avatar that can be compared to the person where appropriate; and meet media and venue gates. Public display uses stage name unless disclosure is legally required.</w:t>
-      </w:r>
-    </w:p>
-    <w:p>
-      <w:r>
-        <w:t>Verification evidence and decisions must be encrypted, access-restricted, and not exposed to clubs beyond the minimum confirmation interface. MyDancr should record the evidence category, result, dates, reviewer, and decision—not unnecessary document or selfie copies—unless counsel requires retention. Retention and deletion settings must match the approved schedule. Any biometric notice, consent, and alternative method required by applicable U.S. state law must be presented before collection if biometric processing is later introduced.</w:t>
+        <w:t>3. Dancer account and stage identity</w:t>
+      </w:r>
+    </w:p>
+    <w:p>
+      <w:r>
+        <w:t>Before public approval, the dancer must provide truthful account and stage information, accept the eligibility representations, provide the required avatar and profile media, and complete the venue gate. Public display uses the stage name. MyDancr does not routinely collect government identification, date of birth, age evidence, selfies, or biometric media.</w:t>
+      </w:r>
+    </w:p>
+    <w:p>
+      <w:r>
+        <w:t>If suspected fraud, impersonation, account recovery, club authority, or a specific legal requirement later justifies limited evidence, it must be encrypted, access-restricted, and not exposed beyond the minimum necessary decision interface. MyDancr should record only the evidence category, result, dates, reviewer, and decision unless counsel requires more. Introducing biometric processing or a separate age/identity vendor is outside the current model and requires a separately approved product, privacy, consent, retention, security, and accessibility review before collection.</w:t>
       </w:r>
     </w:p>
     <w:p>
@@ -5625,7 +5617,7 @@
     </w:p>
     <w:p>
       <w:r>
-        <w:t>A first-time dancer’s profile remains private until an authorized club confirms a legitimate affiliation using the secure verification flow. The club should compare the stage name and avatar and attest to authority and accuracy. MyDancr then applies the remaining eligibility rules. Venue confirmation alone does not approve rejected media or an incomplete identity.</w:t>
+        <w:t>A first-time dancer’s profile remains private until an authorized club confirms a legitimate affiliation using the secure verification flow. The club should compare the stage name and avatar and attest to authority and affiliation accuracy. MyDancr then applies the remaining account, media, visibility, and safety rules. Venue confirmation is not a general identity or age certification and does not approve rejected media or an incomplete profile.</w:t>
       </w:r>
     </w:p>
     <w:p>
@@ -5672,12 +5664,12 @@
         <w:pStyle w:val="Heading2"/>
       </w:pPr>
       <w:r>
-        <w:t>9. Reverification and failure</w:t>
-      </w:r>
-    </w:p>
-    <w:p>
-      <w:r>
-        <w:t>MyDancr may reverify after material account changes, suspicious activity, expired documents, affiliation disputes, NATS or ACH failures, sanctions alerts, security incidents, or legal requirements. Failure or refusal may restrict the relevant feature. A User may appeal a mistaken result but cannot require MyDancr to accept unverifiable evidence.</w:t>
+        <w:t>9. Review, restriction, and failure</w:t>
+      </w:r>
+    </w:p>
+    <w:p>
+      <w:r>
+        <w:t>MyDancr may review or restrict the relevant feature after material account changes, suspicious activity, affiliation disputes, NATS or ACH failures, sanctions alerts, security incidents, or a specific legal requirement. Failure to establish club authority, a legitimate affiliation, account control, or finance-provider eligibility may restrict only the affected role or feature where practical. A User may appeal a mistaken result but cannot require MyDancr to accept unreliable evidence.</w:t>
       </w:r>
     </w:p>
     <w:p>
@@ -5690,7 +5682,7 @@
     </w:p>
     <w:p>
       <w:r>
-        <w:t>Verification should collect the minimum evidence necessary, separate public stage identity from legal identity, limit retention, log access, prohibit ordinary email transmission of documents, and avoid exposing government identifiers to clubs, dancers, or customers.</w:t>
+        <w:t>MyDancr should collect the minimum account, authority, affiliation, and finance-linkage data necessary; separate public stage identity from any legal or provider identity; limit retention; log privileged access; prohibit ordinary email transmission of sensitive documents; and avoid exposing government identifiers to clubs, dancers, or customers. A separate age-verification provider is not part of this model.</w:t>
       </w:r>
     </w:p>
     <w:p>
@@ -6452,10 +6444,10 @@
         <w:rPr>
           <w:b/>
         </w:rPr>
-        <w:t>Identity and age evidence:</w:t>
-      </w:r>
-      <w:r>
-        <w:t xml:space="preserve"> retain only the evidence category, result, decision, reviewer, and dates for the shortest approved period; retain document, selfie, or biometric material only when specifically justified by law and approved policy.</w:t>
+        <w:t>Eligibility, authority, and affiliation records:</w:t>
+      </w:r>
+      <w:r>
+        <w:t xml:space="preserve"> retain accepted eligibility representations, club-authority decisions, dancer-affiliation events, and any narrowly justified fraud/account-recovery evidence for the shortest approved operational, dispute, or legal period. The current model does not routinely collect age documents, date of birth, selfies, or biometric material.</w:t>
       </w:r>
     </w:p>
     <w:p>
@@ -6649,7 +6641,7 @@
               <w:t xml:space="preserve">EXACT PERIODS REQUIRED  </w:t>
             </w:r>
             <w:r>
-              <w:t>Convert every “short,” “limited,” “rolling,” and “statutory” period above into an approved number of days/years and confirm backup architecture, tax law, limitation periods, DMCA, consent/verification evidence, fraud models, and state privacy requirements.</w:t>
+              <w:t>Convert every “short,” “limited,” “rolling,” and “statutory” period above into an approved number of days/years and confirm backup architecture, tax law, limitation periods, DMCA, consent/eligibility evidence, fraud models, and state privacy requirements.</w:t>
             </w:r>
           </w:p>
         </w:tc>
@@ -6785,7 +6777,7 @@
         <w:pStyle w:val="ListNumber"/>
       </w:pPr>
       <w:r>
-        <w:t>Complete Yoti production contracting and configuration; document MyDancr’s 18+ eligibility, notice, minimal-result storage, fallback/manual review, appeal, retention/deletion, security, and incident procedures.</w:t>
+        <w:t>Remove retired or unapproved providers from disclosures, configuration, acceptance copy, data maps, and live product dependencies; document that no routine vendor age-verification flow exists in the current no-nudity model.</w:t>
       </w:r>
     </w:p>
     <w:p>
@@ -6833,7 +6825,7 @@
         <w:pStyle w:val="ListNumber"/>
       </w:pPr>
       <w:r>
-        <w:t>Separate customer Terms acceptance from Dancer, Club, Media, Club Deal, Verification, NATS Commission Settlement, Deal Order, and ACH acceptances/notices.</w:t>
+        <w:t>Separate customer Terms acceptance from Dancer, Club, Media, Club Deal, Account/Club Verification, NATS Commission Settlement, Deal Order, and ACH acceptances/notices.</w:t>
       </w:r>
     </w:p>
     <w:p>
@@ -6841,7 +6833,7 @@
         <w:pStyle w:val="ListNumber"/>
       </w:pPr>
       <w:r>
-        <w:t>Train verification reviewers; restrict verification-record access; test deletion and reverification.</w:t>
+        <w:t>Train club-authority, affiliation, moderation, fraud, and support reviewers; restrict sensitive-record access; test deletion and review outcomes.</w:t>
       </w:r>
     </w:p>
     <w:p>
@@ -6849,7 +6841,7 @@
         <w:pStyle w:val="ListNumber"/>
       </w:pPr>
       <w:r>
-        <w:t>Apply counsel’s direction not to impose proposed §2257/§2257A duties; confirm adult-only, consent, ownership, accepted-content boundaries, releases where required, music rights, and emergency reporting.</w:t>
+        <w:t>Apply counsel’s direction not to impose proposed §2257/§2257A duties or a separate age-verification vendor under the current no-nudity model; confirm consenting-adult representations, ownership, accepted-content boundaries, releases where required, music rights, and emergency reporting.</w:t>
       </w:r>
     </w:p>
     <w:p>
@@ -6987,7 +6979,7 @@
         <w:t>Dancer:</w:t>
       </w:r>
       <w:r>
-        <w:t xml:space="preserve"> Terms + Privacy + Dancer Agreement + Content/Media License + Acceptable Use + Yoti/MyDancr Verification notice/consent where required + Too Much Media/NATS Commission Settlement terms; renewed acceptance for material commission changes.</w:t>
+        <w:t xml:space="preserve"> Terms + Privacy + Dancer Agreement + Content/Media License + Acceptable Use + Account Eligibility/Club Verification terms + Too Much Media/NATS Commission Settlement terms; renewed acceptance for material commission changes. No separate age-verification-provider acceptance is part of the current model.</w:t>
       </w:r>
     </w:p>
     <w:p>
@@ -7067,7 +7059,7 @@
         <w:pStyle w:val="ListBullet"/>
       </w:pPr>
       <w:r>
-        <w:t>Complete dancer identity/age onboarding with successful, failed, abandoned, manual-review, expired, mismatched, deleted, and reverification outcomes; then test approved, pending, rejected, deleted, and appealed media.</w:t>
+        <w:t>Complete dancer account-eligibility, truthful-account, profile/media, and initial club-affiliation flows; test incomplete, duplicate, suspicious, wrong-club, revoked, rejected, deleted, and appealed outcomes without invoking a separate age-verification provider, routine ID-document collection, or biometric processing.</w:t>
       </w:r>
     </w:p>
     <w:p>
@@ -7363,38 +7355,12 @@
         <w:rPr>
           <w:b/>
         </w:rPr>
-        <w:t>Yoti — privacy information:</w:t>
+        <w:t>Nacha — ACH Rules resources:</w:t>
       </w:r>
       <w:r>
         <w:t xml:space="preserve"> [</w:t>
       </w:r>
       <w:hyperlink r:id="rId22">
-        <w:r>
-          <w:rPr>
-            <w:color w:val="0891B2"/>
-            <w:u w:val="single"/>
-          </w:rPr>
-          <w:t>https://www.yoti.com/privacy/](https://www.yoti.com/privacy/</w:t>
-        </w:r>
-      </w:hyperlink>
-      <w:r>
-        <w:t>)</w:t>
-      </w:r>
-    </w:p>
-    <w:p>
-      <w:pPr>
-        <w:pStyle w:val="ListBullet"/>
-      </w:pPr>
-      <w:r>
-        <w:rPr>
-          <w:b/>
-        </w:rPr>
-        <w:t>Nacha — ACH Rules resources:</w:t>
-      </w:r>
-      <w:r>
-        <w:t xml:space="preserve"> [</w:t>
-      </w:r>
-      <w:hyperlink r:id="rId23">
         <w:r>
           <w:rPr>
             <w:color w:val="0891B2"/>
@@ -7420,7 +7386,7 @@
       <w:r>
         <w:t xml:space="preserve"> [</w:t>
       </w:r>
-      <w:hyperlink r:id="rId24">
+      <w:hyperlink r:id="rId23">
         <w:r>
           <w:rPr>
             <w:color w:val="0891B2"/>
@@ -7446,7 +7412,7 @@
       <w:r>
         <w:t xml:space="preserve"> [</w:t>
       </w:r>
-      <w:hyperlink r:id="rId25">
+      <w:hyperlink r:id="rId24">
         <w:r>
           <w:rPr>
             <w:color w:val="0891B2"/>
@@ -7472,7 +7438,7 @@
       <w:r>
         <w:t xml:space="preserve"> [</w:t>
       </w:r>
-      <w:hyperlink r:id="rId26">
+      <w:hyperlink r:id="rId25">
         <w:r>
           <w:rPr>
             <w:color w:val="0891B2"/>

</xml_diff>

<commit_message>
docs: clarify dancer electronic acceptance
</commit_message>
<xml_diff>
--- a/docs/legal/MyDancr-Legal-Review-Packet.docx
+++ b/docs/legal/MyDancr-Legal-Review-Packet.docx
@@ -4777,6 +4777,11 @@
     </w:p>
     <w:p>
       <w:r>
+        <w:t>The dancer accepts this agreement and the linked dancer policies electronically during onboarding through an affirmative clickwrap action, such as selecting an initially unchecked agreement control and pressing “Agree and continue.” No paper contract or wet signature is contemplated. Before acceptance, MyDancr should make each incorporated document available to open and download. MyDancr should preserve the dancer account, document name and version, acceptance timestamp, and appropriate technical evidence such as IP address and user agent, and should require renewed electronic acceptance when a material change legally requires it.</w:t>
+      </w:r>
+    </w:p>
+    <w:p>
+      <w:r>
         <w:t>The dancer is responsible for the dancer’s own relationship with each club, including classification, pay, tips, fees, scheduling, taxes, licensing, work cards, safety, and conduct. MyDancr does not direct the dancer’s performance work, set service prices, collect payment for dancer services, or guarantee customers, shifts, income, or admission.</w:t>
       </w:r>
     </w:p>
@@ -6979,7 +6984,7 @@
         <w:t>Dancer:</w:t>
       </w:r>
       <w:r>
-        <w:t xml:space="preserve"> Terms + Privacy + Dancer Agreement + Content/Media License + Acceptable Use + Account Eligibility/Club Verification terms + Too Much Media/NATS Commission Settlement terms; renewed acceptance for material commission changes. No separate age-verification-provider acceptance is part of the current model.</w:t>
+        <w:t xml:space="preserve"> affirmative electronic clickwrap acceptance of the Terms + Privacy + Dancer Agreement + Content/Media License + Acceptable Use + Account Eligibility/Club Verification terms + Too Much Media/NATS Commission Settlement terms; no paper or wet-signature contract; renewed clickwrap acceptance for material commission changes. No separate age-verification-provider acceptance is part of the current model.</w:t>
       </w:r>
     </w:p>
     <w:p>

</xml_diff>